<commit_message>
Text update: Batch 4 numbers, sentiment-vs-uncertainty section (5.7) and Appendix J.4, JLN/Franzoni-Schmalz bib
</commit_message>
<xml_diff>
--- a/dissertation_master_log.docx
+++ b/dissertation_master_log.docx
@@ -11366,6 +11366,1330 @@
         <w:rPr>
           <w:rFonts w:ascii="Calibri" w:cs="Calibri" w:eastAsia="Calibri" w:hAnsi="Calibri"/>
         </w:rPr>
+        <w:t xml:space="preserve">Session: 8–14 October 2026 — Batch 4 fixes, second audit, full rerun, JLN uncertainty horse race, text update</w:t>
+      </w:r>
+    </w:p>
+    <w:p>
+      <w:pPr>
+        <w:spacing w:after="100"/>
+      </w:pPr>
+      <w:r>
+        <w:rPr>
+          <w:rFonts w:ascii="Calibri" w:cs="Calibri" w:eastAsia="Calibri" w:hAnsi="Calibri"/>
+          <w:sz w:val="20"/>
+          <w:szCs w:val="20"/>
+        </w:rPr>
+        <w:t xml:space="preserve">Objective: apply the Batch 4 code fixes, run a second line-by-line audit, re-run the full pipeline, add the Jurado–Ludvigson–Ng (2015) macroeconomic uncertainty index at a jury member’s request, and bring dissertation_main.tex, the bibliography and this log in line with the new outputs.</w:t>
+      </w:r>
+    </w:p>
+    <w:p>
+      <w:pPr>
+        <w:pStyle w:val="Heading2"/>
+      </w:pPr>
+      <w:r>
+        <w:rPr>
+          <w:rFonts w:ascii="Calibri" w:cs="Calibri" w:eastAsia="Calibri" w:hAnsi="Calibri"/>
+        </w:rPr>
+        <w:t xml:space="preserve">§1. Batch 4 and audit fixes (code)</w:t>
+      </w:r>
+    </w:p>
+    <w:p>
+      <w:pPr>
+        <w:pStyle w:val="ListParagraph"/>
+        <w:numPr>
+          <w:ilvl w:val="0"/>
+          <w:numId w:val="2"/>
+        </w:numPr>
+        <w:spacing w:after="60"/>
+      </w:pPr>
+      <w:r>
+        <w:rPr>
+          <w:rFonts w:ascii="Calibri" w:cs="Calibri" w:eastAsia="Calibri" w:hAnsi="Calibri"/>
+          <w:sz w:val="20"/>
+          <w:szCs w:val="20"/>
+        </w:rPr>
+        <w:t xml:space="preserve">data_import_and_cleaning.R v1.6: explicit leveraged/inverse ticker list (DXRLX, DXSLX, DXNLX, RYMKX, DXNSX, RYURX, PSPSX, PDOSX, 2543480D, PNETX — truncated Bloomberg names had let them through); returns computed on full histories and joined into the panels, so the first post-incubation month keeps its return; Evans cutoff compared by calendar month (201 funds had lost a 37th month).</w:t>
+      </w:r>
+    </w:p>
+    <w:p>
+      <w:pPr>
+        <w:pStyle w:val="ListParagraph"/>
+        <w:numPr>
+          <w:ilvl w:val="0"/>
+          <w:numId w:val="2"/>
+        </w:numPr>
+        <w:spacing w:after="60"/>
+      </w:pPr>
+      <w:r>
+        <w:rPr>
+          <w:rFonts w:ascii="Calibri" w:cs="Calibri" w:eastAsia="Calibri" w:hAnsi="Calibri"/>
+          <w:sz w:val="20"/>
+          <w:szCs w:val="20"/>
+        </w:rPr>
+        <w:t xml:space="preserve">flow_calculation.R v1.3: flows computed on the master panel and joined; per-panel winsorisation; tna_source NA when TNA is missing.</w:t>
+      </w:r>
+    </w:p>
+    <w:p>
+      <w:pPr>
+        <w:pStyle w:val="ListParagraph"/>
+        <w:numPr>
+          <w:ilvl w:val="0"/>
+          <w:numId w:val="2"/>
+        </w:numPr>
+        <w:spacing w:after="60"/>
+      </w:pPr>
+      <w:r>
+        <w:rPr>
+          <w:rFonts w:ascii="Calibri" w:cs="Calibri" w:eastAsia="Calibri" w:hAnsi="Calibri"/>
+          <w:sz w:val="20"/>
+          <w:szCs w:val="20"/>
+        </w:rPr>
+        <w:t xml:space="preserve">panel_regressions_setup.R v1.6: age from inception date, else first observed month (17 active funds were dropped); calendar-month lags for style flow, ActR2 and sentiment; leave-one-out style flow; JLN columns carried.</w:t>
+      </w:r>
+    </w:p>
+    <w:p>
+      <w:pPr>
+        <w:pStyle w:val="ListParagraph"/>
+        <w:numPr>
+          <w:ilvl w:val="0"/>
+          <w:numId w:val="2"/>
+        </w:numPr>
+        <w:spacing w:after="60"/>
+      </w:pPr>
+      <w:r>
+        <w:rPr>
+          <w:rFonts w:ascii="Calibri" w:cs="Calibri" w:eastAsia="Calibri" w:hAnsi="Calibri"/>
+          <w:sz w:val="20"/>
+          <w:szCs w:val="20"/>
+        </w:rPr>
+        <w:t xml:space="preserve">persistence_testing.R v1.4 (rank only funds alive in the ranking month; n_funds = mean alive); activeness_persistence.R v1.3 (bootstrap p_B, B = 10,000); psychological_premium.R v1.4 (calibration read from portfolio_alphas.xlsx, momentum EW Q5−Q1 with t); structural_break_test.R v1.4 (one full-sample HAC variance — the segment-wise HAC CIs were degenerate and too narrow); panel_regressions_reporting.R v1.2 (“Joint test” / “Headline direction” columns); descriptive_statistics.R (VW mean = time-series average of monthly VW means; “Nonpar. Skew”); activeness_proxy_diagnostic.R v1.2; footnote/label fixes in H2, H4, FF_comparison, alpha_reporting, subperiod_analysis, build_robust_tables, build_ff_tables_manual, portfolio_sorts, activeness_analysis, aggregate_alphas.</w:t>
+      </w:r>
+    </w:p>
+    <w:p>
+      <w:pPr>
+        <w:pStyle w:val="ListParagraph"/>
+        <w:numPr>
+          <w:ilvl w:val="0"/>
+          <w:numId w:val="2"/>
+        </w:numPr>
+        <w:spacing w:after="60"/>
+      </w:pPr>
+      <w:r>
+        <w:rPr>
+          <w:rFonts w:ascii="Calibri" w:cs="Calibri" w:eastAsia="Calibri" w:hAnsi="Calibri"/>
+          <w:sz w:val="20"/>
+          <w:szCs w:val="20"/>
+        </w:rPr>
+        <w:t xml:space="preserve">master_pipeline.R v1.7: Phase A forces B; guard against FORCE_PANEL_SETUP without Phase A; RDS-reuse branch clears the session panel; runs uncertainty_robustness.R; integrity map 27 scripts.</w:t>
+      </w:r>
+    </w:p>
+    <w:p>
+      <w:pPr>
+        <w:pStyle w:val="ListParagraph"/>
+        <w:numPr>
+          <w:ilvl w:val="0"/>
+          <w:numId w:val="2"/>
+        </w:numPr>
+        <w:spacing w:after="60"/>
+      </w:pPr>
+      <w:r>
+        <w:rPr>
+          <w:rFonts w:ascii="Calibri" w:cs="Calibri" w:eastAsia="Calibri" w:hAnsi="Calibri"/>
+          <w:sz w:val="20"/>
+          <w:szCs w:val="20"/>
+        </w:rPr>
+        <w:t xml:space="preserve">New diagnostics (R scripts/diagnostics/): return_treatment_robustness.R and passive_tracking_difference.R — Appendix K Tables K.1–K.2 are now reproducible on OMER-PC.</w:t>
+      </w:r>
+    </w:p>
+    <w:p>
+      <w:pPr>
+        <w:pStyle w:val="Heading2"/>
+      </w:pPr>
+      <w:r>
+        <w:rPr>
+          <w:rFonts w:ascii="Calibri" w:cs="Calibri" w:eastAsia="Calibri" w:hAnsi="Calibri"/>
+        </w:rPr>
+        <w:t xml:space="preserve">§2. JLN macroeconomic uncertainty (jury request)</w:t>
+      </w:r>
+    </w:p>
+    <w:p>
+      <w:pPr>
+        <w:pStyle w:val="ListParagraph"/>
+        <w:numPr>
+          <w:ilvl w:val="0"/>
+          <w:numId w:val="2"/>
+        </w:numPr>
+        <w:spacing w:after="60"/>
+      </w:pPr>
+      <w:r>
+        <w:rPr>
+          <w:rFonts w:ascii="Calibri" w:cs="Calibri" w:eastAsia="Calibri" w:hAnsi="Calibri"/>
+          <w:sz w:val="20"/>
+          <w:szCs w:val="20"/>
+        </w:rPr>
+        <w:t xml:space="preserve">Rationale: in Berk–Green learning, flows respond less to returns when returns are less informative; a flatter flow–performance relation in high Baker–Wurgler months could be a rational response to uncertainty rather than sentiment. Not subsumed ex ante: R² of JLN on existing states 0.37; corr(SENT⊥, JLN 1M) 0.25.</w:t>
+      </w:r>
+    </w:p>
+    <w:p>
+      <w:pPr>
+        <w:pStyle w:val="ListParagraph"/>
+        <w:numPr>
+          <w:ilvl w:val="0"/>
+          <w:numId w:val="2"/>
+        </w:numPr>
+        <w:spacing w:after="60"/>
+      </w:pPr>
+      <w:r>
+        <w:rPr>
+          <w:rFonts w:ascii="Calibri" w:cs="Calibri" w:eastAsia="Calibri" w:hAnsi="Calibri"/>
+          <w:sz w:val="20"/>
+          <w:szCs w:val="20"/>
+        </w:rPr>
+        <w:t xml:space="preserve">Data: FRED JLNUM1M / JLNUM3M / JLNUM12M added to fund_data.xlsx Sentiment sheet rows 15–17 (backup fund_data_pre_JLN_backup.xlsx; source files in data/R import/JLN_uncertainty). D_UNC = top tercile, as the other states; continuous index standardised.</w:t>
+      </w:r>
+    </w:p>
+    <w:p>
+      <w:pPr>
+        <w:pStyle w:val="ListParagraph"/>
+        <w:numPr>
+          <w:ilvl w:val="0"/>
+          <w:numId w:val="2"/>
+        </w:numPr>
+        <w:spacing w:after="60"/>
+      </w:pPr>
+      <w:r>
+        <w:rPr>
+          <w:rFonts w:ascii="Calibri" w:cs="Calibri" w:eastAsia="Calibri" w:hAnsi="Calibri"/>
+          <w:sz w:val="20"/>
+          <w:szCs w:val="20"/>
+        </w:rPr>
+        <w:t xml:space="preserve">Pre-committed before estimation: horizon h = 1; presentation = main-text summary table + appendix full tables.</w:t>
+      </w:r>
+    </w:p>
+    <w:p>
+      <w:pPr>
+        <w:pStyle w:val="ListParagraph"/>
+        <w:numPr>
+          <w:ilvl w:val="0"/>
+          <w:numId w:val="2"/>
+        </w:numPr>
+        <w:spacing w:after="60"/>
+      </w:pPr>
+      <w:r>
+        <w:rPr>
+          <w:rFonts w:ascii="Calibri" w:cs="Calibri" w:eastAsia="Calibri" w:hAnsi="Calibri"/>
+          <w:sz w:val="20"/>
+          <w:szCs w:val="20"/>
+        </w:rPr>
+        <w:t xml:space="preserve">uncertainty_robustness.R v1.1: common sample 307,617 fund-months (1,895 funds, 307 months, Jan 1998–Nov 2025); models S only / U only / S and U for h = 1, 3, 12; tables table_unc_summary, _horizons, _H1, _AAII (added 14 Oct), _H2.</w:t>
+      </w:r>
+    </w:p>
+    <w:tbl>
+      <w:tblPr>
+        <w:tblW w:type="dxa" w:w="9026"/>
+        <w:tblBorders>
+          <w:top w:val="single" w:color="auto" w:sz="4"/>
+          <w:left w:val="single" w:color="auto" w:sz="4"/>
+          <w:bottom w:val="single" w:color="auto" w:sz="4"/>
+          <w:right w:val="single" w:color="auto" w:sz="4"/>
+          <w:insideH w:val="single" w:color="auto" w:sz="4"/>
+          <w:insideV w:val="single" w:color="auto" w:sz="4"/>
+        </w:tblBorders>
+      </w:tblPr>
+      <w:tblGrid>
+        <w:gridCol w:w="2000"/>
+        <w:gridCol w:w="2000"/>
+        <w:gridCol w:w="2000"/>
+        <w:gridCol w:w="3026"/>
+      </w:tblGrid>
+      <w:tr>
+        <w:trPr>
+          <w:tblHeader/>
+        </w:trPr>
+        <w:tc>
+          <w:tcPr>
+            <w:tcW w:type="dxa" w:w="2000"/>
+            <w:tcBorders>
+              <w:top w:val="single" w:color="A0A0A0" w:sz="4"/>
+              <w:left w:val="single" w:color="A0A0A0" w:sz="4"/>
+              <w:bottom w:val="single" w:color="A0A0A0" w:sz="4"/>
+              <w:right w:val="single" w:color="A0A0A0" w:sz="4"/>
+            </w:tcBorders>
+            <w:shd w:fill="E7ECF2" w:color="auto" w:val="clear"/>
+            <w:tcMar>
+              <w:top w:type="dxa" w:w="60"/>
+              <w:left w:type="dxa" w:w="100"/>
+              <w:bottom w:type="dxa" w:w="60"/>
+              <w:right w:type="dxa" w:w="100"/>
+            </w:tcMar>
+          </w:tcPr>
+          <w:p>
+            <w:r>
+              <w:rPr>
+                <w:rFonts w:ascii="Calibri" w:cs="Calibri" w:eastAsia="Calibri" w:hAnsi="Calibri"/>
+                <w:b/>
+                <w:bCs/>
+                <w:sz w:val="18"/>
+                <w:szCs w:val="18"/>
+              </w:rPr>
+              <w:t xml:space="preserve">State</w:t>
+            </w:r>
+          </w:p>
+        </w:tc>
+        <w:tc>
+          <w:tcPr>
+            <w:tcW w:type="dxa" w:w="2000"/>
+            <w:tcBorders>
+              <w:top w:val="single" w:color="A0A0A0" w:sz="4"/>
+              <w:left w:val="single" w:color="A0A0A0" w:sz="4"/>
+              <w:bottom w:val="single" w:color="A0A0A0" w:sz="4"/>
+              <w:right w:val="single" w:color="A0A0A0" w:sz="4"/>
+            </w:tcBorders>
+            <w:shd w:fill="E7ECF2" w:color="auto" w:val="clear"/>
+            <w:tcMar>
+              <w:top w:type="dxa" w:w="60"/>
+              <w:left w:type="dxa" w:w="100"/>
+              <w:bottom w:type="dxa" w:w="60"/>
+              <w:right w:type="dxa" w:w="100"/>
+            </w:tcMar>
+          </w:tcPr>
+          <w:p>
+            <w:r>
+              <w:rPr>
+                <w:rFonts w:ascii="Calibri" w:cs="Calibri" w:eastAsia="Calibri" w:hAnsi="Calibri"/>
+                <w:b/>
+                <w:bCs/>
+                <w:sz w:val="18"/>
+                <w:szCs w:val="18"/>
+              </w:rPr>
+              <w:t xml:space="preserve">Joint p without U</w:t>
+            </w:r>
+          </w:p>
+        </w:tc>
+        <w:tc>
+          <w:tcPr>
+            <w:tcW w:type="dxa" w:w="2000"/>
+            <w:tcBorders>
+              <w:top w:val="single" w:color="A0A0A0" w:sz="4"/>
+              <w:left w:val="single" w:color="A0A0A0" w:sz="4"/>
+              <w:bottom w:val="single" w:color="A0A0A0" w:sz="4"/>
+              <w:right w:val="single" w:color="A0A0A0" w:sz="4"/>
+            </w:tcBorders>
+            <w:shd w:fill="E7ECF2" w:color="auto" w:val="clear"/>
+            <w:tcMar>
+              <w:top w:type="dxa" w:w="60"/>
+              <w:left w:type="dxa" w:w="100"/>
+              <w:bottom w:type="dxa" w:w="60"/>
+              <w:right w:type="dxa" w:w="100"/>
+            </w:tcMar>
+          </w:tcPr>
+          <w:p>
+            <w:r>
+              <w:rPr>
+                <w:rFonts w:ascii="Calibri" w:cs="Calibri" w:eastAsia="Calibri" w:hAnsi="Calibri"/>
+                <w:b/>
+                <w:bCs/>
+                <w:sz w:val="18"/>
+                <w:szCs w:val="18"/>
+              </w:rPr>
+              <w:t xml:space="preserve">Joint p with U</w:t>
+            </w:r>
+          </w:p>
+        </w:tc>
+        <w:tc>
+          <w:tcPr>
+            <w:tcW w:type="dxa" w:w="3026"/>
+            <w:tcBorders>
+              <w:top w:val="single" w:color="A0A0A0" w:sz="4"/>
+              <w:left w:val="single" w:color="A0A0A0" w:sz="4"/>
+              <w:bottom w:val="single" w:color="A0A0A0" w:sz="4"/>
+              <w:right w:val="single" w:color="A0A0A0" w:sz="4"/>
+            </w:tcBorders>
+            <w:shd w:fill="E7ECF2" w:color="auto" w:val="clear"/>
+            <w:tcMar>
+              <w:top w:type="dxa" w:w="60"/>
+              <w:left w:type="dxa" w:w="100"/>
+              <w:bottom w:type="dxa" w:w="60"/>
+              <w:right w:type="dxa" w:w="100"/>
+            </w:tcMar>
+          </w:tcPr>
+          <w:p>
+            <w:r>
+              <w:rPr>
+                <w:rFonts w:ascii="Calibri" w:cs="Calibri" w:eastAsia="Calibri" w:hAnsi="Calibri"/>
+                <w:b/>
+                <w:bCs/>
+                <w:sz w:val="18"/>
+                <w:szCs w:val="18"/>
+              </w:rPr>
+              <w:t xml:space="preserve">Headline z without → with U</w:t>
+            </w:r>
+          </w:p>
+        </w:tc>
+      </w:tr>
+      <w:tr>
+        <w:trPr>
+          <w:tblHeader w:val="false"/>
+        </w:trPr>
+        <w:tc>
+          <w:tcPr>
+            <w:tcW w:type="dxa" w:w="2000"/>
+            <w:tcBorders>
+              <w:top w:val="single" w:color="A0A0A0" w:sz="4"/>
+              <w:left w:val="single" w:color="A0A0A0" w:sz="4"/>
+              <w:bottom w:val="single" w:color="A0A0A0" w:sz="4"/>
+              <w:right w:val="single" w:color="A0A0A0" w:sz="4"/>
+            </w:tcBorders>
+            <w:tcMar>
+              <w:top w:type="dxa" w:w="60"/>
+              <w:left w:type="dxa" w:w="100"/>
+              <w:bottom w:type="dxa" w:w="60"/>
+              <w:right w:type="dxa" w:w="100"/>
+            </w:tcMar>
+          </w:tcPr>
+          <w:p>
+            <w:r>
+              <w:rPr>
+                <w:rFonts w:ascii="Calibri" w:cs="Calibri" w:eastAsia="Calibri" w:hAnsi="Calibri"/>
+                <w:b w:val="false"/>
+                <w:bCs w:val="false"/>
+                <w:sz w:val="18"/>
+                <w:szCs w:val="18"/>
+              </w:rPr>
+              <w:t xml:space="preserve">H1 D_SENT</w:t>
+            </w:r>
+          </w:p>
+        </w:tc>
+        <w:tc>
+          <w:tcPr>
+            <w:tcW w:type="dxa" w:w="2000"/>
+            <w:tcBorders>
+              <w:top w:val="single" w:color="A0A0A0" w:sz="4"/>
+              <w:left w:val="single" w:color="A0A0A0" w:sz="4"/>
+              <w:bottom w:val="single" w:color="A0A0A0" w:sz="4"/>
+              <w:right w:val="single" w:color="A0A0A0" w:sz="4"/>
+            </w:tcBorders>
+            <w:tcMar>
+              <w:top w:type="dxa" w:w="60"/>
+              <w:left w:type="dxa" w:w="100"/>
+              <w:bottom w:type="dxa" w:w="60"/>
+              <w:right w:type="dxa" w:w="100"/>
+            </w:tcMar>
+          </w:tcPr>
+          <w:p>
+            <w:r>
+              <w:rPr>
+                <w:rFonts w:ascii="Calibri" w:cs="Calibri" w:eastAsia="Calibri" w:hAnsi="Calibri"/>
+                <w:b w:val="false"/>
+                <w:bCs w:val="false"/>
+                <w:sz w:val="18"/>
+                <w:szCs w:val="18"/>
+              </w:rPr>
+              <w:t xml:space="preserve">0.055</w:t>
+            </w:r>
+          </w:p>
+        </w:tc>
+        <w:tc>
+          <w:tcPr>
+            <w:tcW w:type="dxa" w:w="2000"/>
+            <w:tcBorders>
+              <w:top w:val="single" w:color="A0A0A0" w:sz="4"/>
+              <w:left w:val="single" w:color="A0A0A0" w:sz="4"/>
+              <w:bottom w:val="single" w:color="A0A0A0" w:sz="4"/>
+              <w:right w:val="single" w:color="A0A0A0" w:sz="4"/>
+            </w:tcBorders>
+            <w:tcMar>
+              <w:top w:type="dxa" w:w="60"/>
+              <w:left w:type="dxa" w:w="100"/>
+              <w:bottom w:type="dxa" w:w="60"/>
+              <w:right w:type="dxa" w:w="100"/>
+            </w:tcMar>
+          </w:tcPr>
+          <w:p>
+            <w:r>
+              <w:rPr>
+                <w:rFonts w:ascii="Calibri" w:cs="Calibri" w:eastAsia="Calibri" w:hAnsi="Calibri"/>
+                <w:b w:val="false"/>
+                <w:bCs w:val="false"/>
+                <w:sz w:val="18"/>
+                <w:szCs w:val="18"/>
+              </w:rPr>
+              <w:t xml:space="preserve">0.177</w:t>
+            </w:r>
+          </w:p>
+        </w:tc>
+        <w:tc>
+          <w:tcPr>
+            <w:tcW w:type="dxa" w:w="3026"/>
+            <w:tcBorders>
+              <w:top w:val="single" w:color="A0A0A0" w:sz="4"/>
+              <w:left w:val="single" w:color="A0A0A0" w:sz="4"/>
+              <w:bottom w:val="single" w:color="A0A0A0" w:sz="4"/>
+              <w:right w:val="single" w:color="A0A0A0" w:sz="4"/>
+            </w:tcBorders>
+            <w:tcMar>
+              <w:top w:type="dxa" w:w="60"/>
+              <w:left w:type="dxa" w:w="100"/>
+              <w:bottom w:type="dxa" w:w="60"/>
+              <w:right w:type="dxa" w:w="100"/>
+            </w:tcMar>
+          </w:tcPr>
+          <w:p>
+            <w:r>
+              <w:rPr>
+                <w:rFonts w:ascii="Calibri" w:cs="Calibri" w:eastAsia="Calibri" w:hAnsi="Calibri"/>
+                <w:b w:val="false"/>
+                <w:bCs w:val="false"/>
+                <w:sz w:val="18"/>
+                <w:szCs w:val="18"/>
+              </w:rPr>
+              <w:t xml:space="preserve">−0.85 → −1.29</w:t>
+            </w:r>
+          </w:p>
+        </w:tc>
+      </w:tr>
+      <w:tr>
+        <w:trPr>
+          <w:tblHeader w:val="false"/>
+        </w:trPr>
+        <w:tc>
+          <w:tcPr>
+            <w:tcW w:type="dxa" w:w="2000"/>
+            <w:tcBorders>
+              <w:top w:val="single" w:color="A0A0A0" w:sz="4"/>
+              <w:left w:val="single" w:color="A0A0A0" w:sz="4"/>
+              <w:bottom w:val="single" w:color="A0A0A0" w:sz="4"/>
+              <w:right w:val="single" w:color="A0A0A0" w:sz="4"/>
+            </w:tcBorders>
+            <w:tcMar>
+              <w:top w:type="dxa" w:w="60"/>
+              <w:left w:type="dxa" w:w="100"/>
+              <w:bottom w:type="dxa" w:w="60"/>
+              <w:right w:type="dxa" w:w="100"/>
+            </w:tcMar>
+          </w:tcPr>
+          <w:p>
+            <w:r>
+              <w:rPr>
+                <w:rFonts w:ascii="Calibri" w:cs="Calibri" w:eastAsia="Calibri" w:hAnsi="Calibri"/>
+                <w:b w:val="false"/>
+                <w:bCs w:val="false"/>
+                <w:sz w:val="18"/>
+                <w:szCs w:val="18"/>
+              </w:rPr>
+              <w:t xml:space="preserve">H1 SENT⊥</w:t>
+            </w:r>
+          </w:p>
+        </w:tc>
+        <w:tc>
+          <w:tcPr>
+            <w:tcW w:type="dxa" w:w="2000"/>
+            <w:tcBorders>
+              <w:top w:val="single" w:color="A0A0A0" w:sz="4"/>
+              <w:left w:val="single" w:color="A0A0A0" w:sz="4"/>
+              <w:bottom w:val="single" w:color="A0A0A0" w:sz="4"/>
+              <w:right w:val="single" w:color="A0A0A0" w:sz="4"/>
+            </w:tcBorders>
+            <w:tcMar>
+              <w:top w:type="dxa" w:w="60"/>
+              <w:left w:type="dxa" w:w="100"/>
+              <w:bottom w:type="dxa" w:w="60"/>
+              <w:right w:type="dxa" w:w="100"/>
+            </w:tcMar>
+          </w:tcPr>
+          <w:p>
+            <w:r>
+              <w:rPr>
+                <w:rFonts w:ascii="Calibri" w:cs="Calibri" w:eastAsia="Calibri" w:hAnsi="Calibri"/>
+                <w:b w:val="false"/>
+                <w:bCs w:val="false"/>
+                <w:sz w:val="18"/>
+                <w:szCs w:val="18"/>
+              </w:rPr>
+              <w:t xml:space="preserve">0.009</w:t>
+            </w:r>
+          </w:p>
+        </w:tc>
+        <w:tc>
+          <w:tcPr>
+            <w:tcW w:type="dxa" w:w="2000"/>
+            <w:tcBorders>
+              <w:top w:val="single" w:color="A0A0A0" w:sz="4"/>
+              <w:left w:val="single" w:color="A0A0A0" w:sz="4"/>
+              <w:bottom w:val="single" w:color="A0A0A0" w:sz="4"/>
+              <w:right w:val="single" w:color="A0A0A0" w:sz="4"/>
+            </w:tcBorders>
+            <w:tcMar>
+              <w:top w:type="dxa" w:w="60"/>
+              <w:left w:type="dxa" w:w="100"/>
+              <w:bottom w:type="dxa" w:w="60"/>
+              <w:right w:type="dxa" w:w="100"/>
+            </w:tcMar>
+          </w:tcPr>
+          <w:p>
+            <w:r>
+              <w:rPr>
+                <w:rFonts w:ascii="Calibri" w:cs="Calibri" w:eastAsia="Calibri" w:hAnsi="Calibri"/>
+                <w:b w:val="false"/>
+                <w:bCs w:val="false"/>
+                <w:sz w:val="18"/>
+                <w:szCs w:val="18"/>
+              </w:rPr>
+              <w:t xml:space="preserve">0.056</w:t>
+            </w:r>
+          </w:p>
+        </w:tc>
+        <w:tc>
+          <w:tcPr>
+            <w:tcW w:type="dxa" w:w="3026"/>
+            <w:tcBorders>
+              <w:top w:val="single" w:color="A0A0A0" w:sz="4"/>
+              <w:left w:val="single" w:color="A0A0A0" w:sz="4"/>
+              <w:bottom w:val="single" w:color="A0A0A0" w:sz="4"/>
+              <w:right w:val="single" w:color="A0A0A0" w:sz="4"/>
+            </w:tcBorders>
+            <w:tcMar>
+              <w:top w:type="dxa" w:w="60"/>
+              <w:left w:type="dxa" w:w="100"/>
+              <w:bottom w:type="dxa" w:w="60"/>
+              <w:right w:type="dxa" w:w="100"/>
+            </w:tcMar>
+          </w:tcPr>
+          <w:p>
+            <w:r>
+              <w:rPr>
+                <w:rFonts w:ascii="Calibri" w:cs="Calibri" w:eastAsia="Calibri" w:hAnsi="Calibri"/>
+                <w:b w:val="false"/>
+                <w:bCs w:val="false"/>
+                <w:sz w:val="18"/>
+                <w:szCs w:val="18"/>
+              </w:rPr>
+              <w:t xml:space="preserve">+0.20 → +0.01</w:t>
+            </w:r>
+          </w:p>
+        </w:tc>
+      </w:tr>
+      <w:tr>
+        <w:trPr>
+          <w:tblHeader w:val="false"/>
+        </w:trPr>
+        <w:tc>
+          <w:tcPr>
+            <w:tcW w:type="dxa" w:w="2000"/>
+            <w:tcBorders>
+              <w:top w:val="single" w:color="A0A0A0" w:sz="4"/>
+              <w:left w:val="single" w:color="A0A0A0" w:sz="4"/>
+              <w:bottom w:val="single" w:color="A0A0A0" w:sz="4"/>
+              <w:right w:val="single" w:color="A0A0A0" w:sz="4"/>
+            </w:tcBorders>
+            <w:tcMar>
+              <w:top w:type="dxa" w:w="60"/>
+              <w:left w:type="dxa" w:w="100"/>
+              <w:bottom w:type="dxa" w:w="60"/>
+              <w:right w:type="dxa" w:w="100"/>
+            </w:tcMar>
+          </w:tcPr>
+          <w:p>
+            <w:r>
+              <w:rPr>
+                <w:rFonts w:ascii="Calibri" w:cs="Calibri" w:eastAsia="Calibri" w:hAnsi="Calibri"/>
+                <w:b w:val="false"/>
+                <w:bCs w:val="false"/>
+                <w:sz w:val="18"/>
+                <w:szCs w:val="18"/>
+              </w:rPr>
+              <w:t xml:space="preserve">H1 D_AAII</w:t>
+            </w:r>
+          </w:p>
+        </w:tc>
+        <w:tc>
+          <w:tcPr>
+            <w:tcW w:type="dxa" w:w="2000"/>
+            <w:tcBorders>
+              <w:top w:val="single" w:color="A0A0A0" w:sz="4"/>
+              <w:left w:val="single" w:color="A0A0A0" w:sz="4"/>
+              <w:bottom w:val="single" w:color="A0A0A0" w:sz="4"/>
+              <w:right w:val="single" w:color="A0A0A0" w:sz="4"/>
+            </w:tcBorders>
+            <w:tcMar>
+              <w:top w:type="dxa" w:w="60"/>
+              <w:left w:type="dxa" w:w="100"/>
+              <w:bottom w:type="dxa" w:w="60"/>
+              <w:right w:type="dxa" w:w="100"/>
+            </w:tcMar>
+          </w:tcPr>
+          <w:p>
+            <w:r>
+              <w:rPr>
+                <w:rFonts w:ascii="Calibri" w:cs="Calibri" w:eastAsia="Calibri" w:hAnsi="Calibri"/>
+                <w:b w:val="false"/>
+                <w:bCs w:val="false"/>
+                <w:sz w:val="18"/>
+                <w:szCs w:val="18"/>
+              </w:rPr>
+              <w:t xml:space="preserve">0.005</w:t>
+            </w:r>
+          </w:p>
+        </w:tc>
+        <w:tc>
+          <w:tcPr>
+            <w:tcW w:type="dxa" w:w="2000"/>
+            <w:tcBorders>
+              <w:top w:val="single" w:color="A0A0A0" w:sz="4"/>
+              <w:left w:val="single" w:color="A0A0A0" w:sz="4"/>
+              <w:bottom w:val="single" w:color="A0A0A0" w:sz="4"/>
+              <w:right w:val="single" w:color="A0A0A0" w:sz="4"/>
+            </w:tcBorders>
+            <w:tcMar>
+              <w:top w:type="dxa" w:w="60"/>
+              <w:left w:type="dxa" w:w="100"/>
+              <w:bottom w:type="dxa" w:w="60"/>
+              <w:right w:type="dxa" w:w="100"/>
+            </w:tcMar>
+          </w:tcPr>
+          <w:p>
+            <w:r>
+              <w:rPr>
+                <w:rFonts w:ascii="Calibri" w:cs="Calibri" w:eastAsia="Calibri" w:hAnsi="Calibri"/>
+                <w:b w:val="false"/>
+                <w:bCs w:val="false"/>
+                <w:sz w:val="18"/>
+                <w:szCs w:val="18"/>
+              </w:rPr>
+              <w:t xml:space="preserve">0.005</w:t>
+            </w:r>
+          </w:p>
+        </w:tc>
+        <w:tc>
+          <w:tcPr>
+            <w:tcW w:type="dxa" w:w="3026"/>
+            <w:tcBorders>
+              <w:top w:val="single" w:color="A0A0A0" w:sz="4"/>
+              <w:left w:val="single" w:color="A0A0A0" w:sz="4"/>
+              <w:bottom w:val="single" w:color="A0A0A0" w:sz="4"/>
+              <w:right w:val="single" w:color="A0A0A0" w:sz="4"/>
+            </w:tcBorders>
+            <w:tcMar>
+              <w:top w:type="dxa" w:w="60"/>
+              <w:left w:type="dxa" w:w="100"/>
+              <w:bottom w:type="dxa" w:w="60"/>
+              <w:right w:type="dxa" w:w="100"/>
+            </w:tcMar>
+          </w:tcPr>
+          <w:p>
+            <w:r>
+              <w:rPr>
+                <w:rFonts w:ascii="Calibri" w:cs="Calibri" w:eastAsia="Calibri" w:hAnsi="Calibri"/>
+                <w:b w:val="false"/>
+                <w:bCs w:val="false"/>
+                <w:sz w:val="18"/>
+                <w:szCs w:val="18"/>
+              </w:rPr>
+              <w:t xml:space="preserve">+1.94 → +1.98 (p .024)</w:t>
+            </w:r>
+          </w:p>
+        </w:tc>
+      </w:tr>
+      <w:tr>
+        <w:trPr>
+          <w:tblHeader w:val="false"/>
+        </w:trPr>
+        <w:tc>
+          <w:tcPr>
+            <w:tcW w:type="dxa" w:w="2000"/>
+            <w:tcBorders>
+              <w:top w:val="single" w:color="A0A0A0" w:sz="4"/>
+              <w:left w:val="single" w:color="A0A0A0" w:sz="4"/>
+              <w:bottom w:val="single" w:color="A0A0A0" w:sz="4"/>
+              <w:right w:val="single" w:color="A0A0A0" w:sz="4"/>
+            </w:tcBorders>
+            <w:tcMar>
+              <w:top w:type="dxa" w:w="60"/>
+              <w:left w:type="dxa" w:w="100"/>
+              <w:bottom w:type="dxa" w:w="60"/>
+              <w:right w:type="dxa" w:w="100"/>
+            </w:tcMar>
+          </w:tcPr>
+          <w:p>
+            <w:r>
+              <w:rPr>
+                <w:rFonts w:ascii="Calibri" w:cs="Calibri" w:eastAsia="Calibri" w:hAnsi="Calibri"/>
+                <w:b w:val="false"/>
+                <w:bCs w:val="false"/>
+                <w:sz w:val="18"/>
+                <w:szCs w:val="18"/>
+              </w:rPr>
+              <w:t xml:space="preserve">H2 D_MD,Det</w:t>
+            </w:r>
+          </w:p>
+        </w:tc>
+        <w:tc>
+          <w:tcPr>
+            <w:tcW w:type="dxa" w:w="2000"/>
+            <w:tcBorders>
+              <w:top w:val="single" w:color="A0A0A0" w:sz="4"/>
+              <w:left w:val="single" w:color="A0A0A0" w:sz="4"/>
+              <w:bottom w:val="single" w:color="A0A0A0" w:sz="4"/>
+              <w:right w:val="single" w:color="A0A0A0" w:sz="4"/>
+            </w:tcBorders>
+            <w:tcMar>
+              <w:top w:type="dxa" w:w="60"/>
+              <w:left w:type="dxa" w:w="100"/>
+              <w:bottom w:type="dxa" w:w="60"/>
+              <w:right w:type="dxa" w:w="100"/>
+            </w:tcMar>
+          </w:tcPr>
+          <w:p>
+            <w:r>
+              <w:rPr>
+                <w:rFonts w:ascii="Calibri" w:cs="Calibri" w:eastAsia="Calibri" w:hAnsi="Calibri"/>
+                <w:b w:val="false"/>
+                <w:bCs w:val="false"/>
+                <w:sz w:val="18"/>
+                <w:szCs w:val="18"/>
+              </w:rPr>
+              <w:t xml:space="preserve">&lt;0.001</w:t>
+            </w:r>
+          </w:p>
+        </w:tc>
+        <w:tc>
+          <w:tcPr>
+            <w:tcW w:type="dxa" w:w="2000"/>
+            <w:tcBorders>
+              <w:top w:val="single" w:color="A0A0A0" w:sz="4"/>
+              <w:left w:val="single" w:color="A0A0A0" w:sz="4"/>
+              <w:bottom w:val="single" w:color="A0A0A0" w:sz="4"/>
+              <w:right w:val="single" w:color="A0A0A0" w:sz="4"/>
+            </w:tcBorders>
+            <w:tcMar>
+              <w:top w:type="dxa" w:w="60"/>
+              <w:left w:type="dxa" w:w="100"/>
+              <w:bottom w:type="dxa" w:w="60"/>
+              <w:right w:type="dxa" w:w="100"/>
+            </w:tcMar>
+          </w:tcPr>
+          <w:p>
+            <w:r>
+              <w:rPr>
+                <w:rFonts w:ascii="Calibri" w:cs="Calibri" w:eastAsia="Calibri" w:hAnsi="Calibri"/>
+                <w:b w:val="false"/>
+                <w:bCs w:val="false"/>
+                <w:sz w:val="18"/>
+                <w:szCs w:val="18"/>
+              </w:rPr>
+              <w:t xml:space="preserve">0.002</w:t>
+            </w:r>
+          </w:p>
+        </w:tc>
+        <w:tc>
+          <w:tcPr>
+            <w:tcW w:type="dxa" w:w="3026"/>
+            <w:tcBorders>
+              <w:top w:val="single" w:color="A0A0A0" w:sz="4"/>
+              <w:left w:val="single" w:color="A0A0A0" w:sz="4"/>
+              <w:bottom w:val="single" w:color="A0A0A0" w:sz="4"/>
+              <w:right w:val="single" w:color="A0A0A0" w:sz="4"/>
+            </w:tcBorders>
+            <w:tcMar>
+              <w:top w:type="dxa" w:w="60"/>
+              <w:left w:type="dxa" w:w="100"/>
+              <w:bottom w:type="dxa" w:w="60"/>
+              <w:right w:type="dxa" w:w="100"/>
+            </w:tcMar>
+          </w:tcPr>
+          <w:p>
+            <w:r>
+              <w:rPr>
+                <w:rFonts w:ascii="Calibri" w:cs="Calibri" w:eastAsia="Calibri" w:hAnsi="Calibri"/>
+                <w:b w:val="false"/>
+                <w:bCs w:val="false"/>
+                <w:sz w:val="18"/>
+                <w:szCs w:val="18"/>
+              </w:rPr>
+              <w:t xml:space="preserve">+2.07 → +1.70</w:t>
+            </w:r>
+          </w:p>
+        </w:tc>
+      </w:tr>
+    </w:tbl>
+    <w:p>
+      <w:pPr>
+        <w:spacing w:after="60"/>
+      </w:pPr>
+    </w:p>
+    <w:p>
+      <w:pPr>
+        <w:pStyle w:val="ListParagraph"/>
+        <w:numPr>
+          <w:ilvl w:val="0"/>
+          <w:numId w:val="2"/>
+        </w:numPr>
+        <w:spacing w:after="60"/>
+      </w:pPr>
+      <w:r>
+        <w:rPr>
+          <w:rFonts w:ascii="Calibri" w:cs="Calibri" w:eastAsia="Calibri" w:hAnsi="Calibri"/>
+          <w:sz w:val="20"/>
+          <w:szCs w:val="20"/>
+        </w:rPr>
+        <w:t xml:space="preserve">Uncertainty alone: R^q×U jointly significant (p .043 dummy, .024 continuous); R_LOW×D_UNC −0.0155 (t −2.56) — the same loser-segment flattening as BW. In the joint models U terms are not significant (p .158 / .120): the two cannot be separated.</w:t>
+      </w:r>
+    </w:p>
+    <w:p>
+      <w:pPr>
+        <w:pStyle w:val="ListParagraph"/>
+        <w:numPr>
+          <w:ilvl w:val="0"/>
+          <w:numId w:val="2"/>
+        </w:numPr>
+        <w:spacing w:after="60"/>
+      </w:pPr>
+      <w:r>
+        <w:rPr>
+          <w:rFonts w:ascii="Calibri" w:cs="Calibri" w:eastAsia="Calibri" w:hAnsi="Calibri"/>
+          <w:sz w:val="20"/>
+          <w:szCs w:val="20"/>
+        </w:rPr>
+        <w:t xml:space="preserve">Overlap: 70% of high-BW months are high-uncertainty months (phi 0.43); AAII and margin-debt regimes are essentially uncorrelated with uncertainty (phi −0.02 / −0.11).</w:t>
+      </w:r>
+    </w:p>
+    <w:p>
+      <w:pPr>
+        <w:pStyle w:val="ListParagraph"/>
+        <w:numPr>
+          <w:ilvl w:val="0"/>
+          <w:numId w:val="2"/>
+        </w:numPr>
+        <w:spacing w:after="60"/>
+      </w:pPr>
+      <w:r>
+        <w:rPr>
+          <w:rFonts w:ascii="Calibri" w:cs="Calibri" w:eastAsia="Calibri" w:hAnsi="Calibri"/>
+          <w:sz w:val="20"/>
+          <w:szCs w:val="20"/>
+        </w:rPr>
+        <w:t xml:space="preserve">Horizons: SENT⊥ with U p = .056 / .064 / .110; D_SENT .177 / .161 / .358; AAII ≤ .006 and MD ≤ .003 at every horizon.</w:t>
+      </w:r>
+    </w:p>
+    <w:p>
+      <w:pPr>
+        <w:pStyle w:val="ListParagraph"/>
+        <w:numPr>
+          <w:ilvl w:val="0"/>
+          <w:numId w:val="2"/>
+        </w:numPr>
+        <w:spacing w:after="60"/>
+      </w:pPr>
+      <w:r>
+        <w:rPr>
+          <w:rFonts w:ascii="Calibri" w:cs="Calibri" w:eastAsia="Calibri" w:hAnsi="Calibri"/>
+          <w:sz w:val="20"/>
+          <w:szCs w:val="20"/>
+        </w:rPr>
+        <w:t xml:space="preserve">Reading: the BW “sentiment flattens” finding is not separable from a rational uncertainty channel; the AAII winner-chasing (contemporaneous only) and the margin-debt steepening survive. The H3 / PPF high-sentiment amplification (which conditions on D_SENT) was not re-estimated with uncertainty — stated as a limitation.</w:t>
+      </w:r>
+    </w:p>
+    <w:p>
+      <w:pPr>
+        <w:pStyle w:val="Heading2"/>
+      </w:pPr>
+      <w:r>
+        <w:rPr>
+          <w:rFonts w:ascii="Calibri" w:cs="Calibri" w:eastAsia="Calibri" w:hAnsi="Calibri"/>
+        </w:rPr>
+        <w:t xml:space="preserve">§3. Full rerun results (14 October, B = 10,000)</w:t>
+      </w:r>
+    </w:p>
+    <w:p>
+      <w:pPr>
+        <w:pStyle w:val="ListParagraph"/>
+        <w:numPr>
+          <w:ilvl w:val="0"/>
+          <w:numId w:val="2"/>
+        </w:numPr>
+        <w:spacing w:after="60"/>
+      </w:pPr>
+      <w:r>
+        <w:rPr>
+          <w:rFonts w:ascii="Calibri" w:cs="Calibri" w:eastAsia="Calibri" w:hAnsi="Calibri"/>
+          <w:sz w:val="20"/>
+          <w:szCs w:val="20"/>
+        </w:rPr>
+        <w:t xml:space="preserve">Aggregate active: EW gross +0.237 (t 0.50), net −0.810 (t −1.71); VW gross +0.030, net −0.655 (t −1.62). Passive EW net −0.642 (t −2.37).</w:t>
+      </w:r>
+    </w:p>
+    <w:p>
+      <w:pPr>
+        <w:pStyle w:val="ListParagraph"/>
+        <w:numPr>
+          <w:ilvl w:val="0"/>
+          <w:numId w:val="2"/>
+        </w:numPr>
+        <w:spacing w:after="60"/>
+      </w:pPr>
+      <w:r>
+        <w:rPr>
+          <w:rFonts w:ascii="Calibri" w:cs="Calibri" w:eastAsia="Calibri" w:hAnsi="Calibri"/>
+          <w:sz w:val="20"/>
+          <w:szCs w:val="20"/>
+        </w:rPr>
+        <w:t xml:space="preserve">π̂0 86.0%, π− 11.4%, π+ 1.7% (γ* 0.45); bootstrap 1st pct Prob. Luck 9.8%; FF6 π− 21.1%.</w:t>
+      </w:r>
+    </w:p>
+    <w:p>
+      <w:pPr>
+        <w:pStyle w:val="ListParagraph"/>
+        <w:numPr>
+          <w:ilvl w:val="0"/>
+          <w:numId w:val="2"/>
+        </w:numPr>
+        <w:spacing w:after="60"/>
+      </w:pPr>
+      <w:r>
+        <w:rPr>
+          <w:rFonts w:ascii="Calibri" w:cs="Calibri" w:eastAsia="Calibri" w:hAnsi="Calibri"/>
+          <w:sz w:val="20"/>
+          <w:szCs w:val="20"/>
+        </w:rPr>
+        <w:t xml:space="preserve">Breaks unchanged in date; CIs widened (e.g. Aug 2010 [Jan 2010, Mar 2011]; Dec 2015 [Oct 2012, Feb 2019]); sup-F 15.01 (p .002).</w:t>
+      </w:r>
+    </w:p>
+    <w:p>
+      <w:pPr>
+        <w:pStyle w:val="ListParagraph"/>
+        <w:numPr>
+          <w:ilvl w:val="0"/>
+          <w:numId w:val="2"/>
+        </w:numPr>
+        <w:spacing w:after="60"/>
+      </w:pPr>
+      <w:r>
+        <w:rPr>
+          <w:rFonts w:ascii="Calibri" w:cs="Calibri" w:eastAsia="Calibri" w:hAnsi="Calibri"/>
+          <w:sz w:val="20"/>
+          <w:szCs w:val="20"/>
+        </w:rPr>
+        <w:t xml:space="preserve">Persistence D10 −0.113%/m (t −1.81, p_LB .056 — 10% only); activeness-conditioned T1 D1 −0.190 (p_B .009), spread −0.109 (p_B .029).</w:t>
+      </w:r>
+    </w:p>
+    <w:p>
+      <w:pPr>
+        <w:pStyle w:val="ListParagraph"/>
+        <w:numPr>
+          <w:ilvl w:val="0"/>
+          <w:numId w:val="2"/>
+        </w:numPr>
+        <w:spacing w:after="60"/>
+      </w:pPr>
+      <w:r>
+        <w:rPr>
+          <w:rFonts w:ascii="Calibri" w:cs="Calibri" w:eastAsia="Calibri" w:hAnsi="Calibri"/>
+          <w:sz w:val="20"/>
+          <w:szCs w:val="20"/>
+        </w:rPr>
+        <w:t xml:space="preserve">H1 joint χ² 7.64 (.054) / 11.54 (.009) / 12.91 (.005); AAII asymmetry z 1.91 (.028). H2 MD 17.34 (&lt;.001), loser z +2.09. H3 MAX12 6.84 (.033), amplification z 1.91 (.028). H4 n.s. (p .43–.57).</w:t>
+      </w:r>
+    </w:p>
+    <w:p>
+      <w:pPr>
+        <w:pStyle w:val="ListParagraph"/>
+        <w:numPr>
+          <w:ilvl w:val="0"/>
+          <w:numId w:val="2"/>
+        </w:numPr>
+        <w:spacing w:after="60"/>
+      </w:pPr>
+      <w:r>
+        <w:rPr>
+          <w:rFonts w:ascii="Calibri" w:cs="Calibri" w:eastAsia="Calibri" w:hAnsi="Calibri"/>
+          <w:sz w:val="20"/>
+          <w:szCs w:val="20"/>
+        </w:rPr>
+        <w:t xml:space="preserve">PPF: calibration 2.171% (t 1.28, n.s.) → 271 bp per rank point; MAX12 R_MID 3 / 36 bp, Diff p .011.</w:t>
+      </w:r>
+    </w:p>
+    <w:p>
+      <w:pPr>
+        <w:pStyle w:val="Heading2"/>
+      </w:pPr>
+      <w:r>
+        <w:rPr>
+          <w:rFonts w:ascii="Calibri" w:cs="Calibri" w:eastAsia="Calibri" w:hAnsi="Calibri"/>
+        </w:rPr>
+        <w:t xml:space="preserve">§4. dissertation_main.tex (6,192 → 6,444 lines; 239 pp in the container build)</w:t>
+      </w:r>
+    </w:p>
+    <w:p>
+      <w:pPr>
+        <w:pStyle w:val="ListParagraph"/>
+        <w:numPr>
+          <w:ilvl w:val="0"/>
+          <w:numId w:val="2"/>
+        </w:numPr>
+        <w:spacing w:after="60"/>
+      </w:pPr>
+      <w:r>
+        <w:rPr>
+          <w:rFonts w:ascii="Calibri" w:cs="Calibri" w:eastAsia="Calibri" w:hAnsi="Calibri"/>
+          <w:sz w:val="20"/>
+          <w:szCs w:val="20"/>
+        </w:rPr>
+        <w:t xml:space="preserve">All numbers updated against the new tables (≈225 replacements across all chapters and appendices) plus construction counts (leveraged filter 68 share classes; App. C 2,122 / 1,977 / 1,982 / 1,960 / 1,812; H1 1,893 funds; H3 1,672; TNA switches 624; flow validation 173,740; TD slope −1.02).</w:t>
+      </w:r>
+    </w:p>
+    <w:p>
+      <w:pPr>
+        <w:pStyle w:val="ListParagraph"/>
+        <w:numPr>
+          <w:ilvl w:val="0"/>
+          <w:numId w:val="2"/>
+        </w:numPr>
+        <w:spacing w:after="60"/>
+      </w:pPr>
+      <w:r>
+        <w:rPr>
+          <w:rFonts w:ascii="Calibri" w:cs="Calibri" w:eastAsia="Calibri" w:hAnsi="Calibri"/>
+          <w:sz w:val="20"/>
+          <w:szCs w:val="20"/>
+        </w:rPr>
+        <w:t xml:space="preserve">New Section 5.7 “Sentiment or uncertainty?” (Table 5.7) and Appendix J.4 “Macroeconomic uncertainty” (Tables J.10–J.13); JLN paragraph in Section 3.11; D_UNC in the symbol list.</w:t>
+      </w:r>
+    </w:p>
+    <w:p>
+      <w:pPr>
+        <w:pStyle w:val="ListParagraph"/>
+        <w:numPr>
+          <w:ilvl w:val="0"/>
+          <w:numId w:val="2"/>
+        </w:numPr>
+        <w:spacing w:after="60"/>
+      </w:pPr>
+      <w:r>
+        <w:rPr>
+          <w:rFonts w:ascii="Calibri" w:cs="Calibri" w:eastAsia="Calibri" w:hAnsi="Calibri"/>
+          <w:sz w:val="20"/>
+          <w:szCs w:val="20"/>
+        </w:rPr>
+        <w:t xml:space="preserve">BW sentiment claims qualified in: abstract, Özet, contributions, H1 section, synthesis, discussion (sentiment channel), limitations (new seventh), conclusion intro, fifth finding, Appendix J intro and lagged-state paragraph, structure paragraph, reconciliation text and table (new row).</w:t>
+      </w:r>
+    </w:p>
+    <w:p>
+      <w:pPr>
+        <w:pStyle w:val="ListParagraph"/>
+        <w:numPr>
+          <w:ilvl w:val="0"/>
+          <w:numId w:val="2"/>
+        </w:numPr>
+        <w:spacing w:after="60"/>
+      </w:pPr>
+      <w:r>
+        <w:rPr>
+          <w:rFonts w:ascii="Calibri" w:cs="Calibri" w:eastAsia="Calibri" w:hAnsi="Calibri"/>
+          <w:sz w:val="20"/>
+          <w:szCs w:val="20"/>
+        </w:rPr>
+        <w:t xml:space="preserve">Also corrected: H2 loser “robust to timing” (lagged z 1.61, 10% one-sided only); “about half of the net shortfall” → two-fifths EW / half VW; Appendix J intro “two” → four extensions.</w:t>
+      </w:r>
+    </w:p>
+    <w:p>
+      <w:pPr>
+        <w:pStyle w:val="ListParagraph"/>
+        <w:numPr>
+          <w:ilvl w:val="0"/>
+          <w:numId w:val="2"/>
+        </w:numPr>
+        <w:spacing w:after="60"/>
+      </w:pPr>
+      <w:r>
+        <w:rPr>
+          <w:rFonts w:ascii="Calibri" w:cs="Calibri" w:eastAsia="Calibri" w:hAnsi="Calibri"/>
+          <w:sz w:val="20"/>
+          <w:szCs w:val="20"/>
+        </w:rPr>
+        <w:t xml:space="preserve">Abstract: data-source clause dropped to keep the length unchanged (247 words by wc); Özet likewise.</w:t>
+      </w:r>
+    </w:p>
+    <w:p>
+      <w:pPr>
+        <w:pStyle w:val="ListParagraph"/>
+        <w:numPr>
+          <w:ilvl w:val="0"/>
+          <w:numId w:val="2"/>
+        </w:numPr>
+        <w:spacing w:after="60"/>
+      </w:pPr>
+      <w:r>
+        <w:rPr>
+          <w:rFonts w:ascii="Calibri" w:cs="Calibri" w:eastAsia="Calibri" w:hAnsi="Calibri"/>
+          <w:sz w:val="20"/>
+          <w:szCs w:val="20"/>
+        </w:rPr>
+        <w:t xml:space="preserve">Bib: JuradoLudvigsonNg2015 (AER 105(3) 1177–1216, verified), FranzoniSchmalz2017 (RFS 30(8) 2621–2673, verified).</w:t>
+      </w:r>
+    </w:p>
+    <w:p>
+      <w:pPr>
+        <w:pStyle w:val="ListParagraph"/>
+        <w:numPr>
+          <w:ilvl w:val="0"/>
+          <w:numId w:val="2"/>
+        </w:numPr>
+        <w:spacing w:after="60"/>
+      </w:pPr>
+      <w:r>
+        <w:rPr>
+          <w:rFonts w:ascii="Calibri" w:cs="Calibri" w:eastAsia="Calibri" w:hAnsi="Calibri"/>
+          <w:sz w:val="20"/>
+          <w:szCs w:val="20"/>
+        </w:rPr>
+        <w:t xml:space="preserve">Compile (container, substitute fonts): 0 errors, 0 undefined references/citations. Written to D:\TEZ with mtime guards (LF line endings, matching the repository).</w:t>
+      </w:r>
+    </w:p>
+    <w:p>
+      <w:pPr>
+        <w:pStyle w:val="Heading2"/>
+      </w:pPr>
+      <w:r>
+        <w:rPr>
+          <w:rFonts w:ascii="Calibri" w:cs="Calibri" w:eastAsia="Calibri" w:hAnsi="Calibri"/>
+        </w:rPr>
+        <w:t xml:space="preserve">§5. Outstanding at session close (14 October 2026)</w:t>
+      </w:r>
+    </w:p>
+    <w:p>
+      <w:pPr>
+        <w:pStyle w:val="ListParagraph"/>
+        <w:numPr>
+          <w:ilvl w:val="0"/>
+          <w:numId w:val="2"/>
+        </w:numPr>
+        <w:spacing w:after="60"/>
+      </w:pPr>
+      <w:r>
+        <w:rPr>
+          <w:rFonts w:ascii="Calibri" w:cs="Calibri" w:eastAsia="Calibri" w:hAnsi="Calibri"/>
+          <w:sz w:val="20"/>
+          <w:szCs w:val="20"/>
+        </w:rPr>
+        <w:t xml:space="preserve">Commit and Overleaf pull (commands given in chat).</w:t>
+      </w:r>
+    </w:p>
+    <w:p>
+      <w:pPr>
+        <w:pStyle w:val="ListParagraph"/>
+        <w:numPr>
+          <w:ilvl w:val="0"/>
+          <w:numId w:val="2"/>
+        </w:numPr>
+        <w:spacing w:after="60"/>
+      </w:pPr>
+      <w:r>
+        <w:rPr>
+          <w:rFonts w:ascii="Calibri" w:cs="Calibri" w:eastAsia="Calibri" w:hAnsi="Calibri"/>
+          <w:sz w:val="20"/>
+          <w:szCs w:val="20"/>
+        </w:rPr>
+        <w:t xml:space="preserve">Optional: re-estimate H3 / PPF high-sentiment amplification with the uncertainty control (currently a stated limitation).</w:t>
+      </w:r>
+    </w:p>
+    <w:p>
+      <w:pPr>
+        <w:pStyle w:val="ListParagraph"/>
+        <w:numPr>
+          <w:ilvl w:val="0"/>
+          <w:numId w:val="2"/>
+        </w:numPr>
+        <w:spacing w:after="60"/>
+      </w:pPr>
+      <w:r>
+        <w:rPr>
+          <w:rFonts w:ascii="Calibri" w:cs="Calibri" w:eastAsia="Calibri" w:hAnsi="Calibri"/>
+          <w:sz w:val="20"/>
+          <w:szCs w:val="20"/>
+        </w:rPr>
+        <w:t xml:space="preserve">SENT⊥ October 2025 gap (LSEG): H1–H4 end Sep 2025.</w:t>
+      </w:r>
+    </w:p>
+    <w:p>
+      <w:pPr>
+        <w:pStyle w:val="ListParagraph"/>
+        <w:numPr>
+          <w:ilvl w:val="0"/>
+          <w:numId w:val="2"/>
+        </w:numPr>
+        <w:spacing w:after="60"/>
+      </w:pPr>
+      <w:r>
+        <w:rPr>
+          <w:rFonts w:ascii="Calibri" w:cs="Calibri" w:eastAsia="Calibri" w:hAnsi="Calibri"/>
+          <w:sz w:val="20"/>
+          <w:szCs w:val="20"/>
+        </w:rPr>
+        <w:t xml:space="preserve">AAII verification table; BGS (2022) “14% skilled” and Fausch et al. sentences unverified; MOJAX / GENDX text says excluded, code passes them through — reconcile.</w:t>
+      </w:r>
+    </w:p>
+    <w:p>
+      <w:pPr>
+        <w:pStyle w:val="ListParagraph"/>
+        <w:numPr>
+          <w:ilvl w:val="0"/>
+          <w:numId w:val="2"/>
+        </w:numPr>
+        <w:spacing w:after="60"/>
+      </w:pPr>
+      <w:r>
+        <w:rPr>
+          <w:rFonts w:ascii="Calibri" w:cs="Calibri" w:eastAsia="Calibri" w:hAnsi="Calibri"/>
+          <w:sz w:val="20"/>
+          <w:szCs w:val="20"/>
+        </w:rPr>
+        <w:t xml:space="preserve">Abstract rendered length likely &gt; 250 words once citations are expanded (pre-existing) — check against SBE.</w:t>
+      </w:r>
+    </w:p>
+    <w:p>
+      <w:pPr>
+        <w:pStyle w:val="ListParagraph"/>
+        <w:numPr>
+          <w:ilvl w:val="0"/>
+          <w:numId w:val="2"/>
+        </w:numPr>
+        <w:spacing w:after="60"/>
+      </w:pPr>
+      <w:r>
+        <w:rPr>
+          <w:rFonts w:ascii="Calibri" w:cs="Calibri" w:eastAsia="Calibri" w:hAnsi="Calibri"/>
+          <w:sz w:val="20"/>
+          <w:szCs w:val="20"/>
+        </w:rPr>
+        <w:t xml:space="preserve">Limitations text says the tracking-error sort “shows no gradient”; VW gross/net TE gradient is negative — consider rewording.</w:t>
+      </w:r>
+    </w:p>
+    <w:p>
+      <w:pPr>
+        <w:pStyle w:val="ListParagraph"/>
+        <w:numPr>
+          <w:ilvl w:val="0"/>
+          <w:numId w:val="2"/>
+        </w:numPr>
+        <w:spacing w:after="60"/>
+      </w:pPr>
+      <w:r>
+        <w:rPr>
+          <w:rFonts w:ascii="Calibri" w:cs="Calibri" w:eastAsia="Calibri" w:hAnsi="Calibri"/>
+          <w:sz w:val="20"/>
+          <w:szCs w:val="20"/>
+        </w:rPr>
+        <w:t xml:space="preserve">Proofread Özet. Leftovers safe to delete: data/R import/JLN_uncertainty/fund_data_new.xlsx, data/R import/_tex_audit/.</w:t>
+      </w:r>
+    </w:p>
+    <w:p>
+      <w:pPr>
+        <w:pStyle w:val="Heading1"/>
+      </w:pPr>
+      <w:r>
+        <w:rPr>
+          <w:rFonts w:ascii="Calibri" w:cs="Calibri" w:eastAsia="Calibri" w:hAnsi="Calibri"/>
+        </w:rPr>
         <w:t xml:space="preserve">Current Key Pipeline &amp; Dissertation Facts</w:t>
       </w:r>
     </w:p>
@@ -11382,7 +12706,7 @@
           <w:sz w:val="20"/>
           <w:szCs w:val="20"/>
         </w:rPr>
-        <w:t xml:space="preserve">Last updated: 7 October 2026 — post pipeline audit and corrected rerun (B = 10,000).</w:t>
+        <w:t xml:space="preserve">Last updated: 14 October 2026 — post Batch 4 rerun and JLN uncertainty horse race.</w:t>
       </w:r>
     </w:p>
     <w:tbl>
@@ -11524,7 +12848,7 @@
                 <w:sz w:val="18"/>
                 <w:szCs w:val="18"/>
               </w:rPr>
-              <w:t xml:space="preserve">3,677 / 3,208 / 3,113</w:t>
+              <w:t xml:space="preserve">3,667 / 3,205 / 3,110 (raw static universe 3,764)</w:t>
             </w:r>
           </w:p>
         </w:tc>
@@ -11587,7 +12911,7 @@
                 <w:sz w:val="18"/>
                 <w:szCs w:val="18"/>
               </w:rPr>
-              <w:t xml:space="preserve">3,562 / 3,120 / 3,028 (drops 115 / 88 / 85)</w:t>
+              <w:t xml:space="preserve">3,552 / 3,117 / 3,025 (drops 115 / 88 / 85)</w:t>
             </w:r>
           </w:p>
         </w:tc>
@@ -11621,7 +12945,7 @@
                 <w:sz w:val="18"/>
                 <w:szCs w:val="18"/>
               </w:rPr>
-              <w:t xml:space="preserve">Exclusion ledger (flagged_funds.xlsx, data/R import)</w:t>
+              <w:t xml:space="preserve">Analytical active / passive / unknown (incubation)</w:t>
             </w:r>
           </w:p>
         </w:tc>
@@ -11650,7 +12974,7 @@
                 <w:sz w:val="18"/>
                 <w:szCs w:val="18"/>
               </w:rPr>
-              <w:t xml:space="preserve">Entire Analysis 131 (incl. 6 NONSTANDARD_EXPENSE) / H3-only 151 / Perf-comparison 288</w:t>
+              <w:t xml:space="preserve">2,122 / 286 / 709</w:t>
             </w:r>
           </w:p>
         </w:tc>
@@ -11684,7 +13008,7 @@
                 <w:sz w:val="18"/>
                 <w:szCs w:val="18"/>
               </w:rPr>
-              <w:t xml:space="preserve">Active funds, incubation panel</w:t>
+              <w:t xml:space="preserve">N active (full-period perf; bootstrap/BSW)</w:t>
             </w:r>
           </w:p>
         </w:tc>
@@ -11713,7 +13037,7 @@
                 <w:sz w:val="18"/>
                 <w:szCs w:val="18"/>
               </w:rPr>
-              <w:t xml:space="preserve">2,121 analytical; perf subsample 1,981; H3 subsample 1,976</w:t>
+              <w:t xml:space="preserve">1,960; 1,812</w:t>
             </w:r>
           </w:p>
         </w:tc>
@@ -11747,7 +13071,7 @@
                 <w:sz w:val="18"/>
                 <w:szCs w:val="18"/>
               </w:rPr>
-              <w:t xml:space="preserve">N active (full-period perf)</w:t>
+              <w:t xml:space="preserve">N active by sub-period</w:t>
             </w:r>
           </w:p>
         </w:tc>
@@ -11776,7 +13100,7 @@
                 <w:sz w:val="18"/>
                 <w:szCs w:val="18"/>
               </w:rPr>
-              <w:t xml:space="preserve">1,952 (Table 4.5); 1,800 (bootstrap / BSW, ≥24 months)</w:t>
+              <w:t xml:space="preserve">P1 776 / P2 1,029 / P3 1,811</w:t>
             </w:r>
           </w:p>
         </w:tc>
@@ -11810,7 +13134,7 @@
                 <w:sz w:val="18"/>
                 <w:szCs w:val="18"/>
               </w:rPr>
-              <w:t xml:space="preserve">N active by sub-period (≥24 m)</w:t>
+              <w:t xml:space="preserve">Data sources</w:t>
             </w:r>
           </w:p>
         </w:tc>
@@ -11839,7 +13163,7 @@
                 <w:sz w:val="18"/>
                 <w:szCs w:val="18"/>
               </w:rPr>
-              <w:t xml:space="preserve">P1 772 / P2 1,018 / P3 1,799</w:t>
+              <w:t xml:space="preserve">Bloomberg: return index (net), TNA, flows, ER, turnover, AM flag; LSEG: benchmarks, Lipper codes, behavioral proxies; FRED: JLN uncertainty</w:t>
             </w:r>
           </w:p>
         </w:tc>
@@ -11873,7 +13197,7 @@
                 <w:sz w:val="18"/>
                 <w:szCs w:val="18"/>
               </w:rPr>
-              <w:t xml:space="preserve">Data sources</w:t>
+              <w:t xml:space="preserve">Return convention</w:t>
             </w:r>
           </w:p>
         </w:tc>
@@ -11902,7 +13226,7 @@
                 <w:sz w:val="18"/>
                 <w:szCs w:val="18"/>
               </w:rPr>
-              <w:t xml:space="preserve">Bloomberg: return index (NAV-based, net), TNA, flows, ER, turnover, AM flag; LSEG: benchmark returns, Lipper codes, behavioral proxies</w:t>
+              <w:t xml:space="preserve">ret_net = index return (screened); ret_gross = net + ER/1200; per-month winsorised ret_*_cs for robustness; 37 fund-months screened</w:t>
             </w:r>
           </w:p>
         </w:tc>
@@ -11936,7 +13260,7 @@
                 <w:sz w:val="18"/>
                 <w:szCs w:val="18"/>
               </w:rPr>
-              <w:t xml:space="preserve">Return convention</w:t>
+              <w:t xml:space="preserve">Aggregate active EW / VW gross α</w:t>
             </w:r>
           </w:p>
         </w:tc>
@@ -11965,7 +13289,7 @@
                 <w:sz w:val="18"/>
                 <w:szCs w:val="18"/>
               </w:rPr>
-              <w:t xml:space="preserve">ret_net = index return (screened, not winsorised); ret_gross = net + ER/1200; ret_*_cs = per-month 1/99 winsorised (robustness)</w:t>
+              <w:t xml:space="preserve">+0.237 / +0.030 (n.s.)</w:t>
             </w:r>
           </w:p>
         </w:tc>
@@ -11999,7 +13323,7 @@
                 <w:sz w:val="18"/>
                 <w:szCs w:val="18"/>
               </w:rPr>
-              <w:t xml:space="preserve">Return screen</w:t>
+              <w:t xml:space="preserve">Aggregate active EW / VW net α</w:t>
             </w:r>
           </w:p>
         </w:tc>
@@ -12028,7 +13352,7 @@
                 <w:sz w:val="18"/>
                 <w:szCs w:val="18"/>
               </w:rPr>
-              <w:t xml:space="preserve">37 fund-months set to NA (return_screen.xlsx); 15 active, 1 passive, 21 unknown</w:t>
+              <w:t xml:space="preserve">−0.810* (t −1.71) / −0.655 (t −1.62)</w:t>
             </w:r>
           </w:p>
         </w:tc>
@@ -12062,7 +13386,7 @@
                 <w:sz w:val="18"/>
                 <w:szCs w:val="18"/>
               </w:rPr>
-              <w:t xml:space="preserve">Aggregate active EW / VW gross α</w:t>
+              <w:t xml:space="preserve">Aggregate passive EW / VW net α</w:t>
             </w:r>
           </w:p>
         </w:tc>
@@ -12091,7 +13415,7 @@
                 <w:sz w:val="18"/>
                 <w:szCs w:val="18"/>
               </w:rPr>
-              <w:t xml:space="preserve">+0.223 / +0.027 (n.s.)</w:t>
+              <w:t xml:space="preserve">−0.642** / −0.058</w:t>
             </w:r>
           </w:p>
         </w:tc>
@@ -12125,7 +13449,7 @@
                 <w:sz w:val="18"/>
                 <w:szCs w:val="18"/>
               </w:rPr>
-              <w:t xml:space="preserve">Aggregate active EW / VW net α</w:t>
+              <w:t xml:space="preserve">Bootstrap (Carhart)</w:t>
             </w:r>
           </w:p>
         </w:tc>
@@ -12154,7 +13478,7 @@
                 <w:sz w:val="18"/>
                 <w:szCs w:val="18"/>
               </w:rPr>
-              <w:t xml:space="preserve">−0.823* / −0.658</w:t>
+              <w:t xml:space="preserve">Consistent with luck (1st pct Prob. Luck 9.8%)</w:t>
             </w:r>
           </w:p>
         </w:tc>
@@ -12188,7 +13512,7 @@
                 <w:sz w:val="18"/>
                 <w:szCs w:val="18"/>
               </w:rPr>
-              <w:t xml:space="preserve">Aggregate passive EW / VW net α</w:t>
+              <w:t xml:space="preserve">π̂0 / π−A / π+A (γ* = 0.45)</w:t>
             </w:r>
           </w:p>
         </w:tc>
@@ -12217,7 +13541,7 @@
                 <w:sz w:val="18"/>
                 <w:szCs w:val="18"/>
               </w:rPr>
-              <w:t xml:space="preserve">−0.693** / −0.057</w:t>
+              <w:t xml:space="preserve">86.0% / 11.4% / 1.7%</w:t>
             </w:r>
           </w:p>
         </w:tc>
@@ -12251,7 +13575,7 @@
                 <w:sz w:val="18"/>
                 <w:szCs w:val="18"/>
               </w:rPr>
-              <w:t xml:space="preserve">Bootstrap (Carhart, B = 10,000)</w:t>
+              <w:t xml:space="preserve">Structural breaks</w:t>
             </w:r>
           </w:p>
         </w:tc>
@@ -12280,7 +13604,7 @@
                 <w:sz w:val="18"/>
                 <w:szCs w:val="18"/>
               </w:rPr>
-              <w:t xml:space="preserve">All percentiles consistent with luck (1st pct Prob. Luck 7.2%)</w:t>
+              <w:t xml:space="preserve">BIC 7: Mar 2000 / Mar 2003 / Mar 2006 / Aug 2010 / Dec 2015 / Jan 2019 / Jan 2022; full-sample HAC CIs; supF 15.01 (p .002)</w:t>
             </w:r>
           </w:p>
         </w:tc>
@@ -12314,7 +13638,7 @@
                 <w:sz w:val="18"/>
                 <w:szCs w:val="18"/>
               </w:rPr>
-              <w:t xml:space="preserve">π̂0 / π−A / π+A (γ* = 0.45)</w:t>
+              <w:t xml:space="preserve">Sub-period active EW net α</w:t>
             </w:r>
           </w:p>
         </w:tc>
@@ -12343,7 +13667,7 @@
                 <w:sz w:val="18"/>
                 <w:szCs w:val="18"/>
               </w:rPr>
-              <w:t xml:space="preserve">87.1% / 11.0% / 1.5% (γ 0.20: 7.4% / 2.7%)</w:t>
+              <w:t xml:space="preserve">P1 −0.715 / P2 −0.165 / P3 −1.752*** (VW P3 −0.992***)</w:t>
             </w:r>
           </w:p>
         </w:tc>
@@ -12377,7 +13701,7 @@
                 <w:sz w:val="18"/>
                 <w:szCs w:val="18"/>
               </w:rPr>
-              <w:t xml:space="preserve">Structural breaks (BIC = 7; LWZ = 5)</w:t>
+              <w:t xml:space="preserve">Sub-period π̂0</w:t>
             </w:r>
           </w:p>
         </w:tc>
@@ -12406,7 +13730,7 @@
                 <w:sz w:val="18"/>
                 <w:szCs w:val="18"/>
               </w:rPr>
-              <w:t xml:space="preserve">Mar 2000 / Mar 2003 / Mar 2006 / Aug 2010 / Dec 2015 / Jan 2019 / Jan 2022; NW lag 35</w:t>
+              <w:t xml:space="preserve">87.1 / 80.9 / 80.6</w:t>
             </w:r>
           </w:p>
         </w:tc>
@@ -12440,7 +13764,7 @@
                 <w:sz w:val="18"/>
                 <w:szCs w:val="18"/>
               </w:rPr>
-              <w:t xml:space="preserve">Regime means (rolling α p.a.)</w:t>
+              <w:t xml:space="preserve">FF subperiod</w:t>
             </w:r>
           </w:p>
         </w:tc>
@@ -12469,7 +13793,7 @@
                 <w:sz w:val="18"/>
                 <w:szCs w:val="18"/>
               </w:rPr>
-              <w:t xml:space="preserve">−0.46 / +2.93 / −0.03 / +1.33 / −0.12 / −0.69 / −0.13 / −1.00</w:t>
+              <w:t xml:space="preserve">N 805; π̂0 88.9%; π− 3.7% / π+ 6.3%</w:t>
             </w:r>
           </w:p>
         </w:tc>
@@ -12503,7 +13827,7 @@
                 <w:sz w:val="18"/>
                 <w:szCs w:val="18"/>
               </w:rPr>
-              <w:t xml:space="preserve">Break tests</w:t>
+              <w:t xml:space="preserve">Factor robustness</w:t>
             </w:r>
           </w:p>
         </w:tc>
@@ -12532,7 +13856,7 @@
                 <w:sz w:val="18"/>
                 <w:szCs w:val="18"/>
               </w:rPr>
-              <w:t xml:space="preserve">supF 14.82 (p .003, argmax Aug 2021); non-overlapping series: BIC 0 breaks, supF 10.67 (p .019, Aug 2019)</w:t>
+              <w:t xml:space="preserve">FF6 π̂0 77.8%, π− 21.1%; C+PSL π̂0 86.9%, π− 9.0%</w:t>
             </w:r>
           </w:p>
         </w:tc>
@@ -12566,7 +13890,7 @@
                 <w:sz w:val="18"/>
                 <w:szCs w:val="18"/>
               </w:rPr>
-              <w:t xml:space="preserve">Sub-periods (SUBPERIOD_BREAKS 2006-03, 2010-08)</w:t>
+              <w:t xml:space="preserve">Persistence</w:t>
             </w:r>
           </w:p>
         </w:tc>
@@ -12595,7 +13919,7 @@
                 <w:sz w:val="18"/>
                 <w:szCs w:val="18"/>
               </w:rPr>
-              <w:t xml:space="preserve">P1 Jan 1995–Mar 2006 / P2 Apr 2006–Aug 2010 / P3 Sep 2010–Jan 2026</w:t>
+              <w:t xml:space="preserve">D10 −0.113%/m (t −1.81, p_LB .056); P1 −0.285 (p .015); cross-regime −0.138 (p .022)</w:t>
             </w:r>
           </w:p>
         </w:tc>
@@ -12629,7 +13953,7 @@
                 <w:sz w:val="18"/>
                 <w:szCs w:val="18"/>
               </w:rPr>
-              <w:t xml:space="preserve">Sub-period active EW net α</w:t>
+              <w:t xml:space="preserve">Activeness</w:t>
             </w:r>
           </w:p>
         </w:tc>
@@ -12658,7 +13982,7 @@
                 <w:sz w:val="18"/>
                 <w:szCs w:val="18"/>
               </w:rPr>
-              <w:t xml:space="preserve">P1 −0.741 / P2 −0.169 / P3 −1.754*** (VW P3 −0.995***)</w:t>
+              <w:t xml:space="preserve">MR p_up 1−R² EW gross .017 / net .031; T1 D1 −0.190 (p_B .009)</w:t>
             </w:r>
           </w:p>
         </w:tc>
@@ -12692,7 +14016,7 @@
                 <w:sz w:val="18"/>
                 <w:szCs w:val="18"/>
               </w:rPr>
-              <w:t xml:space="preserve">Sub-period π̂0; π+; π−</w:t>
+              <w:t xml:space="preserve">H1–H4 window / N</w:t>
             </w:r>
           </w:p>
         </w:tc>
@@ -12721,7 +14045,7 @@
                 <w:sz w:val="18"/>
                 <w:szCs w:val="18"/>
               </w:rPr>
-              <w:t xml:space="preserve">86.0 / 80.9 / 81.0; 12.5 / 19.4 / −5.6; 1.1 / −0.3 / 23.6</w:t>
+              <w:t xml:space="preserve">Jan 1998 – Sep 2025; H1/H2 306,150; H3 261,329; H4 305,079</w:t>
             </w:r>
           </w:p>
         </w:tc>
@@ -12755,7 +14079,7 @@
                 <w:sz w:val="18"/>
                 <w:szCs w:val="18"/>
               </w:rPr>
-              <w:t xml:space="preserve">FF subperiod (Jan 1995–Sep 2006)</w:t>
+              <w:t xml:space="preserve">H1 D_SENT / SENT⊥ / D_AAII χ²</w:t>
             </w:r>
           </w:p>
         </w:tc>
@@ -12784,7 +14108,7 @@
                 <w:sz w:val="18"/>
                 <w:szCs w:val="18"/>
               </w:rPr>
-              <w:t xml:space="preserve">N 804; π̂0 88.8%; π− 3.5% / π+ 7.1%; EW / VW net −0.998 / −0.800 (n.s.)</w:t>
+              <w:t xml:space="preserve">7.64 (.054) / 11.54 (.009) / 12.91 (.005); AAII asym z 1.91 (.028)</w:t>
             </w:r>
           </w:p>
         </w:tc>
@@ -12818,7 +14142,7 @@
                 <w:sz w:val="18"/>
                 <w:szCs w:val="18"/>
               </w:rPr>
-              <w:t xml:space="preserve">Factor robustness</w:t>
+              <w:t xml:space="preserve">H2 / H3 / H4</w:t>
             </w:r>
           </w:p>
         </w:tc>
@@ -12847,7 +14171,7 @@
                 <w:sz w:val="18"/>
                 <w:szCs w:val="18"/>
               </w:rPr>
-              <w:t xml:space="preserve">FF6: π̂0 78.4%, T− 20.3%, EW net −1.084**; C+PSL: π̂0 88.0%, T− 8.7%, EW net −0.845*</w:t>
+              <w:t xml:space="preserve">MD 17.34 (&lt;.001), loser z +2.09; MAX12 6.84 (.033), amp z 1.91; H4 n.s.</w:t>
             </w:r>
           </w:p>
         </w:tc>
@@ -12881,7 +14205,7 @@
                 <w:sz w:val="18"/>
                 <w:szCs w:val="18"/>
               </w:rPr>
-              <w:t xml:space="preserve">Persistence (7 cohorts, 84 months)</w:t>
+              <w:t xml:space="preserve">Uncertainty control (h = 1)</w:t>
             </w:r>
           </w:p>
         </w:tc>
@@ -12910,7 +14234,7 @@
                 <w:sz w:val="18"/>
                 <w:szCs w:val="18"/>
               </w:rPr>
-              <w:t xml:space="preserve">D10 −0.122%/m (t −1.83, p_LB .054); P1 −0.285 (p .021); cross-regime −0.149 (p .019), spread t 3.11; no Panel D</w:t>
+              <w:t xml:space="preserve">D_SENT .055 → .177; SENT⊥ .009 → .056; AAII .005 → .005; MD &lt;.001 → .002</w:t>
             </w:r>
           </w:p>
         </w:tc>
@@ -12944,7 +14268,7 @@
                 <w:sz w:val="18"/>
                 <w:szCs w:val="18"/>
               </w:rPr>
-              <w:t xml:space="preserve">Activeness (monthly lagged 1−R²)</w:t>
+              <w:t xml:space="preserve">PPF</w:t>
             </w:r>
           </w:p>
         </w:tc>
@@ -12973,7 +14297,7 @@
                 <w:sz w:val="18"/>
                 <w:szCs w:val="18"/>
               </w:rPr>
-              <w:t xml:space="preserve">Q1 net −1.523*** EW / −1.590*** VW; MR p_up EW gross .016 / net .033; TE no gradient</w:t>
+              <w:t xml:space="preserve">Calibration 2.171% (t 1.28) → 271 bp/rank point; MAX12 R_MID 3 / 36 bp; Diff p .011</w:t>
             </w:r>
           </w:p>
         </w:tc>
@@ -13007,7 +14331,7 @@
                 <w:sz w:val="18"/>
                 <w:szCs w:val="18"/>
               </w:rPr>
-              <w:t xml:space="preserve">BW sentiment vintage</w:t>
+              <w:t xml:space="preserve">dissertation_main.tex</w:t>
             </w:r>
           </w:p>
         </w:tc>
@@ -13036,7 +14360,7 @@
                 <w:sz w:val="18"/>
                 <w:szCs w:val="18"/>
               </w:rPr>
-              <w:t xml:space="preserve">March 2026 (SENT⊥ 1965:07–2025:12; 2025-10 missing)</w:t>
+              <w:t xml:space="preserve">6,444 lines; Appendices A–K (J.4 uncertainty); 0 undefined refs (container build)</w:t>
             </w:r>
           </w:p>
         </w:tc>
@@ -13070,7 +14394,7 @@
                 <w:sz w:val="18"/>
                 <w:szCs w:val="18"/>
               </w:rPr>
-              <w:t xml:space="preserve">H1–H4 estimation window</w:t>
+              <w:t xml:space="preserve">Key script versions</w:t>
             </w:r>
           </w:p>
         </w:tc>
@@ -13099,7 +14423,7 @@
                 <w:sz w:val="18"/>
                 <w:szCs w:val="18"/>
               </w:rPr>
-              <w:t xml:space="preserve">Jan 1998 – Sep 2025 (Decembers excluded; Januaries included)</w:t>
+              <w:t xml:space="preserve">data_import v1.6; flow v1.3; panel_regressions_setup v1.6; behavioral_state_variables v1.3; persistence v1.4; activeness_persistence v1.3; psychological_premium v1.4; structural_break v1.4; panel_regressions_reporting v1.2; uncertainty_robustness v1.1; master_pipeline v1.7</w:t>
             </w:r>
           </w:p>
         </w:tc>
@@ -13133,7 +14457,7 @@
                 <w:sz w:val="18"/>
                 <w:szCs w:val="18"/>
               </w:rPr>
-              <w:t xml:space="preserve">H1/H2 / H3 / H4 N</w:t>
+              <w:t xml:space="preserve">Pipeline working directory</w:t>
             </w:r>
           </w:p>
         </w:tc>
@@ -13162,7 +14486,7 @@
                 <w:sz w:val="18"/>
                 <w:szCs w:val="18"/>
               </w:rPr>
-              <w:t xml:space="preserve">303,471 (1,874 funds, 306 months) / 258,944 (1,655) / 302,410</w:t>
+              <w:t xml:space="preserve">D:\TEZ\data\R import</w:t>
             </w:r>
           </w:p>
         </w:tc>
@@ -13196,7 +14520,7 @@
                 <w:sz w:val="18"/>
                 <w:szCs w:val="18"/>
               </w:rPr>
-              <w:t xml:space="preserve">H1 D_SENT / SENT⊥ / D_AAII χ²</w:t>
+              <w:t xml:space="preserve">Defense</w:t>
             </w:r>
           </w:p>
         </w:tc>
@@ -13225,7 +14549,7 @@
                 <w:sz w:val="18"/>
                 <w:szCs w:val="18"/>
               </w:rPr>
-              <w:t xml:space="preserve">7.73 (.052) / 11.93 (.008) / 12.55 (.006); AAII asymmetry z 1.67 (.048)</w:t>
+              <w:t xml:space="preserve">June 2026 (completed); post-defense revisions in progress</w:t>
             </w:r>
           </w:p>
         </w:tc>
@@ -13259,7 +14583,7 @@
                 <w:sz w:val="18"/>
                 <w:szCs w:val="18"/>
               </w:rPr>
-              <w:t xml:space="preserve">H2 D_MD,Det χ² / loser z</w:t>
+              <w:t xml:space="preserve">Supervisor</w:t>
             </w:r>
           </w:p>
         </w:tc>
@@ -13288,7 +14612,7 @@
                 <w:sz w:val="18"/>
                 <w:szCs w:val="18"/>
               </w:rPr>
-              <w:t xml:space="preserve">17.97 (&lt;.001) / +2.14 (margin-call direction); INV-PCR n.s.</w:t>
+              <w:t xml:space="preserve">Prof. Vedat Akgiray</w:t>
             </w:r>
           </w:p>
         </w:tc>
@@ -13322,7 +14646,7 @@
                 <w:sz w:val="18"/>
                 <w:szCs w:val="18"/>
               </w:rPr>
-              <w:t xml:space="preserve">H3 MAX12 χ² / z</w:t>
+              <w:t xml:space="preserve">Jury (SBE order)</w:t>
             </w:r>
           </w:p>
         </w:tc>
@@ -13351,7 +14675,7 @@
                 <w:sz w:val="18"/>
                 <w:szCs w:val="18"/>
               </w:rPr>
-              <w:t xml:space="preserve">6.97 (.031) / +1.98 (.024); ActSkew significant only under Lipper×ym FE</w:t>
+              <w:t xml:space="preserve">Akgiray / Coşkun / Karahan / Ahi / Özsöylev</w:t>
             </w:r>
           </w:p>
         </w:tc>
@@ -13385,7 +14709,7 @@
                 <w:sz w:val="18"/>
                 <w:szCs w:val="18"/>
               </w:rPr>
-              <w:t xml:space="preserve">H4</w:t>
+              <w:t xml:space="preserve">PC path</w:t>
             </w:r>
           </w:p>
         </w:tc>
@@ -13414,7 +14738,7 @@
                 <w:sz w:val="18"/>
                 <w:szCs w:val="18"/>
               </w:rPr>
-              <w:t xml:space="preserve">Fail to reject (joint p .47–.70; lagged and ym-FE also n.s.); θ −0.0042 (t −5.42)</w:t>
+              <w:t xml:space="preserve">D:\TEZ\ (root), D:\TEZ\R scripts\, D:\TEZ\tables\</w:t>
             </w:r>
           </w:p>
         </w:tc>
@@ -13448,7 +14772,7 @@
                 <w:sz w:val="18"/>
                 <w:szCs w:val="18"/>
               </w:rPr>
-              <w:t xml:space="preserve">PPF MAX12 R_MID SP_low / SP_high / Diff</w:t>
+              <w:t xml:space="preserve">Repo</w:t>
             </w:r>
           </w:p>
         </w:tc>
@@ -13477,7 +14801,7 @@
                 <w:sz w:val="18"/>
                 <w:szCs w:val="18"/>
               </w:rPr>
-              <w:t xml:space="preserve">−0.009 / −0.133 / −0.124 (p .009) ≈ 2 / 35 / 33 bp; MOM_SPREAD_PCT 2.120 → 265 bp/rank-point</w:t>
+              <w:t xml:space="preserve">github.com/omeren83/Active-Management-Puzzle (private)</w:t>
             </w:r>
           </w:p>
         </w:tc>
@@ -13511,7 +14835,7 @@
                 <w:sz w:val="18"/>
                 <w:szCs w:val="18"/>
               </w:rPr>
-              <w:t xml:space="preserve">Bootstrap caches</w:t>
+              <w:t xml:space="preserve">R version</w:t>
             </w:r>
           </w:p>
         </w:tc>
@@ -13540,574 +14864,7 @@
                 <w:sz w:val="18"/>
                 <w:szCs w:val="18"/>
               </w:rPr>
-              <w:t xml:space="preserve">Regenerated with BOOT_KERNEL v2.8-draw-order, B = 10,000 (OMER-PC)</w:t>
-            </w:r>
-          </w:p>
-        </w:tc>
-      </w:tr>
-      <w:tr>
-        <w:trPr>
-          <w:tblHeader w:val="false"/>
-        </w:trPr>
-        <w:tc>
-          <w:tcPr>
-            <w:tcW w:type="dxa" w:w="3200"/>
-            <w:tcBorders>
-              <w:top w:val="single" w:color="A0A0A0" w:sz="4"/>
-              <w:left w:val="single" w:color="A0A0A0" w:sz="4"/>
-              <w:bottom w:val="single" w:color="A0A0A0" w:sz="4"/>
-              <w:right w:val="single" w:color="A0A0A0" w:sz="4"/>
-            </w:tcBorders>
-            <w:tcMar>
-              <w:top w:type="dxa" w:w="60"/>
-              <w:left w:type="dxa" w:w="100"/>
-              <w:bottom w:type="dxa" w:w="60"/>
-              <w:right w:type="dxa" w:w="100"/>
-            </w:tcMar>
-          </w:tcPr>
-          <w:p>
-            <w:r>
-              <w:rPr>
-                <w:rFonts w:ascii="Calibri" w:cs="Calibri" w:eastAsia="Calibri" w:hAnsi="Calibri"/>
-                <w:b w:val="false"/>
-                <w:bCs w:val="false"/>
-                <w:sz w:val="18"/>
-                <w:szCs w:val="18"/>
-              </w:rPr>
-              <w:t xml:space="preserve">dissertation_main.tex</w:t>
-            </w:r>
-          </w:p>
-        </w:tc>
-        <w:tc>
-          <w:tcPr>
-            <w:tcW w:type="dxa" w:w="5826"/>
-            <w:tcBorders>
-              <w:top w:val="single" w:color="A0A0A0" w:sz="4"/>
-              <w:left w:val="single" w:color="A0A0A0" w:sz="4"/>
-              <w:bottom w:val="single" w:color="A0A0A0" w:sz="4"/>
-              <w:right w:val="single" w:color="A0A0A0" w:sz="4"/>
-            </w:tcBorders>
-            <w:tcMar>
-              <w:top w:type="dxa" w:w="60"/>
-              <w:left w:type="dxa" w:w="100"/>
-              <w:bottom w:type="dxa" w:w="60"/>
-              <w:right w:type="dxa" w:w="100"/>
-            </w:tcMar>
-          </w:tcPr>
-          <w:p>
-            <w:r>
-              <w:rPr>
-                <w:rFonts w:ascii="Calibri" w:cs="Calibri" w:eastAsia="Calibri" w:hAnsi="Calibri"/>
-                <w:b w:val="false"/>
-                <w:bCs w:val="false"/>
-                <w:sz w:val="18"/>
-                <w:szCs w:val="18"/>
-              </w:rPr>
-              <w:t xml:space="preserve">6,192 lines, 225 pp; Appendices A–K; Overleaf build confirmed</w:t>
-            </w:r>
-          </w:p>
-        </w:tc>
-      </w:tr>
-      <w:tr>
-        <w:trPr>
-          <w:tblHeader w:val="false"/>
-        </w:trPr>
-        <w:tc>
-          <w:tcPr>
-            <w:tcW w:type="dxa" w:w="3200"/>
-            <w:tcBorders>
-              <w:top w:val="single" w:color="A0A0A0" w:sz="4"/>
-              <w:left w:val="single" w:color="A0A0A0" w:sz="4"/>
-              <w:bottom w:val="single" w:color="A0A0A0" w:sz="4"/>
-              <w:right w:val="single" w:color="A0A0A0" w:sz="4"/>
-            </w:tcBorders>
-            <w:tcMar>
-              <w:top w:type="dxa" w:w="60"/>
-              <w:left w:type="dxa" w:w="100"/>
-              <w:bottom w:type="dxa" w:w="60"/>
-              <w:right w:type="dxa" w:w="100"/>
-            </w:tcMar>
-          </w:tcPr>
-          <w:p>
-            <w:r>
-              <w:rPr>
-                <w:rFonts w:ascii="Calibri" w:cs="Calibri" w:eastAsia="Calibri" w:hAnsi="Calibri"/>
-                <w:b w:val="false"/>
-                <w:bCs w:val="false"/>
-                <w:sz w:val="18"/>
-                <w:szCs w:val="18"/>
-              </w:rPr>
-              <w:t xml:space="preserve">Key script versions</w:t>
-            </w:r>
-          </w:p>
-        </w:tc>
-        <w:tc>
-          <w:tcPr>
-            <w:tcW w:type="dxa" w:w="5826"/>
-            <w:tcBorders>
-              <w:top w:val="single" w:color="A0A0A0" w:sz="4"/>
-              <w:left w:val="single" w:color="A0A0A0" w:sz="4"/>
-              <w:bottom w:val="single" w:color="A0A0A0" w:sz="4"/>
-              <w:right w:val="single" w:color="A0A0A0" w:sz="4"/>
-            </w:tcBorders>
-            <w:tcMar>
-              <w:top w:type="dxa" w:w="60"/>
-              <w:left w:type="dxa" w:w="100"/>
-              <w:bottom w:type="dxa" w:w="60"/>
-              <w:right w:type="dxa" w:w="100"/>
-            </w:tcMar>
-          </w:tcPr>
-          <w:p>
-            <w:r>
-              <w:rPr>
-                <w:rFonts w:ascii="Calibri" w:cs="Calibri" w:eastAsia="Calibri" w:hAnsi="Calibri"/>
-                <w:b w:val="false"/>
-                <w:bCs w:val="false"/>
-                <w:sz w:val="18"/>
-                <w:szCs w:val="18"/>
-              </w:rPr>
-              <w:t xml:space="preserve">data_import v1.4; flow v1.2; alpha_estimation v2.8; alpha_estimation_robust v1.5; FF_comparison v1.6; subperiod v1.6; structural_break v1.3; persistence v1.3; activeness_analysis v1.4; portfolio_sorts v1.5; panel_regressions_setup v1.5; master_pipeline v1.6 (sync ^table[_0-9]); build_robust_tables v1.4; build_ff_tables_manual v1.3</w:t>
-            </w:r>
-          </w:p>
-        </w:tc>
-      </w:tr>
-      <w:tr>
-        <w:trPr>
-          <w:tblHeader w:val="false"/>
-        </w:trPr>
-        <w:tc>
-          <w:tcPr>
-            <w:tcW w:type="dxa" w:w="3200"/>
-            <w:tcBorders>
-              <w:top w:val="single" w:color="A0A0A0" w:sz="4"/>
-              <w:left w:val="single" w:color="A0A0A0" w:sz="4"/>
-              <w:bottom w:val="single" w:color="A0A0A0" w:sz="4"/>
-              <w:right w:val="single" w:color="A0A0A0" w:sz="4"/>
-            </w:tcBorders>
-            <w:tcMar>
-              <w:top w:type="dxa" w:w="60"/>
-              <w:left w:type="dxa" w:w="100"/>
-              <w:bottom w:type="dxa" w:w="60"/>
-              <w:right w:type="dxa" w:w="100"/>
-            </w:tcMar>
-          </w:tcPr>
-          <w:p>
-            <w:r>
-              <w:rPr>
-                <w:rFonts w:ascii="Calibri" w:cs="Calibri" w:eastAsia="Calibri" w:hAnsi="Calibri"/>
-                <w:b w:val="false"/>
-                <w:bCs w:val="false"/>
-                <w:sz w:val="18"/>
-                <w:szCs w:val="18"/>
-              </w:rPr>
-              <w:t xml:space="preserve">Pipeline working directory</w:t>
-            </w:r>
-          </w:p>
-        </w:tc>
-        <w:tc>
-          <w:tcPr>
-            <w:tcW w:type="dxa" w:w="5826"/>
-            <w:tcBorders>
-              <w:top w:val="single" w:color="A0A0A0" w:sz="4"/>
-              <w:left w:val="single" w:color="A0A0A0" w:sz="4"/>
-              <w:bottom w:val="single" w:color="A0A0A0" w:sz="4"/>
-              <w:right w:val="single" w:color="A0A0A0" w:sz="4"/>
-            </w:tcBorders>
-            <w:tcMar>
-              <w:top w:type="dxa" w:w="60"/>
-              <w:left w:type="dxa" w:w="100"/>
-              <w:bottom w:type="dxa" w:w="60"/>
-              <w:right w:type="dxa" w:w="100"/>
-            </w:tcMar>
-          </w:tcPr>
-          <w:p>
-            <w:r>
-              <w:rPr>
-                <w:rFonts w:ascii="Calibri" w:cs="Calibri" w:eastAsia="Calibri" w:hAnsi="Calibri"/>
-                <w:b w:val="false"/>
-                <w:bCs w:val="false"/>
-                <w:sz w:val="18"/>
-                <w:szCs w:val="18"/>
-              </w:rPr>
-              <w:t xml:space="preserve">D:\TEZ\data\R import (fund_data.xlsx, flagged_funds.xlsx read from here)</w:t>
-            </w:r>
-          </w:p>
-        </w:tc>
-      </w:tr>
-      <w:tr>
-        <w:trPr>
-          <w:tblHeader w:val="false"/>
-        </w:trPr>
-        <w:tc>
-          <w:tcPr>
-            <w:tcW w:type="dxa" w:w="3200"/>
-            <w:tcBorders>
-              <w:top w:val="single" w:color="A0A0A0" w:sz="4"/>
-              <w:left w:val="single" w:color="A0A0A0" w:sz="4"/>
-              <w:bottom w:val="single" w:color="A0A0A0" w:sz="4"/>
-              <w:right w:val="single" w:color="A0A0A0" w:sz="4"/>
-            </w:tcBorders>
-            <w:tcMar>
-              <w:top w:type="dxa" w:w="60"/>
-              <w:left w:type="dxa" w:w="100"/>
-              <w:bottom w:type="dxa" w:w="60"/>
-              <w:right w:type="dxa" w:w="100"/>
-            </w:tcMar>
-          </w:tcPr>
-          <w:p>
-            <w:r>
-              <w:rPr>
-                <w:rFonts w:ascii="Calibri" w:cs="Calibri" w:eastAsia="Calibri" w:hAnsi="Calibri"/>
-                <w:b w:val="false"/>
-                <w:bCs w:val="false"/>
-                <w:sz w:val="18"/>
-                <w:szCs w:val="18"/>
-              </w:rPr>
-              <w:t xml:space="preserve">Defense</w:t>
-            </w:r>
-          </w:p>
-        </w:tc>
-        <w:tc>
-          <w:tcPr>
-            <w:tcW w:type="dxa" w:w="5826"/>
-            <w:tcBorders>
-              <w:top w:val="single" w:color="A0A0A0" w:sz="4"/>
-              <w:left w:val="single" w:color="A0A0A0" w:sz="4"/>
-              <w:bottom w:val="single" w:color="A0A0A0" w:sz="4"/>
-              <w:right w:val="single" w:color="A0A0A0" w:sz="4"/>
-            </w:tcBorders>
-            <w:tcMar>
-              <w:top w:type="dxa" w:w="60"/>
-              <w:left w:type="dxa" w:w="100"/>
-              <w:bottom w:type="dxa" w:w="60"/>
-              <w:right w:type="dxa" w:w="100"/>
-            </w:tcMar>
-          </w:tcPr>
-          <w:p>
-            <w:r>
-              <w:rPr>
-                <w:rFonts w:ascii="Calibri" w:cs="Calibri" w:eastAsia="Calibri" w:hAnsi="Calibri"/>
-                <w:b w:val="false"/>
-                <w:bCs w:val="false"/>
-                <w:sz w:val="18"/>
-                <w:szCs w:val="18"/>
-              </w:rPr>
-              <w:t xml:space="preserve">June 2026 (completed); post-defense revisions in progress</w:t>
-            </w:r>
-          </w:p>
-        </w:tc>
-      </w:tr>
-      <w:tr>
-        <w:trPr>
-          <w:tblHeader w:val="false"/>
-        </w:trPr>
-        <w:tc>
-          <w:tcPr>
-            <w:tcW w:type="dxa" w:w="3200"/>
-            <w:tcBorders>
-              <w:top w:val="single" w:color="A0A0A0" w:sz="4"/>
-              <w:left w:val="single" w:color="A0A0A0" w:sz="4"/>
-              <w:bottom w:val="single" w:color="A0A0A0" w:sz="4"/>
-              <w:right w:val="single" w:color="A0A0A0" w:sz="4"/>
-            </w:tcBorders>
-            <w:tcMar>
-              <w:top w:type="dxa" w:w="60"/>
-              <w:left w:type="dxa" w:w="100"/>
-              <w:bottom w:type="dxa" w:w="60"/>
-              <w:right w:type="dxa" w:w="100"/>
-            </w:tcMar>
-          </w:tcPr>
-          <w:p>
-            <w:r>
-              <w:rPr>
-                <w:rFonts w:ascii="Calibri" w:cs="Calibri" w:eastAsia="Calibri" w:hAnsi="Calibri"/>
-                <w:b w:val="false"/>
-                <w:bCs w:val="false"/>
-                <w:sz w:val="18"/>
-                <w:szCs w:val="18"/>
-              </w:rPr>
-              <w:t xml:space="preserve">Supervisor</w:t>
-            </w:r>
-          </w:p>
-        </w:tc>
-        <w:tc>
-          <w:tcPr>
-            <w:tcW w:type="dxa" w:w="5826"/>
-            <w:tcBorders>
-              <w:top w:val="single" w:color="A0A0A0" w:sz="4"/>
-              <w:left w:val="single" w:color="A0A0A0" w:sz="4"/>
-              <w:bottom w:val="single" w:color="A0A0A0" w:sz="4"/>
-              <w:right w:val="single" w:color="A0A0A0" w:sz="4"/>
-            </w:tcBorders>
-            <w:tcMar>
-              <w:top w:type="dxa" w:w="60"/>
-              <w:left w:type="dxa" w:w="100"/>
-              <w:bottom w:type="dxa" w:w="60"/>
-              <w:right w:type="dxa" w:w="100"/>
-            </w:tcMar>
-          </w:tcPr>
-          <w:p>
-            <w:r>
-              <w:rPr>
-                <w:rFonts w:ascii="Calibri" w:cs="Calibri" w:eastAsia="Calibri" w:hAnsi="Calibri"/>
-                <w:b w:val="false"/>
-                <w:bCs w:val="false"/>
-                <w:sz w:val="18"/>
-                <w:szCs w:val="18"/>
-              </w:rPr>
-              <w:t xml:space="preserve">Prof. Vedat Akgiray</w:t>
-            </w:r>
-          </w:p>
-        </w:tc>
-      </w:tr>
-      <w:tr>
-        <w:trPr>
-          <w:tblHeader w:val="false"/>
-        </w:trPr>
-        <w:tc>
-          <w:tcPr>
-            <w:tcW w:type="dxa" w:w="3200"/>
-            <w:tcBorders>
-              <w:top w:val="single" w:color="A0A0A0" w:sz="4"/>
-              <w:left w:val="single" w:color="A0A0A0" w:sz="4"/>
-              <w:bottom w:val="single" w:color="A0A0A0" w:sz="4"/>
-              <w:right w:val="single" w:color="A0A0A0" w:sz="4"/>
-            </w:tcBorders>
-            <w:tcMar>
-              <w:top w:type="dxa" w:w="60"/>
-              <w:left w:type="dxa" w:w="100"/>
-              <w:bottom w:type="dxa" w:w="60"/>
-              <w:right w:type="dxa" w:w="100"/>
-            </w:tcMar>
-          </w:tcPr>
-          <w:p>
-            <w:r>
-              <w:rPr>
-                <w:rFonts w:ascii="Calibri" w:cs="Calibri" w:eastAsia="Calibri" w:hAnsi="Calibri"/>
-                <w:b w:val="false"/>
-                <w:bCs w:val="false"/>
-                <w:sz w:val="18"/>
-                <w:szCs w:val="18"/>
-              </w:rPr>
-              <w:t xml:space="preserve">Jury (SBE order)</w:t>
-            </w:r>
-          </w:p>
-        </w:tc>
-        <w:tc>
-          <w:tcPr>
-            <w:tcW w:type="dxa" w:w="5826"/>
-            <w:tcBorders>
-              <w:top w:val="single" w:color="A0A0A0" w:sz="4"/>
-              <w:left w:val="single" w:color="A0A0A0" w:sz="4"/>
-              <w:bottom w:val="single" w:color="A0A0A0" w:sz="4"/>
-              <w:right w:val="single" w:color="A0A0A0" w:sz="4"/>
-            </w:tcBorders>
-            <w:tcMar>
-              <w:top w:type="dxa" w:w="60"/>
-              <w:left w:type="dxa" w:w="100"/>
-              <w:bottom w:type="dxa" w:w="60"/>
-              <w:right w:type="dxa" w:w="100"/>
-            </w:tcMar>
-          </w:tcPr>
-          <w:p>
-            <w:r>
-              <w:rPr>
-                <w:rFonts w:ascii="Calibri" w:cs="Calibri" w:eastAsia="Calibri" w:hAnsi="Calibri"/>
-                <w:b w:val="false"/>
-                <w:bCs w:val="false"/>
-                <w:sz w:val="18"/>
-                <w:szCs w:val="18"/>
-              </w:rPr>
-              <w:t xml:space="preserve">Akgiray / Coşkun / Karahan / Ahi / Özsöylev</w:t>
-            </w:r>
-          </w:p>
-        </w:tc>
-      </w:tr>
-      <w:tr>
-        <w:trPr>
-          <w:tblHeader w:val="false"/>
-        </w:trPr>
-        <w:tc>
-          <w:tcPr>
-            <w:tcW w:type="dxa" w:w="3200"/>
-            <w:tcBorders>
-              <w:top w:val="single" w:color="A0A0A0" w:sz="4"/>
-              <w:left w:val="single" w:color="A0A0A0" w:sz="4"/>
-              <w:bottom w:val="single" w:color="A0A0A0" w:sz="4"/>
-              <w:right w:val="single" w:color="A0A0A0" w:sz="4"/>
-            </w:tcBorders>
-            <w:tcMar>
-              <w:top w:type="dxa" w:w="60"/>
-              <w:left w:type="dxa" w:w="100"/>
-              <w:bottom w:type="dxa" w:w="60"/>
-              <w:right w:type="dxa" w:w="100"/>
-            </w:tcMar>
-          </w:tcPr>
-          <w:p>
-            <w:r>
-              <w:rPr>
-                <w:rFonts w:ascii="Calibri" w:cs="Calibri" w:eastAsia="Calibri" w:hAnsi="Calibri"/>
-                <w:b w:val="false"/>
-                <w:bCs w:val="false"/>
-                <w:sz w:val="18"/>
-                <w:szCs w:val="18"/>
-              </w:rPr>
-              <w:t xml:space="preserve">PC path</w:t>
-            </w:r>
-          </w:p>
-        </w:tc>
-        <w:tc>
-          <w:tcPr>
-            <w:tcW w:type="dxa" w:w="5826"/>
-            <w:tcBorders>
-              <w:top w:val="single" w:color="A0A0A0" w:sz="4"/>
-              <w:left w:val="single" w:color="A0A0A0" w:sz="4"/>
-              <w:bottom w:val="single" w:color="A0A0A0" w:sz="4"/>
-              <w:right w:val="single" w:color="A0A0A0" w:sz="4"/>
-            </w:tcBorders>
-            <w:tcMar>
-              <w:top w:type="dxa" w:w="60"/>
-              <w:left w:type="dxa" w:w="100"/>
-              <w:bottom w:type="dxa" w:w="60"/>
-              <w:right w:type="dxa" w:w="100"/>
-            </w:tcMar>
-          </w:tcPr>
-          <w:p>
-            <w:r>
-              <w:rPr>
-                <w:rFonts w:ascii="Calibri" w:cs="Calibri" w:eastAsia="Calibri" w:hAnsi="Calibri"/>
-                <w:b w:val="false"/>
-                <w:bCs w:val="false"/>
-                <w:sz w:val="18"/>
-                <w:szCs w:val="18"/>
-              </w:rPr>
-              <w:t xml:space="preserve">D:\TEZ\ (root), D:\TEZ\R scripts\, D:\TEZ\tables\</w:t>
-            </w:r>
-          </w:p>
-        </w:tc>
-      </w:tr>
-      <w:tr>
-        <w:trPr>
-          <w:tblHeader w:val="false"/>
-        </w:trPr>
-        <w:tc>
-          <w:tcPr>
-            <w:tcW w:type="dxa" w:w="3200"/>
-            <w:tcBorders>
-              <w:top w:val="single" w:color="A0A0A0" w:sz="4"/>
-              <w:left w:val="single" w:color="A0A0A0" w:sz="4"/>
-              <w:bottom w:val="single" w:color="A0A0A0" w:sz="4"/>
-              <w:right w:val="single" w:color="A0A0A0" w:sz="4"/>
-            </w:tcBorders>
-            <w:tcMar>
-              <w:top w:type="dxa" w:w="60"/>
-              <w:left w:type="dxa" w:w="100"/>
-              <w:bottom w:type="dxa" w:w="60"/>
-              <w:right w:type="dxa" w:w="100"/>
-            </w:tcMar>
-          </w:tcPr>
-          <w:p>
-            <w:r>
-              <w:rPr>
-                <w:rFonts w:ascii="Calibri" w:cs="Calibri" w:eastAsia="Calibri" w:hAnsi="Calibri"/>
-                <w:b w:val="false"/>
-                <w:bCs w:val="false"/>
-                <w:sz w:val="18"/>
-                <w:szCs w:val="18"/>
-              </w:rPr>
-              <w:t xml:space="preserve">Repo</w:t>
-            </w:r>
-          </w:p>
-        </w:tc>
-        <w:tc>
-          <w:tcPr>
-            <w:tcW w:type="dxa" w:w="5826"/>
-            <w:tcBorders>
-              <w:top w:val="single" w:color="A0A0A0" w:sz="4"/>
-              <w:left w:val="single" w:color="A0A0A0" w:sz="4"/>
-              <w:bottom w:val="single" w:color="A0A0A0" w:sz="4"/>
-              <w:right w:val="single" w:color="A0A0A0" w:sz="4"/>
-            </w:tcBorders>
-            <w:tcMar>
-              <w:top w:type="dxa" w:w="60"/>
-              <w:left w:type="dxa" w:w="100"/>
-              <w:bottom w:type="dxa" w:w="60"/>
-              <w:right w:type="dxa" w:w="100"/>
-            </w:tcMar>
-          </w:tcPr>
-          <w:p>
-            <w:r>
-              <w:rPr>
-                <w:rFonts w:ascii="Calibri" w:cs="Calibri" w:eastAsia="Calibri" w:hAnsi="Calibri"/>
-                <w:b w:val="false"/>
-                <w:bCs w:val="false"/>
-                <w:sz w:val="18"/>
-                <w:szCs w:val="18"/>
-              </w:rPr>
-              <w:t xml:space="preserve">github.com/omeren83/Active-Management-Puzzle (private)</w:t>
-            </w:r>
-          </w:p>
-        </w:tc>
-      </w:tr>
-      <w:tr>
-        <w:trPr>
-          <w:tblHeader w:val="false"/>
-        </w:trPr>
-        <w:tc>
-          <w:tcPr>
-            <w:tcW w:type="dxa" w:w="3200"/>
-            <w:tcBorders>
-              <w:top w:val="single" w:color="A0A0A0" w:sz="4"/>
-              <w:left w:val="single" w:color="A0A0A0" w:sz="4"/>
-              <w:bottom w:val="single" w:color="A0A0A0" w:sz="4"/>
-              <w:right w:val="single" w:color="A0A0A0" w:sz="4"/>
-            </w:tcBorders>
-            <w:tcMar>
-              <w:top w:type="dxa" w:w="60"/>
-              <w:left w:type="dxa" w:w="100"/>
-              <w:bottom w:type="dxa" w:w="60"/>
-              <w:right w:type="dxa" w:w="100"/>
-            </w:tcMar>
-          </w:tcPr>
-          <w:p>
-            <w:r>
-              <w:rPr>
-                <w:rFonts w:ascii="Calibri" w:cs="Calibri" w:eastAsia="Calibri" w:hAnsi="Calibri"/>
-                <w:b w:val="false"/>
-                <w:bCs w:val="false"/>
-                <w:sz w:val="18"/>
-                <w:szCs w:val="18"/>
-              </w:rPr>
-              <w:t xml:space="preserve">R version</w:t>
-            </w:r>
-          </w:p>
-        </w:tc>
-        <w:tc>
-          <w:tcPr>
-            <w:tcW w:type="dxa" w:w="5826"/>
-            <w:tcBorders>
-              <w:top w:val="single" w:color="A0A0A0" w:sz="4"/>
-              <w:left w:val="single" w:color="A0A0A0" w:sz="4"/>
-              <w:bottom w:val="single" w:color="A0A0A0" w:sz="4"/>
-              <w:right w:val="single" w:color="A0A0A0" w:sz="4"/>
-            </w:tcBorders>
-            <w:tcMar>
-              <w:top w:type="dxa" w:w="60"/>
-              <w:left w:type="dxa" w:w="100"/>
-              <w:bottom w:type="dxa" w:w="60"/>
-              <w:right w:type="dxa" w:w="100"/>
-            </w:tcMar>
-          </w:tcPr>
-          <w:p>
-            <w:r>
-              <w:rPr>
-                <w:rFonts w:ascii="Calibri" w:cs="Calibri" w:eastAsia="Calibri" w:hAnsi="Calibri"/>
-                <w:b w:val="false"/>
-                <w:bCs w:val="false"/>
-                <w:sz w:val="18"/>
-                <w:szCs w:val="18"/>
-              </w:rPr>
-              <w:t xml:space="preserve">4.4.3 (binary CRAN installs broken; use type='source'; fixest built from GitHub)</w:t>
+              <w:t xml:space="preserve">4.4.3 (use type='source'; fixest from GitHub)</w:t>
             </w:r>
           </w:p>
         </w:tc>

</xml_diff>

<commit_message>
Uncertainty control for H3 and PPF (Table J.14), text qualifications updated
</commit_message>
<xml_diff>
--- a/dissertation_master_log.docx
+++ b/dissertation_master_log.docx
@@ -12286,7 +12286,25 @@
           <w:sz w:val="20"/>
           <w:szCs w:val="20"/>
         </w:rPr>
-        <w:t xml:space="preserve">Reading: the BW “sentiment flattens” finding is not separable from a rational uncertainty channel; the AAII winner-chasing (contemporaneous only) and the margin-debt steepening survive. The H3 / PPF high-sentiment amplification (which conditions on D_SENT) was not re-estimated with uncertainty — stated as a limitation.</w:t>
+        <w:t xml:space="preserve">Reading: the BW “sentiment flattens” finding is not separable from a rational uncertainty channel; the AAII winner-chasing (contemporaneous only) and the margin-debt steepening survive.</w:t>
+      </w:r>
+    </w:p>
+    <w:p>
+      <w:pPr>
+        <w:pStyle w:val="ListParagraph"/>
+        <w:numPr>
+          <w:ilvl w:val="0"/>
+          <w:numId w:val="2"/>
+        </w:numPr>
+        <w:spacing w:after="60"/>
+      </w:pPr>
+      <w:r>
+        <w:rPr>
+          <w:rFonts w:ascii="Calibri" w:cs="Calibri" w:eastAsia="Calibri" w:hAnsi="Calibri"/>
+          <w:sz w:val="20"/>
+          <w:szCs w:val="20"/>
+        </w:rPr>
+        <w:t xml:space="preserve">H3 / PPF extension (uncertainty_robustness.R v1.2, Part 2; added after the H1/H2 results were known — disclosed in the text). Run on the PC panel_reg.rds (H3 sample 261,337 reproduced exactly). MAX12 amplification z 1.91 (.028) → 1.84 (.033); joint χ²(2) .033 → .064; MAX12×D_UNC z 0.13 alone. PPF R_MID Diff −0.122 (.011) → −0.138 (.026), 3 / 36 → 7 / 45 bp; all three segments p &lt; .03; uncertainty contrast +0.033 (p .748). Same at h = 3, 12. New table_unc_H3.tex (Table J.14). The lottery channel is sentiment-specific, not uncertainty.</w:t>
       </w:r>
     </w:p>
     <w:p>
@@ -12416,7 +12434,7 @@
         <w:rPr>
           <w:rFonts w:ascii="Calibri" w:cs="Calibri" w:eastAsia="Calibri" w:hAnsi="Calibri"/>
         </w:rPr>
-        <w:t xml:space="preserve">§4. dissertation_main.tex (6,192 → 6,444 lines; 239 pp in the container build)</w:t>
+        <w:t xml:space="preserve">§4. dissertation_main.tex (6,192 → 6,487 lines; 242 pp in the container build)</w:t>
       </w:r>
     </w:p>
     <w:p>
@@ -12452,7 +12470,7 @@
           <w:sz w:val="20"/>
           <w:szCs w:val="20"/>
         </w:rPr>
-        <w:t xml:space="preserve">New Section 5.7 “Sentiment or uncertainty?” (Table 5.7) and Appendix J.4 “Macroeconomic uncertainty” (Tables J.10–J.13); JLN paragraph in Section 3.11; D_UNC in the symbol list.</w:t>
+        <w:t xml:space="preserve">New Section 5.7 “Sentiment or uncertainty?” (Table 5.7, H1–H3 and PPF) and Appendix J.4 “Macroeconomic uncertainty” (Tables J.10–J.14); JLN paragraph in Section 3.11; D_UNC in the symbol list.</w:t>
       </w:r>
     </w:p>
     <w:p>
@@ -12572,24 +12590,6 @@
           <w:szCs w:val="20"/>
         </w:rPr>
         <w:t xml:space="preserve">Commit and Overleaf pull (commands given in chat).</w:t>
-      </w:r>
-    </w:p>
-    <w:p>
-      <w:pPr>
-        <w:pStyle w:val="ListParagraph"/>
-        <w:numPr>
-          <w:ilvl w:val="0"/>
-          <w:numId w:val="2"/>
-        </w:numPr>
-        <w:spacing w:after="60"/>
-      </w:pPr>
-      <w:r>
-        <w:rPr>
-          <w:rFonts w:ascii="Calibri" w:cs="Calibri" w:eastAsia="Calibri" w:hAnsi="Calibri"/>
-          <w:sz w:val="20"/>
-          <w:szCs w:val="20"/>
-        </w:rPr>
-        <w:t xml:space="preserve">Optional: re-estimate H3 / PPF high-sentiment amplification with the uncertainty control (currently a stated limitation).</w:t>
       </w:r>
     </w:p>
     <w:p>
@@ -14234,7 +14234,7 @@
                 <w:sz w:val="18"/>
                 <w:szCs w:val="18"/>
               </w:rPr>
-              <w:t xml:space="preserve">D_SENT .055 → .177; SENT⊥ .009 → .056; AAII .005 → .005; MD &lt;.001 → .002</w:t>
+              <w:t xml:space="preserve">D_SENT .055 → .177; SENT⊥ .009 → .056; AAII .005 → .005; MD &lt;.001 → .002; H3 MAX12 amp z 1.91 → 1.84; PPF Diff p .011 → .026</w:t>
             </w:r>
           </w:p>
         </w:tc>
@@ -14423,7 +14423,7 @@
                 <w:sz w:val="18"/>
                 <w:szCs w:val="18"/>
               </w:rPr>
-              <w:t xml:space="preserve">data_import v1.6; flow v1.3; panel_regressions_setup v1.6; behavioral_state_variables v1.3; persistence v1.4; activeness_persistence v1.3; psychological_premium v1.4; structural_break v1.4; panel_regressions_reporting v1.2; uncertainty_robustness v1.1; master_pipeline v1.7</w:t>
+              <w:t xml:space="preserve">data_import v1.6; flow v1.3; panel_regressions_setup v1.6; behavioral_state_variables v1.3; persistence v1.4; activeness_persistence v1.3; psychological_premium v1.4; structural_break v1.4; panel_regressions_reporting v1.2; uncertainty_robustness v1.2; master_pipeline v1.7</w:t>
             </w:r>
           </w:p>
         </w:tc>

</xml_diff>

<commit_message>
Proofreading fixes; benchmark table from actual LSEG series; counts; MOJAX/GENDX reclassified active (data_import v1.7)
</commit_message>
<xml_diff>
--- a/dissertation_master_log.docx
+++ b/dissertation_master_log.docx
@@ -12571,7 +12571,90 @@
         <w:rPr>
           <w:rFonts w:ascii="Calibri" w:cs="Calibri" w:eastAsia="Calibri" w:hAnsi="Calibri"/>
         </w:rPr>
-        <w:t xml:space="preserve">§5. Outstanding at session close (14 October 2026)</w:t>
+        <w:t xml:space="preserve">§5. Proofreading scan of the compiled Dissertation 8.0 (242 pp)</w:t>
+      </w:r>
+    </w:p>
+    <w:p>
+      <w:pPr>
+        <w:pStyle w:val="ListParagraph"/>
+        <w:numPr>
+          <w:ilvl w:val="0"/>
+          <w:numId w:val="2"/>
+        </w:numPr>
+        <w:spacing w:after="60"/>
+      </w:pPr>
+      <w:r>
+        <w:rPr>
+          <w:rFonts w:ascii="Calibri" w:cs="Calibri" w:eastAsia="Calibri" w:hAnsi="Calibri"/>
+          <w:sz w:val="20"/>
+          <w:szCs w:val="20"/>
+        </w:rPr>
+        <w:t xml:space="preserve">Three parallel read-throughs against the tables plus a page-by-page layout check. Layout clean; no broken references.</w:t>
+      </w:r>
+    </w:p>
+    <w:p>
+      <w:pPr>
+        <w:pStyle w:val="ListParagraph"/>
+        <w:numPr>
+          <w:ilvl w:val="0"/>
+          <w:numId w:val="2"/>
+        </w:numPr>
+        <w:spacing w:after="60"/>
+      </w:pPr>
+      <w:r>
+        <w:rPr>
+          <w:rFonts w:ascii="Calibri" w:cs="Calibri" w:eastAsia="Calibri" w:hAnsi="Calibri"/>
+          <w:sz w:val="20"/>
+          <w:szCs w:val="20"/>
+        </w:rPr>
+        <w:t xml:space="preserve">Fixed in the text: Barras–Gagliardini–Scaillet (2022) misdescribed (nonparametric, skill positive for 83.1% of funds, 62.9% negative net alpha, little time variation — verified in the PDF); FauschTangScheek2025 replaced by the real paper (Fausch, Frigg, Johann, Mussbach, Westheide &amp; Drobetz 2025, SSRN 5937794); DeMiguel et al. (2023) fourth author Santos (duplicate bib entry removed); rolling-alpha window rule (36 calendar months, ≥24 obs, as coded); H4 fee example −0.0042 → −0.0045; BW robustness to FE (only SENT⊥); K.5 defense-draft behavioral rows explained (March 2026 vintage); EW/VW gap and monotonicity/TE claims qualified; bottom tercile → quintile; Eq. 3.11 text; cross-references (4.2–4.5, 4.3/4.4, Step 6); counts (261,337; 307,610; 303,471 note); Appendix A "gross index"; Appendix B 105 NA funds (verified: none in panel_reg); BIC wording; stale "no longer/now" wording; Özet citations (ve / vd.).</w:t>
+      </w:r>
+    </w:p>
+    <w:p>
+      <w:pPr>
+        <w:pStyle w:val="ListParagraph"/>
+        <w:numPr>
+          <w:ilvl w:val="0"/>
+          <w:numId w:val="2"/>
+        </w:numPr>
+        <w:spacing w:after="60"/>
+      </w:pPr>
+      <w:r>
+        <w:rPr>
+          <w:rFonts w:ascii="Calibri" w:cs="Calibri" w:eastAsia="Calibri" w:hAnsi="Calibri"/>
+          <w:sz w:val="20"/>
+          <w:szCs w:val="20"/>
+        </w:rPr>
+        <w:t xml:space="preserve">Fixed in R scripts + tables (no rerun needed): H2 note garble; η/λ/δ_LOW notation in H4 and summary tables; "yearmo" → year-month in all H-table captions/notes; Step 8b → Appendix A Step 6; "now including" wording.</w:t>
+      </w:r>
+    </w:p>
+    <w:p>
+      <w:pPr>
+        <w:pStyle w:val="ListParagraph"/>
+        <w:numPr>
+          <w:ilvl w:val="0"/>
+          <w:numId w:val="2"/>
+        </w:numPr>
+        <w:spacing w:after="60"/>
+      </w:pPr>
+      <w:r>
+        <w:rPr>
+          <w:rFonts w:ascii="Calibri" w:cs="Calibri" w:eastAsia="Calibri" w:hAnsi="Calibri"/>
+          <w:sz w:val="20"/>
+          <w:szCs w:val="20"/>
+        </w:rPr>
+        <w:t xml:space="preserve">Bib: capitalisation protected (A New Measure, New Evidence, Morningstar, An Experiment, The Role, China); ICI editions harmonised; Sushko &amp; Turner note removed.</w:t>
+      </w:r>
+    </w:p>
+    <w:p>
+      <w:pPr>
+        <w:pStyle w:val="Heading2"/>
+      </w:pPr>
+      <w:r>
+        <w:rPr>
+          <w:rFonts w:ascii="Calibri" w:cs="Calibri" w:eastAsia="Calibri" w:hAnsi="Calibri"/>
+        </w:rPr>
+        <w:t xml:space="preserve">§6. Outstanding at session close (14 October 2026)</w:t>
       </w:r>
     </w:p>
     <w:p>
@@ -12607,6 +12690,24 @@
           <w:sz w:val="20"/>
           <w:szCs w:val="20"/>
         </w:rPr>
+        <w:t xml:space="preserve">Needs Ömer: CV, Acknowledgments and Dedication placeholders; title article ("of the Active Management Puzzle"); 3,769 vs 3,764 initial count; Exclude-from-Perf-Comparison 288 vs 131+165−2; 3,733 − 68 vs 3,667; Russell Midcap / 2000 Value RIC codes (C.1 vs C.5); FBIOX prior benchmark (Capital Goods?).</w:t>
+      </w:r>
+    </w:p>
+    <w:p>
+      <w:pPr>
+        <w:pStyle w:val="ListParagraph"/>
+        <w:numPr>
+          <w:ilvl w:val="0"/>
+          <w:numId w:val="2"/>
+        </w:numPr>
+        <w:spacing w:after="60"/>
+      </w:pPr>
+      <w:r>
+        <w:rPr>
+          <w:rFonts w:ascii="Calibri" w:cs="Calibri" w:eastAsia="Calibri" w:hAnsi="Calibri"/>
+          <w:sz w:val="20"/>
+          <w:szCs w:val="20"/>
+        </w:rPr>
         <w:t xml:space="preserve">SENT⊥ October 2025 gap (LSEG): H1–H4 end Sep 2025.</w:t>
       </w:r>
     </w:p>
@@ -12625,7 +12726,7 @@
           <w:sz w:val="20"/>
           <w:szCs w:val="20"/>
         </w:rPr>
-        <w:t xml:space="preserve">AAII verification table; BGS (2022) “14% skilled” and Fausch et al. sentences unverified; MOJAX / GENDX text says excluded, code passes them through — reconcile.</w:t>
+        <w:t xml:space="preserve">AAII verification table; MOJAX / GENDX text says excluded, code passes them through — reconcile.</w:t>
       </w:r>
     </w:p>
     <w:p>
@@ -12644,24 +12745,6 @@
           <w:szCs w:val="20"/>
         </w:rPr>
         <w:t xml:space="preserve">Abstract rendered length likely &gt; 250 words once citations are expanded (pre-existing) — check against SBE.</w:t>
-      </w:r>
-    </w:p>
-    <w:p>
-      <w:pPr>
-        <w:pStyle w:val="ListParagraph"/>
-        <w:numPr>
-          <w:ilvl w:val="0"/>
-          <w:numId w:val="2"/>
-        </w:numPr>
-        <w:spacing w:after="60"/>
-      </w:pPr>
-      <w:r>
-        <w:rPr>
-          <w:rFonts w:ascii="Calibri" w:cs="Calibri" w:eastAsia="Calibri" w:hAnsi="Calibri"/>
-          <w:sz w:val="20"/>
-          <w:szCs w:val="20"/>
-        </w:rPr>
-        <w:t xml:space="preserve">Limitations text says the tracking-error sort “shows no gradient”; VW gross/net TE gradient is negative — consider rewording.</w:t>
       </w:r>
     </w:p>
     <w:p>

</xml_diff>

<commit_message>
Rerun with MOJAX/GENDX active: text numbers, Appendix K diagnostics, master log
</commit_message>
<xml_diff>
--- a/dissertation_master_log.docx
+++ b/dissertation_master_log.docx
@@ -12654,7 +12654,144 @@
         <w:rPr>
           <w:rFonts w:ascii="Calibri" w:cs="Calibri" w:eastAsia="Calibri" w:hAnsi="Calibri"/>
         </w:rPr>
-        <w:t xml:space="preserve">§6. Outstanding at session close (14 October 2026)</w:t>
+        <w:t xml:space="preserve">§6. 15 October: items 3–7 of the scan and rerun</w:t>
+      </w:r>
+    </w:p>
+    <w:p>
+      <w:pPr>
+        <w:pStyle w:val="ListParagraph"/>
+        <w:numPr>
+          <w:ilvl w:val="0"/>
+          <w:numId w:val="2"/>
+        </w:numPr>
+        <w:spacing w:after="60"/>
+      </w:pPr>
+      <w:r>
+        <w:rPr>
+          <w:rFonts w:ascii="Calibri" w:cs="Calibri" w:eastAsia="Calibri" w:hAnsi="Calibri"/>
+          <w:sz w:val="20"/>
+          <w:szCs w:val="20"/>
+        </w:rPr>
+        <w:t xml:space="preserve">3,769 → 3,764 (Bloomberg FUND_LIST has 3,764: 2,329 Y / 333 N / 1,102 Unknown).</w:t>
+      </w:r>
+    </w:p>
+    <w:p>
+      <w:pPr>
+        <w:pStyle w:val="ListParagraph"/>
+        <w:numPr>
+          <w:ilvl w:val="0"/>
+          <w:numId w:val="2"/>
+        </w:numPr>
+        <w:spacing w:after="60"/>
+      </w:pPr>
+      <w:r>
+        <w:rPr>
+          <w:rFonts w:ascii="Calibri" w:cs="Calibri" w:eastAsia="Calibri" w:hAnsi="Calibri"/>
+          <w:sz w:val="20"/>
+          <w:szCs w:val="20"/>
+        </w:rPr>
+        <w:t xml:space="preserve">Counts: 288 performance-comparison exclusions = 123 of the 131 Entire-Analysis funds (all but 6 NONSTANDARD_EXPENSE + 2 DATA_ERROR) + 165 SECTOR_FUND. Data-error funds are removed with the Entire-Analysis exclusions, not at Step 3: 3,764 → 3,735 → 3,667 (−68 leveraged) → 3,552 (−115).</w:t>
+      </w:r>
+    </w:p>
+    <w:p>
+      <w:pPr>
+        <w:pStyle w:val="ListParagraph"/>
+        <w:numPr>
+          <w:ilvl w:val="0"/>
+          <w:numId w:val="2"/>
+        </w:numPr>
+        <w:spacing w:after="60"/>
+      </w:pPr>
+      <w:r>
+        <w:rPr>
+          <w:rFonts w:ascii="Calibri" w:cs="Calibri" w:eastAsia="Calibri" w:hAnsi="Calibri"/>
+          <w:sz w:val="20"/>
+          <w:szCs w:val="20"/>
+        </w:rPr>
+        <w:t xml:space="preserve">Appendix C RIC tables replaced by one table of the 24 LSEG series actually pulled (codes from benchmark list and returns.xlsx, LSEG sheet; 3,708 funds). The 56 funds without a series are not in the activeness sample (35 active all flagged, 21 passive). MSCI series are the uncapped MSCI U.S. IMI sector indices (5 sectors); “25/50” kept only for the benchmarks the Fidelity Select funds declare. FBIOX “from Capital Goods” clause removed.</w:t>
+      </w:r>
+    </w:p>
+    <w:p>
+      <w:pPr>
+        <w:pStyle w:val="ListParagraph"/>
+        <w:numPr>
+          <w:ilvl w:val="0"/>
+          <w:numId w:val="2"/>
+        </w:numPr>
+        <w:spacing w:after="60"/>
+      </w:pPr>
+      <w:r>
+        <w:rPr>
+          <w:rFonts w:ascii="Calibri" w:cs="Calibri" w:eastAsia="Calibri" w:hAnsi="Calibri"/>
+          <w:sz w:val="20"/>
+          <w:szCs w:val="20"/>
+        </w:rPr>
+        <w:t xml:space="preserve">MOJAX and GENDX (Bloomberg N, not index trackers) reclassified Active via ACTIVE_OVERRIDE in data_import_and_cleaning.R v1.7. GENDX not excluded as long/short: 2017 SEC filing describes long-only S&amp;P 500 positions and Bloomberg strategy is Blend.</w:t>
+      </w:r>
+    </w:p>
+    <w:p>
+      <w:pPr>
+        <w:pStyle w:val="ListParagraph"/>
+        <w:numPr>
+          <w:ilvl w:val="0"/>
+          <w:numId w:val="2"/>
+        </w:numPr>
+        <w:spacing w:after="60"/>
+      </w:pPr>
+      <w:r>
+        <w:rPr>
+          <w:rFonts w:ascii="Calibri" w:cs="Calibri" w:eastAsia="Calibri" w:hAnsi="Calibri"/>
+          <w:sz w:val="20"/>
+          <w:szCs w:val="20"/>
+        </w:rPr>
+        <w:t xml:space="preserve">Full rerun 15 Oct (49.6 min, all OK). Changes at the third decimal: active funds 1,960 → 1,962, BSW 1,813, passive 266 → 264; EW net −0.809 (t −1.71); EW–VW net gap 15 bp; H1 joint p 0.055/0.009/0.005; H2 17.31; H3 MAX12 6.86 (0.032), z 1.91; H4 p 0.416–0.566; PPF 2.172% → 271 bp, 3/36 bp, Diff p 0.011; uncertainty D_SENT 0.056 → 0.178, SENT⊥ 0.009 → 0.057. One claim changed: P3 passive EW gross −0.57% now significant at 5%.</w:t>
+      </w:r>
+    </w:p>
+    <w:p>
+      <w:pPr>
+        <w:pStyle w:val="ListParagraph"/>
+        <w:numPr>
+          <w:ilvl w:val="0"/>
+          <w:numId w:val="2"/>
+        </w:numPr>
+        <w:spacing w:after="60"/>
+      </w:pPr>
+      <w:r>
+        <w:rPr>
+          <w:rFonts w:ascii="Calibri" w:cs="Calibri" w:eastAsia="Calibri" w:hAnsi="Calibri"/>
+          <w:sz w:val="20"/>
+          <w:szCs w:val="20"/>
+        </w:rPr>
+        <w:t xml:space="preserve">Appendix K diagnostics recomputed in the container from the PC data: TD 223 passive funds, LAD slope −1.04 (0.18), gross −0.04 (0.18); K.2 baseline/per-month net EW −0.809.</w:t>
+      </w:r>
+    </w:p>
+    <w:p>
+      <w:pPr>
+        <w:pStyle w:val="ListParagraph"/>
+        <w:numPr>
+          <w:ilvl w:val="0"/>
+          <w:numId w:val="2"/>
+        </w:numPr>
+        <w:spacing w:after="60"/>
+      </w:pPr>
+      <w:r>
+        <w:rPr>
+          <w:rFonts w:ascii="Calibri" w:cs="Calibri" w:eastAsia="Calibri" w:hAnsi="Calibri"/>
+          <w:sz w:val="20"/>
+          <w:szCs w:val="20"/>
+        </w:rPr>
+        <w:t xml:space="preserve">About 140 number replacements across the text (three parallel read-throughs against cell-level table diffs), compile clean.</w:t>
+      </w:r>
+    </w:p>
+    <w:p>
+      <w:pPr>
+        <w:pStyle w:val="Heading2"/>
+      </w:pPr>
+      <w:r>
+        <w:rPr>
+          <w:rFonts w:ascii="Calibri" w:cs="Calibri" w:eastAsia="Calibri" w:hAnsi="Calibri"/>
+        </w:rPr>
+        <w:t xml:space="preserve">§7. Outstanding at session close (15 October 2026)</w:t>
       </w:r>
     </w:p>
     <w:p>
@@ -12690,7 +12827,7 @@
           <w:sz w:val="20"/>
           <w:szCs w:val="20"/>
         </w:rPr>
-        <w:t xml:space="preserve">Needs Ömer: CV, Acknowledgments and Dedication placeholders; title article ("of the Active Management Puzzle"); 3,769 vs 3,764 initial count; Exclude-from-Perf-Comparison 288 vs 131+165−2; 3,733 − 68 vs 3,667; Russell Midcap / 2000 Value RIC codes (C.1 vs C.5); FBIOX prior benchmark (Capital Goods?).</w:t>
+        <w:t xml:space="preserve">Kept as is by Ömer: CV / Acknowledgments / Dedication placeholders; title article.</w:t>
       </w:r>
     </w:p>
     <w:p>
@@ -12726,7 +12863,7 @@
           <w:sz w:val="20"/>
           <w:szCs w:val="20"/>
         </w:rPr>
-        <w:t xml:space="preserve">AAII verification table; MOJAX / GENDX text says excluded, code passes them through — reconcile.</w:t>
+        <w:t xml:space="preserve">AAII verification table.</w:t>
       </w:r>
     </w:p>
     <w:p>
@@ -12789,7 +12926,7 @@
           <w:sz w:val="20"/>
           <w:szCs w:val="20"/>
         </w:rPr>
-        <w:t xml:space="preserve">Last updated: 14 October 2026 — post Batch 4 rerun and JLN uncertainty horse race.</w:t>
+        <w:t xml:space="preserve">Last updated: 15 October 2026 — post MOJAX/GENDX rerun and proofreading fixes.</w:t>
       </w:r>
     </w:p>
     <w:tbl>
@@ -13057,7 +13194,7 @@
                 <w:sz w:val="18"/>
                 <w:szCs w:val="18"/>
               </w:rPr>
-              <w:t xml:space="preserve">2,122 / 286 / 709</w:t>
+              <w:t xml:space="preserve">2,124 / 284 / 709</w:t>
             </w:r>
           </w:p>
         </w:tc>
@@ -13120,7 +13257,7 @@
                 <w:sz w:val="18"/>
                 <w:szCs w:val="18"/>
               </w:rPr>
-              <w:t xml:space="preserve">1,960; 1,812</w:t>
+              <w:t xml:space="preserve">1,962; 1,813</w:t>
             </w:r>
           </w:p>
         </w:tc>
@@ -13435,7 +13572,7 @@
                 <w:sz w:val="18"/>
                 <w:szCs w:val="18"/>
               </w:rPr>
-              <w:t xml:space="preserve">−0.810* (t −1.71) / −0.655 (t −1.62)</w:t>
+              <w:t xml:space="preserve">−0.809* (t −1.71) / −0.655 (t −1.62)</w:t>
             </w:r>
           </w:p>
         </w:tc>
@@ -14317,7 +14454,7 @@
                 <w:sz w:val="18"/>
                 <w:szCs w:val="18"/>
               </w:rPr>
-              <w:t xml:space="preserve">D_SENT .055 → .177; SENT⊥ .009 → .056; AAII .005 → .005; MD &lt;.001 → .002; H3 MAX12 amp z 1.91 → 1.84; PPF Diff p .011 → .026</w:t>
+              <w:t xml:space="preserve">D_SENT .056 → .178; SENT⊥ .009 → .057; AAII .005 → .005; MD &lt;.001 → .002; H3 MAX12 amp z 1.91 → 1.84; PPF Diff p .011 → .026</w:t>
             </w:r>
           </w:p>
         </w:tc>
@@ -14506,7 +14643,7 @@
                 <w:sz w:val="18"/>
                 <w:szCs w:val="18"/>
               </w:rPr>
-              <w:t xml:space="preserve">data_import v1.6; flow v1.3; panel_regressions_setup v1.6; behavioral_state_variables v1.3; persistence v1.4; activeness_persistence v1.3; psychological_premium v1.4; structural_break v1.4; panel_regressions_reporting v1.2; uncertainty_robustness v1.2; master_pipeline v1.7</w:t>
+              <w:t xml:space="preserve">data_import v1.7; flow v1.3; panel_regressions_setup v1.6; behavioral_state_variables v1.3; persistence v1.4; activeness_persistence v1.3; psychological_premium v1.4; structural_break v1.4; panel_regressions_reporting v1.2; uncertainty_robustness v1.2; master_pipeline v1.7</w:t>
             </w:r>
           </w:p>
         </w:tc>

</xml_diff>

<commit_message>
Abstracts trimmed; AAII table (K.1); master log; handoff for next session
</commit_message>
<xml_diff>
--- a/dissertation_master_log.docx
+++ b/dissertation_master_log.docx
@@ -12791,25 +12791,162 @@
         <w:rPr>
           <w:rFonts w:ascii="Calibri" w:cs="Calibri" w:eastAsia="Calibri" w:hAnsi="Calibri"/>
         </w:rPr>
-        <w:t xml:space="preserve">§7. Outstanding at session close (15 October 2026)</w:t>
-      </w:r>
-    </w:p>
-    <w:p>
-      <w:pPr>
-        <w:pStyle w:val="ListParagraph"/>
-        <w:numPr>
-          <w:ilvl w:val="0"/>
-          <w:numId w:val="2"/>
-        </w:numPr>
-        <w:spacing w:after="60"/>
-      </w:pPr>
-      <w:r>
-        <w:rPr>
-          <w:rFonts w:ascii="Calibri" w:cs="Calibri" w:eastAsia="Calibri" w:hAnsi="Calibri"/>
-          <w:sz w:val="20"/>
-          <w:szCs w:val="20"/>
-        </w:rPr>
-        <w:t xml:space="preserve">Commit and Overleaf pull (commands given in chat).</w:t>
+        <w:t xml:space="preserve">§7. 15 October (afternoon): abstracts, AAII table, defense suggestions</w:t>
+      </w:r>
+    </w:p>
+    <w:p>
+      <w:pPr>
+        <w:pStyle w:val="ListParagraph"/>
+        <w:numPr>
+          <w:ilvl w:val="0"/>
+          <w:numId w:val="2"/>
+        </w:numPr>
+        <w:spacing w:after="60"/>
+      </w:pPr>
+      <w:r>
+        <w:rPr>
+          <w:rFonts w:ascii="Calibri" w:cs="Calibri" w:eastAsia="Calibri" w:hAnsi="Calibri"/>
+          <w:sz w:val="20"/>
+          <w:szCs w:val="20"/>
+        </w:rPr>
+        <w:t xml:space="preserve">Abstracts trimmed by Ömer in Overleaf to ≤ 250 rendered words (EN 252 → ≤250, TR 256 → ≤250; “(one primary share class per fund)” and “domestic/yurt içi” dropped, uncertainty parenthesis shortened).</w:t>
+      </w:r>
+    </w:p>
+    <w:p>
+      <w:pPr>
+        <w:pStyle w:val="ListParagraph"/>
+        <w:numPr>
+          <w:ilvl w:val="0"/>
+          <w:numId w:val="2"/>
+        </w:numPr>
+        <w:spacing w:after="60"/>
+      </w:pPr>
+      <w:r>
+        <w:rPr>
+          <w:rFonts w:ascii="Calibri" w:cs="Calibri" w:eastAsia="Calibri" w:hAnsi="Calibri"/>
+          <w:sz w:val="20"/>
+          <w:szCs w:val="20"/>
+        </w:rPr>
+        <w:t xml:space="preserve">Appendix K.1: new Table K.1 (tab:k_aaii) — calendar-year Bloomberg index returns vs AAII published NAV returns, MTCBX/TEMTX/HSLAX 2021–2025; all 15 agree within 0.1 pp (TEMTX 2023 12.84 vs 12.9). Text “agree to rounding” → “within 0.1 percentage point”. Former K.1–K.5 renumbered K.2–K.6 (label-based refs).</w:t>
+      </w:r>
+    </w:p>
+    <w:p>
+      <w:pPr>
+        <w:pStyle w:val="ListParagraph"/>
+        <w:numPr>
+          <w:ilvl w:val="0"/>
+          <w:numId w:val="2"/>
+        </w:numPr>
+        <w:spacing w:after="60"/>
+      </w:pPr>
+      <w:r>
+        <w:rPr>
+          <w:rFonts w:ascii="Calibri" w:cs="Calibri" w:eastAsia="Calibri" w:hAnsi="Calibri"/>
+          <w:sz w:val="20"/>
+          <w:szCs w:val="20"/>
+        </w:rPr>
+        <w:t xml:space="preserve">October 2025 SENT⊥ gap: closed, no action (source-side: CPI not published during the shutdown; documented in Sections 3.11 and 5.1).</w:t>
+      </w:r>
+    </w:p>
+    <w:p>
+      <w:pPr>
+        <w:pStyle w:val="ListParagraph"/>
+        <w:numPr>
+          <w:ilvl w:val="0"/>
+          <w:numId w:val="2"/>
+        </w:numPr>
+        <w:spacing w:after="60"/>
+      </w:pPr>
+      <w:r>
+        <w:rPr>
+          <w:rFonts w:ascii="Calibri" w:cs="Calibri" w:eastAsia="Calibri" w:hAnsi="Calibri"/>
+          <w:sz w:val="20"/>
+          <w:szCs w:val="20"/>
+        </w:rPr>
+        <w:t xml:space="preserve">Assessment of the uncertainty addition: net positive (rival rational channel tested; BW part of H1 not separable from uncertainty; AAII, margin debt, MAX12 survive). Cost: H1 behavioral content now rests on contemporaneous AAII only.</w:t>
+      </w:r>
+    </w:p>
+    <w:p>
+      <w:pPr>
+        <w:pStyle w:val="ListParagraph"/>
+        <w:numPr>
+          <w:ilvl w:val="0"/>
+          <w:numId w:val="2"/>
+        </w:numPr>
+        <w:spacing w:after="60"/>
+      </w:pPr>
+      <w:r>
+        <w:rPr>
+          <w:rFonts w:ascii="Calibri" w:cs="Calibri" w:eastAsia="Calibri" w:hAnsi="Calibri"/>
+          <w:sz w:val="20"/>
+          <w:szCs w:val="20"/>
+        </w:rPr>
+        <w:t xml:space="preserve">Defense suggestions agreed for the next session (new conversation; see handoff doc): (1a) Bai–Perron on rolling alphas of past-performance terciles; (2) same-fund-sample sub-period bootstrap/BSW/aggregate alpha; (3) panel tests by regime via pooled R^q × S × Post2010 triple interaction in the main text, separate sub-period estimates in Appendix J with state-variable month counts (margin-debt high regime has 0 months in P1, AAII only 8 in P2); (4) stepwise specification table. Added by Claude: dollar value added (Berk &amp; van Binsbergen 2015). Placement to be pre-committed before estimation.</w:t>
+      </w:r>
+    </w:p>
+    <w:p>
+      <w:pPr>
+        <w:pStyle w:val="Heading2"/>
+      </w:pPr>
+      <w:r>
+        <w:rPr>
+          <w:rFonts w:ascii="Calibri" w:cs="Calibri" w:eastAsia="Calibri" w:hAnsi="Calibri"/>
+        </w:rPr>
+        <w:t xml:space="preserve">§8. Outstanding at session close (15 October 2026)</w:t>
+      </w:r>
+    </w:p>
+    <w:p>
+      <w:pPr>
+        <w:pStyle w:val="ListParagraph"/>
+        <w:numPr>
+          <w:ilvl w:val="0"/>
+          <w:numId w:val="2"/>
+        </w:numPr>
+        <w:spacing w:after="60"/>
+      </w:pPr>
+      <w:r>
+        <w:rPr>
+          <w:rFonts w:ascii="Calibri" w:cs="Calibri" w:eastAsia="Calibri" w:hAnsi="Calibri"/>
+          <w:sz w:val="20"/>
+          <w:szCs w:val="20"/>
+        </w:rPr>
+        <w:t xml:space="preserve">Commit dissertation_main.tex (abstracts + AAII table) and pull into Overleaf.</w:t>
+      </w:r>
+    </w:p>
+    <w:p>
+      <w:pPr>
+        <w:pStyle w:val="ListParagraph"/>
+        <w:numPr>
+          <w:ilvl w:val="0"/>
+          <w:numId w:val="2"/>
+        </w:numPr>
+        <w:spacing w:after="60"/>
+      </w:pPr>
+      <w:r>
+        <w:rPr>
+          <w:rFonts w:ascii="Calibri" w:cs="Calibri" w:eastAsia="Calibri" w:hAnsi="Calibri"/>
+          <w:sz w:val="20"/>
+          <w:szCs w:val="20"/>
+        </w:rPr>
+        <w:t xml:space="preserve">Implement the five defense-suggested additions (handoff doc claude/handoff_2026-10-15.md).</w:t>
+      </w:r>
+    </w:p>
+    <w:p>
+      <w:pPr>
+        <w:pStyle w:val="ListParagraph"/>
+        <w:numPr>
+          <w:ilvl w:val="0"/>
+          <w:numId w:val="2"/>
+        </w:numPr>
+        <w:spacing w:after="60"/>
+      </w:pPr>
+      <w:r>
+        <w:rPr>
+          <w:rFonts w:ascii="Calibri" w:cs="Calibri" w:eastAsia="Calibri" w:hAnsi="Calibri"/>
+          <w:sz w:val="20"/>
+          <w:szCs w:val="20"/>
+        </w:rPr>
+        <w:t xml:space="preserve">Han Özsöylev post-defense assessment (June 2026, on the defense draft; text in claude/ozsoylev_assessment_2026-06.md): A1 alpha-table reconciliation done (G.1 sentence to check); A2 re-label H2 as funding-constraint (non-behavioral) channel throughout — NOT done; A3 BGS corrected, add right-tail-power hedge; A4 = balanced-panel test; A5 done; B6 PPF rank-to-alpha mapping in native within-category rank space — NOT done; B7 largely done; B8 lower TNA floor sensitivity (feasible), share-class aggregation (not feasible: primary class only); B9 title kept; C10 future-work wording to check.</w:t>
       </w:r>
     </w:p>
     <w:p>
@@ -12828,60 +12965,6 @@
           <w:szCs w:val="20"/>
         </w:rPr>
         <w:t xml:space="preserve">Kept as is by Ömer: CV / Acknowledgments / Dedication placeholders; title article.</w:t>
-      </w:r>
-    </w:p>
-    <w:p>
-      <w:pPr>
-        <w:pStyle w:val="ListParagraph"/>
-        <w:numPr>
-          <w:ilvl w:val="0"/>
-          <w:numId w:val="2"/>
-        </w:numPr>
-        <w:spacing w:after="60"/>
-      </w:pPr>
-      <w:r>
-        <w:rPr>
-          <w:rFonts w:ascii="Calibri" w:cs="Calibri" w:eastAsia="Calibri" w:hAnsi="Calibri"/>
-          <w:sz w:val="20"/>
-          <w:szCs w:val="20"/>
-        </w:rPr>
-        <w:t xml:space="preserve">SENT⊥ October 2025 gap (LSEG): H1–H4 end Sep 2025.</w:t>
-      </w:r>
-    </w:p>
-    <w:p>
-      <w:pPr>
-        <w:pStyle w:val="ListParagraph"/>
-        <w:numPr>
-          <w:ilvl w:val="0"/>
-          <w:numId w:val="2"/>
-        </w:numPr>
-        <w:spacing w:after="60"/>
-      </w:pPr>
-      <w:r>
-        <w:rPr>
-          <w:rFonts w:ascii="Calibri" w:cs="Calibri" w:eastAsia="Calibri" w:hAnsi="Calibri"/>
-          <w:sz w:val="20"/>
-          <w:szCs w:val="20"/>
-        </w:rPr>
-        <w:t xml:space="preserve">AAII verification table.</w:t>
-      </w:r>
-    </w:p>
-    <w:p>
-      <w:pPr>
-        <w:pStyle w:val="ListParagraph"/>
-        <w:numPr>
-          <w:ilvl w:val="0"/>
-          <w:numId w:val="2"/>
-        </w:numPr>
-        <w:spacing w:after="60"/>
-      </w:pPr>
-      <w:r>
-        <w:rPr>
-          <w:rFonts w:ascii="Calibri" w:cs="Calibri" w:eastAsia="Calibri" w:hAnsi="Calibri"/>
-          <w:sz w:val="20"/>
-          <w:szCs w:val="20"/>
-        </w:rPr>
-        <w:t xml:space="preserve">Abstract rendered length likely &gt; 250 words once citations are expanded (pre-existing) — check against SBE.</w:t>
       </w:r>
     </w:p>
     <w:p>
@@ -12926,7 +13009,7 @@
           <w:sz w:val="20"/>
           <w:szCs w:val="20"/>
         </w:rPr>
-        <w:t xml:space="preserve">Last updated: 15 October 2026 — post MOJAX/GENDX rerun and proofreading fixes.</w:t>
+        <w:t xml:space="preserve">Last updated: 15 October 2026 (evening) — AAII table, abstracts, defense-suggestion plan.</w:t>
       </w:r>
     </w:p>
     <w:tbl>
@@ -13698,7 +13781,7 @@
                 <w:sz w:val="18"/>
                 <w:szCs w:val="18"/>
               </w:rPr>
-              <w:t xml:space="preserve">Consistent with luck (1st pct Prob. Luck 9.8%)</w:t>
+              <w:t xml:space="preserve">Consistent with luck (1st pct Prob. Luck 9.9%)</w:t>
             </w:r>
           </w:p>
         </w:tc>

</xml_diff>

<commit_message>
Text update (reclassified sample, defense extensions) and master log 15-16 Oct
</commit_message>
<xml_diff>
--- a/dissertation_master_log.docx
+++ b/dissertation_master_log.docx
@@ -12993,6 +12993,1972 @@
         <w:rPr>
           <w:rFonts w:ascii="Calibri" w:cs="Calibri" w:eastAsia="Calibri" w:hAnsi="Calibri"/>
         </w:rPr>
+        <w:t xml:space="preserve">Session: 15–16 October 2026 — Defense extensions, survivorship correction (unflagged funds), combined text update</w:t>
+      </w:r>
+    </w:p>
+    <w:p>
+      <w:pPr>
+        <w:spacing w:after="100"/>
+      </w:pPr>
+      <w:r>
+        <w:rPr>
+          <w:rFonts w:ascii="Calibri" w:cs="Calibri" w:eastAsia="Calibri" w:hAnsi="Calibri"/>
+          <w:sz w:val="20"/>
+          <w:szCs w:val="20"/>
+        </w:rPr>
+        <w:t xml:space="preserve">Objective: implement the defense-suggested extensions agreed on 15 October (handoff doc), resolve the survivorship problem caused by funds without a Bloomberg active/passive flag, re-run the pipeline, and bring dissertation_main.tex in line with all new results in one combined update, including the open items of the Özsöylev assessment (A2, A3, B6, B7, B8, C10) and G.1.</w:t>
+      </w:r>
+    </w:p>
+    <w:p>
+      <w:pPr>
+        <w:pStyle w:val="Heading2"/>
+      </w:pPr>
+      <w:r>
+        <w:rPr>
+          <w:rFonts w:ascii="Calibri" w:cs="Calibri" w:eastAsia="Calibri" w:hAnsi="Calibri"/>
+        </w:rPr>
+        <w:t xml:space="preserve">§1. Defense extensions (pre-committed 15 Oct, claude/precommit_defense_extensions_2026-10-15.md)</w:t>
+      </w:r>
+    </w:p>
+    <w:p>
+      <w:pPr>
+        <w:pStyle w:val="ListParagraph"/>
+        <w:numPr>
+          <w:ilvl w:val="0"/>
+          <w:numId w:val="2"/>
+        </w:numPr>
+        <w:spacing w:after="60"/>
+      </w:pPr>
+      <w:r>
+        <w:rPr>
+          <w:rFonts w:ascii="Calibri" w:cs="Calibri" w:eastAsia="Calibri" w:hAnsi="Calibri"/>
+          <w:sz w:val="20"/>
+          <w:szCs w:val="20"/>
+        </w:rPr>
+        <w:t xml:space="preserve">Pre-commitment note written and approved by Ömer before any estimate was seen (designs, decision rules, placements). Oster (2019) bound dropped (Ömer). Anything added afterwards is disclosed in the text as post hoc.</w:t>
+      </w:r>
+    </w:p>
+    <w:p>
+      <w:pPr>
+        <w:pStyle w:val="ListParagraph"/>
+        <w:numPr>
+          <w:ilvl w:val="0"/>
+          <w:numId w:val="2"/>
+        </w:numPr>
+        <w:spacing w:after="60"/>
+      </w:pPr>
+      <w:r>
+        <w:rPr>
+          <w:rFonts w:ascii="Calibri" w:cs="Calibri" w:eastAsia="Calibri" w:hAnsi="Calibri"/>
+          <w:sz w:val="20"/>
+          <w:szCs w:val="20"/>
+        </w:rPr>
+        <w:t xml:space="preserve">New scripts: breaktest_terciles.R (Bai–Perron and fixed-date Aug 2010 shift on rolling alphas of past-performance tercile portfolios; signal = rolling t(α) at t−1); same_sample_subperiods.R (fixed samples S23 = ≥24 months in P2 and P3, S123 = in all three; aggregate alphas, bootstrap, BSW; stacked P3−P2 change test, HAC 12; within/composition decomposition); value_added.R (Berk–van Binsbergen 2015 dollar value added, 2025 USD, CPI-U, Oct 2025 interpolated); panel_regime_stepwise.R (pooled R^q×S×Post2010, separate regimes with state-month counts, Lipper×month FE version, stepwise columns, TNA floor 5M/1M/none).</w:t>
+      </w:r>
+    </w:p>
+    <w:p>
+      <w:pPr>
+        <w:pStyle w:val="ListParagraph"/>
+        <w:numPr>
+          <w:ilvl w:val="0"/>
+          <w:numId w:val="2"/>
+        </w:numPr>
+        <w:spacing w:after="60"/>
+      </w:pPr>
+      <w:r>
+        <w:rPr>
+          <w:rFonts w:ascii="Calibri" w:cs="Calibri" w:eastAsia="Calibri" w:hAnsi="Calibri"/>
+          <w:sz w:val="20"/>
+          <w:szCs w:val="20"/>
+        </w:rPr>
+        <w:t xml:space="preserve">Modified: psychological_premium.R v1.5 and uncertainty_robustness.R v1.3 (native rank-space PPF calibration from rank_calibration.xlsx: Lipper-category 12-m return-rank quintiles, net Carhart alpha); panel_regressions_setup.R v1.7 (rows below the floor saved to panel_reg_below_floor.rds); master_pipeline.R (new Phase-J steps).</w:t>
+      </w:r>
+    </w:p>
+    <w:p>
+      <w:pPr>
+        <w:pStyle w:val="ListParagraph"/>
+        <w:numPr>
+          <w:ilvl w:val="0"/>
+          <w:numId w:val="2"/>
+        </w:numPr>
+        <w:spacing w:after="60"/>
+      </w:pPr>
+      <w:r>
+        <w:rPr>
+          <w:rFonts w:ascii="Calibri" w:cs="Calibri" w:eastAsia="Calibri" w:hAnsi="Calibri"/>
+          <w:sz w:val="20"/>
+          <w:szCs w:val="20"/>
+        </w:rPr>
+        <w:t xml:space="preserve">Bugs found while testing: panel_regime_stepwise.R function unit() masked grid::unit and crashed descriptive_statistics.R → renamed unit_w (also near → near_break, panel → va_panel); CPI October 2025 missing made every deflator NA → geometric interpolation.</w:t>
+      </w:r>
+    </w:p>
+    <w:p>
+      <w:pPr>
+        <w:pStyle w:val="ListParagraph"/>
+        <w:numPr>
+          <w:ilvl w:val="0"/>
+          <w:numId w:val="2"/>
+        </w:numPr>
+        <w:spacing w:after="60"/>
+      </w:pPr>
+      <w:r>
+        <w:rPr>
+          <w:rFonts w:ascii="Calibri" w:cs="Calibri" w:eastAsia="Calibri" w:hAnsi="Calibri"/>
+          <w:sz w:val="20"/>
+          <w:szCs w:val="20"/>
+        </w:rPr>
+        <w:t xml:space="preserve">Commit 49c9531 (defense extensions).</w:t>
+      </w:r>
+    </w:p>
+    <w:p>
+      <w:pPr>
+        <w:pStyle w:val="Heading2"/>
+      </w:pPr>
+      <w:r>
+        <w:rPr>
+          <w:rFonts w:ascii="Calibri" w:cs="Calibri" w:eastAsia="Calibri" w:hAnsi="Calibri"/>
+        </w:rPr>
+        <w:t xml:space="preserve">§2. Survivorship problem — funds without a Bloomberg flag</w:t>
+      </w:r>
+    </w:p>
+    <w:p>
+      <w:pPr>
+        <w:pStyle w:val="ListParagraph"/>
+        <w:numPr>
+          <w:ilvl w:val="0"/>
+          <w:numId w:val="2"/>
+        </w:numPr>
+        <w:spacing w:after="60"/>
+      </w:pPr>
+      <w:r>
+        <w:rPr>
+          <w:rFonts w:ascii="Calibri" w:cs="Calibri" w:eastAsia="Calibri" w:hAnsi="Calibri"/>
+          <w:sz w:val="20"/>
+          <w:szCs w:val="20"/>
+        </w:rPr>
+        <w:t xml:space="preserve">Diagnosis: the dead funds are in the data; Bloomberg Actively_Managed_New is empty for almost every fund that closed before ~2012. classify_ap() coded them Unknown and every analysis dropped them, so the pre-2012 active sample was survivor-only (active perf sample 1,962 funds, only 2 closed before 2012). Not an LSEG coverage gap (initial statement corrected). LSEG Workspace (Ömer’s tier) has no index/active field for these funds (checked in Formula Builder 16 Oct).</w:t>
+      </w:r>
+    </w:p>
+    <w:p>
+      <w:pPr>
+        <w:pStyle w:val="ListParagraph"/>
+        <w:numPr>
+          <w:ilvl w:val="0"/>
+          <w:numId w:val="2"/>
+        </w:numPr>
+        <w:spacing w:after="60"/>
+      </w:pPr>
+      <w:r>
+        <w:rPr>
+          <w:rFonts w:ascii="Calibri" w:cs="Calibri" w:eastAsia="Calibri" w:hAnsi="Calibri"/>
+          <w:sz w:val="20"/>
+          <w:szCs w:val="20"/>
+        </w:rPr>
+        <w:t xml:space="preserve">Rule (pre-committed 16 Oct, claude/precommit_unknown_reclassification_2026-10-16.md): PASSIVE if index keyword in name, or Lipper S&amp;P 500 / S&amp;P MidCap 400 Index category, or R² ≥ 0.98 and TE ≤ 1% vs assigned benchmark (≥ 24 joint months); otherwise ACTIVE (231 funds by default for lack of data).</w:t>
+      </w:r>
+    </w:p>
+    <w:p>
+      <w:pPr>
+        <w:pStyle w:val="ListParagraph"/>
+        <w:numPr>
+          <w:ilvl w:val="0"/>
+          <w:numId w:val="2"/>
+        </w:numPr>
+        <w:spacing w:after="60"/>
+      </w:pPr>
+      <w:r>
+        <w:rPr>
+          <w:rFonts w:ascii="Calibri" w:cs="Calibri" w:eastAsia="Calibri" w:hAnsi="Calibri"/>
+          <w:sz w:val="20"/>
+          <w:szCs w:val="20"/>
+        </w:rPr>
+        <w:t xml:space="preserve">Validation on flagged funds: agreement 96.5%; flagged Active → passive 7 of 2,263 (0.3%, criterion ≤ 2% met); flagged Passive caught 236 of 320 (73.8%, criterion ≥ 90% FAILED — misses are post-2012 smart-beta/factor/rules-based products and a few apparently mis-flagged active funds). Recall 87.8% for passive funds starting before 2006, 94.6% for those closed before 2016. Reported to Ömer before any change; thresholds not tuned.</w:t>
+      </w:r>
+    </w:p>
+    <w:p>
+      <w:pPr>
+        <w:pStyle w:val="ListParagraph"/>
+        <w:numPr>
+          <w:ilvl w:val="0"/>
+          <w:numId w:val="2"/>
+        </w:numPr>
+        <w:spacing w:after="60"/>
+      </w:pPr>
+      <w:r>
+        <w:rPr>
+          <w:rFonts w:ascii="Calibri" w:cs="Calibri" w:eastAsia="Calibri" w:hAnsi="Calibri"/>
+          <w:sz w:val="20"/>
+          <w:szCs w:val="20"/>
+        </w:rPr>
+        <w:t xml:space="preserve">Decision (Ömer): keep the rule, add a documented manual review of 99 boundary funds (19 rule-passive + 80 near-passive by R²/TE or name) and a bounds table. Review convention: follow Bloomberg’s treatment of comparable flagged funds. 12 changes (6 each way); Ömer accepted the ledger without changing it (“sana güveniyorum”). Ledger: data/R import/unknown_classification_ledger.xlsx.</w:t>
+      </w:r>
+    </w:p>
+    <w:p>
+      <w:pPr>
+        <w:pStyle w:val="ListParagraph"/>
+        <w:numPr>
+          <w:ilvl w:val="0"/>
+          <w:numId w:val="2"/>
+        </w:numPr>
+        <w:spacing w:after="60"/>
+      </w:pPr>
+      <w:r>
+        <w:rPr>
+          <w:rFonts w:ascii="Calibri" w:cs="Calibri" w:eastAsia="Calibri" w:hAnsi="Calibri"/>
+          <w:sz w:val="20"/>
+          <w:szCs w:val="20"/>
+        </w:rPr>
+        <w:t xml:space="preserve">Result: 969 unflagged funds → 950 Active, 19 Passive. Exclusions under the flagged_funds.xlsx criteria (detected from Lipper, benchmark, name; explicit lists SECTOR_ADD, LS_ADD, NOT_GLOBAL): entire 10, performance comparison 79 (sector), H3 80. 17 reclassified active funds have no Lipper category (no flow rank). 59 unflagged share classes under entire-analysis exclusions stay Unknown (fund counts only).</w:t>
+      </w:r>
+    </w:p>
+    <w:p>
+      <w:pPr>
+        <w:pStyle w:val="ListParagraph"/>
+        <w:numPr>
+          <w:ilvl w:val="0"/>
+          <w:numId w:val="2"/>
+        </w:numPr>
+        <w:spacing w:after="60"/>
+      </w:pPr>
+      <w:r>
+        <w:rPr>
+          <w:rFonts w:ascii="Calibri" w:cs="Calibri" w:eastAsia="Calibri" w:hAnsi="Calibri"/>
+          <w:sz w:val="20"/>
+          <w:szCs w:val="20"/>
+        </w:rPr>
+        <w:t xml:space="preserve">Code: classify_unknown_funds.R (utility; writes unknown_classification.xlsx); classification_robustness.R (Bloomberg-only vs reclassified table; reads data/R import/results_bloomberg_only/ — keep that folder); data_import_and_cleaning.R v1.8 (AP_CLASSIFICATION = "reclassified" | "bloomberg"; Lipper "#N/A N/A" → NA); master_pipeline.R v1.9 (RUN_UTILITY_CLASSIFY; robustness table at end of Phase J); alpha_reporting.R, FF_comparison.R, subperiod_analysis.R, descriptive_statistics.R (empty Unknown rows dropped). Full PC rerun 16 Oct 19:14, all OK. Commits 6598c9f and 6bea6ea.</w:t>
+      </w:r>
+    </w:p>
+    <w:p>
+      <w:pPr>
+        <w:pStyle w:val="Heading2"/>
+      </w:pPr>
+      <w:r>
+        <w:rPr>
+          <w:rFonts w:ascii="Calibri" w:cs="Calibri" w:eastAsia="Calibri" w:hAnsi="Calibri"/>
+        </w:rPr>
+        <w:t xml:space="preserve">§3. Results — Bloomberg flag only (15 Oct) → reclassified (16 Oct)</w:t>
+      </w:r>
+    </w:p>
+    <w:tbl>
+      <w:tblPr>
+        <w:tblW w:type="dxa" w:w="9026"/>
+        <w:tblBorders>
+          <w:top w:val="single" w:color="auto" w:sz="4"/>
+          <w:left w:val="single" w:color="auto" w:sz="4"/>
+          <w:bottom w:val="single" w:color="auto" w:sz="4"/>
+          <w:right w:val="single" w:color="auto" w:sz="4"/>
+          <w:insideH w:val="single" w:color="auto" w:sz="4"/>
+          <w:insideV w:val="single" w:color="auto" w:sz="4"/>
+        </w:tblBorders>
+      </w:tblPr>
+      <w:tblGrid>
+        <w:gridCol w:w="3000"/>
+        <w:gridCol w:w="3013"/>
+        <w:gridCol w:w="3013"/>
+      </w:tblGrid>
+      <w:tr>
+        <w:trPr>
+          <w:tblHeader/>
+        </w:trPr>
+        <w:tc>
+          <w:tcPr>
+            <w:tcW w:type="dxa" w:w="3000"/>
+            <w:tcBorders>
+              <w:top w:val="single" w:color="A0A0A0" w:sz="4"/>
+              <w:left w:val="single" w:color="A0A0A0" w:sz="4"/>
+              <w:bottom w:val="single" w:color="A0A0A0" w:sz="4"/>
+              <w:right w:val="single" w:color="A0A0A0" w:sz="4"/>
+            </w:tcBorders>
+            <w:shd w:fill="E7ECF2" w:color="auto" w:val="clear"/>
+            <w:tcMar>
+              <w:top w:type="dxa" w:w="60"/>
+              <w:left w:type="dxa" w:w="100"/>
+              <w:bottom w:type="dxa" w:w="60"/>
+              <w:right w:type="dxa" w:w="100"/>
+            </w:tcMar>
+          </w:tcPr>
+          <w:p>
+            <w:r>
+              <w:rPr>
+                <w:rFonts w:ascii="Calibri" w:cs="Calibri" w:eastAsia="Calibri" w:hAnsi="Calibri"/>
+                <w:b/>
+                <w:bCs/>
+                <w:sz w:val="18"/>
+                <w:szCs w:val="18"/>
+              </w:rPr>
+              <w:t xml:space="preserve">Result</w:t>
+            </w:r>
+          </w:p>
+        </w:tc>
+        <w:tc>
+          <w:tcPr>
+            <w:tcW w:type="dxa" w:w="3013"/>
+            <w:tcBorders>
+              <w:top w:val="single" w:color="A0A0A0" w:sz="4"/>
+              <w:left w:val="single" w:color="A0A0A0" w:sz="4"/>
+              <w:bottom w:val="single" w:color="A0A0A0" w:sz="4"/>
+              <w:right w:val="single" w:color="A0A0A0" w:sz="4"/>
+            </w:tcBorders>
+            <w:shd w:fill="E7ECF2" w:color="auto" w:val="clear"/>
+            <w:tcMar>
+              <w:top w:type="dxa" w:w="60"/>
+              <w:left w:type="dxa" w:w="100"/>
+              <w:bottom w:type="dxa" w:w="60"/>
+              <w:right w:type="dxa" w:w="100"/>
+            </w:tcMar>
+          </w:tcPr>
+          <w:p>
+            <w:r>
+              <w:rPr>
+                <w:rFonts w:ascii="Calibri" w:cs="Calibri" w:eastAsia="Calibri" w:hAnsi="Calibri"/>
+                <w:b/>
+                <w:bCs/>
+                <w:sz w:val="18"/>
+                <w:szCs w:val="18"/>
+              </w:rPr>
+              <w:t xml:space="preserve">Bloomberg flag only</w:t>
+            </w:r>
+          </w:p>
+        </w:tc>
+        <w:tc>
+          <w:tcPr>
+            <w:tcW w:type="dxa" w:w="3013"/>
+            <w:tcBorders>
+              <w:top w:val="single" w:color="A0A0A0" w:sz="4"/>
+              <w:left w:val="single" w:color="A0A0A0" w:sz="4"/>
+              <w:bottom w:val="single" w:color="A0A0A0" w:sz="4"/>
+              <w:right w:val="single" w:color="A0A0A0" w:sz="4"/>
+            </w:tcBorders>
+            <w:shd w:fill="E7ECF2" w:color="auto" w:val="clear"/>
+            <w:tcMar>
+              <w:top w:type="dxa" w:w="60"/>
+              <w:left w:type="dxa" w:w="100"/>
+              <w:bottom w:type="dxa" w:w="60"/>
+              <w:right w:type="dxa" w:w="100"/>
+            </w:tcMar>
+          </w:tcPr>
+          <w:p>
+            <w:r>
+              <w:rPr>
+                <w:rFonts w:ascii="Calibri" w:cs="Calibri" w:eastAsia="Calibri" w:hAnsi="Calibri"/>
+                <w:b/>
+                <w:bCs/>
+                <w:sz w:val="18"/>
+                <w:szCs w:val="18"/>
+              </w:rPr>
+              <w:t xml:space="preserve">Reclassified</w:t>
+            </w:r>
+          </w:p>
+        </w:tc>
+      </w:tr>
+      <w:tr>
+        <w:trPr>
+          <w:tblHeader w:val="false"/>
+        </w:trPr>
+        <w:tc>
+          <w:tcPr>
+            <w:tcW w:type="dxa" w:w="3000"/>
+            <w:tcBorders>
+              <w:top w:val="single" w:color="A0A0A0" w:sz="4"/>
+              <w:left w:val="single" w:color="A0A0A0" w:sz="4"/>
+              <w:bottom w:val="single" w:color="A0A0A0" w:sz="4"/>
+              <w:right w:val="single" w:color="A0A0A0" w:sz="4"/>
+            </w:tcBorders>
+            <w:tcMar>
+              <w:top w:type="dxa" w:w="60"/>
+              <w:left w:type="dxa" w:w="100"/>
+              <w:bottom w:type="dxa" w:w="60"/>
+              <w:right w:type="dxa" w:w="100"/>
+            </w:tcMar>
+          </w:tcPr>
+          <w:p>
+            <w:r>
+              <w:rPr>
+                <w:rFonts w:ascii="Calibri" w:cs="Calibri" w:eastAsia="Calibri" w:hAnsi="Calibri"/>
+                <w:b w:val="false"/>
+                <w:bCs w:val="false"/>
+                <w:sz w:val="18"/>
+                <w:szCs w:val="18"/>
+              </w:rPr>
+              <w:t xml:space="preserve">Active funds (aggregate portfolio)</w:t>
+            </w:r>
+          </w:p>
+        </w:tc>
+        <w:tc>
+          <w:tcPr>
+            <w:tcW w:type="dxa" w:w="3013"/>
+            <w:tcBorders>
+              <w:top w:val="single" w:color="A0A0A0" w:sz="4"/>
+              <w:left w:val="single" w:color="A0A0A0" w:sz="4"/>
+              <w:bottom w:val="single" w:color="A0A0A0" w:sz="4"/>
+              <w:right w:val="single" w:color="A0A0A0" w:sz="4"/>
+            </w:tcBorders>
+            <w:tcMar>
+              <w:top w:type="dxa" w:w="60"/>
+              <w:left w:type="dxa" w:w="100"/>
+              <w:bottom w:type="dxa" w:w="60"/>
+              <w:right w:type="dxa" w:w="100"/>
+            </w:tcMar>
+          </w:tcPr>
+          <w:p>
+            <w:r>
+              <w:rPr>
+                <w:rFonts w:ascii="Calibri" w:cs="Calibri" w:eastAsia="Calibri" w:hAnsi="Calibri"/>
+                <w:b w:val="false"/>
+                <w:bCs w:val="false"/>
+                <w:sz w:val="18"/>
+                <w:szCs w:val="18"/>
+              </w:rPr>
+              <w:t xml:space="preserve">1,962</w:t>
+            </w:r>
+          </w:p>
+        </w:tc>
+        <w:tc>
+          <w:tcPr>
+            <w:tcW w:type="dxa" w:w="3013"/>
+            <w:tcBorders>
+              <w:top w:val="single" w:color="A0A0A0" w:sz="4"/>
+              <w:left w:val="single" w:color="A0A0A0" w:sz="4"/>
+              <w:bottom w:val="single" w:color="A0A0A0" w:sz="4"/>
+              <w:right w:val="single" w:color="A0A0A0" w:sz="4"/>
+            </w:tcBorders>
+            <w:tcMar>
+              <w:top w:type="dxa" w:w="60"/>
+              <w:left w:type="dxa" w:w="100"/>
+              <w:bottom w:type="dxa" w:w="60"/>
+              <w:right w:type="dxa" w:w="100"/>
+            </w:tcMar>
+          </w:tcPr>
+          <w:p>
+            <w:r>
+              <w:rPr>
+                <w:rFonts w:ascii="Calibri" w:cs="Calibri" w:eastAsia="Calibri" w:hAnsi="Calibri"/>
+                <w:b w:val="false"/>
+                <w:bCs w:val="false"/>
+                <w:sz w:val="18"/>
+                <w:szCs w:val="18"/>
+              </w:rPr>
+              <w:t xml:space="preserve">2,571</w:t>
+            </w:r>
+          </w:p>
+        </w:tc>
+      </w:tr>
+      <w:tr>
+        <w:trPr>
+          <w:tblHeader w:val="false"/>
+        </w:trPr>
+        <w:tc>
+          <w:tcPr>
+            <w:tcW w:type="dxa" w:w="3000"/>
+            <w:tcBorders>
+              <w:top w:val="single" w:color="A0A0A0" w:sz="4"/>
+              <w:left w:val="single" w:color="A0A0A0" w:sz="4"/>
+              <w:bottom w:val="single" w:color="A0A0A0" w:sz="4"/>
+              <w:right w:val="single" w:color="A0A0A0" w:sz="4"/>
+            </w:tcBorders>
+            <w:tcMar>
+              <w:top w:type="dxa" w:w="60"/>
+              <w:left w:type="dxa" w:w="100"/>
+              <w:bottom w:type="dxa" w:w="60"/>
+              <w:right w:type="dxa" w:w="100"/>
+            </w:tcMar>
+          </w:tcPr>
+          <w:p>
+            <w:r>
+              <w:rPr>
+                <w:rFonts w:ascii="Calibri" w:cs="Calibri" w:eastAsia="Calibri" w:hAnsi="Calibri"/>
+                <w:b w:val="false"/>
+                <w:bCs w:val="false"/>
+                <w:sz w:val="18"/>
+                <w:szCs w:val="18"/>
+              </w:rPr>
+              <w:t xml:space="preserve">Active EW gross / net α (% p.a.)</w:t>
+            </w:r>
+          </w:p>
+        </w:tc>
+        <w:tc>
+          <w:tcPr>
+            <w:tcW w:type="dxa" w:w="3013"/>
+            <w:tcBorders>
+              <w:top w:val="single" w:color="A0A0A0" w:sz="4"/>
+              <w:left w:val="single" w:color="A0A0A0" w:sz="4"/>
+              <w:bottom w:val="single" w:color="A0A0A0" w:sz="4"/>
+              <w:right w:val="single" w:color="A0A0A0" w:sz="4"/>
+            </w:tcBorders>
+            <w:tcMar>
+              <w:top w:type="dxa" w:w="60"/>
+              <w:left w:type="dxa" w:w="100"/>
+              <w:bottom w:type="dxa" w:w="60"/>
+              <w:right w:type="dxa" w:w="100"/>
+            </w:tcMar>
+          </w:tcPr>
+          <w:p>
+            <w:r>
+              <w:rPr>
+                <w:rFonts w:ascii="Calibri" w:cs="Calibri" w:eastAsia="Calibri" w:hAnsi="Calibri"/>
+                <w:b w:val="false"/>
+                <w:bCs w:val="false"/>
+                <w:sz w:val="18"/>
+                <w:szCs w:val="18"/>
+              </w:rPr>
+              <w:t xml:space="preserve">+0.24 / −0.81*</w:t>
+            </w:r>
+          </w:p>
+        </w:tc>
+        <w:tc>
+          <w:tcPr>
+            <w:tcW w:type="dxa" w:w="3013"/>
+            <w:tcBorders>
+              <w:top w:val="single" w:color="A0A0A0" w:sz="4"/>
+              <w:left w:val="single" w:color="A0A0A0" w:sz="4"/>
+              <w:bottom w:val="single" w:color="A0A0A0" w:sz="4"/>
+              <w:right w:val="single" w:color="A0A0A0" w:sz="4"/>
+            </w:tcBorders>
+            <w:tcMar>
+              <w:top w:type="dxa" w:w="60"/>
+              <w:left w:type="dxa" w:w="100"/>
+              <w:bottom w:type="dxa" w:w="60"/>
+              <w:right w:type="dxa" w:w="100"/>
+            </w:tcMar>
+          </w:tcPr>
+          <w:p>
+            <w:r>
+              <w:rPr>
+                <w:rFonts w:ascii="Calibri" w:cs="Calibri" w:eastAsia="Calibri" w:hAnsi="Calibri"/>
+                <w:b w:val="false"/>
+                <w:bCs w:val="false"/>
+                <w:sz w:val="18"/>
+                <w:szCs w:val="18"/>
+              </w:rPr>
+              <w:t xml:space="preserve">−0.09 / −1.17*** (t −2.62)</w:t>
+            </w:r>
+          </w:p>
+        </w:tc>
+      </w:tr>
+      <w:tr>
+        <w:trPr>
+          <w:tblHeader w:val="false"/>
+        </w:trPr>
+        <w:tc>
+          <w:tcPr>
+            <w:tcW w:type="dxa" w:w="3000"/>
+            <w:tcBorders>
+              <w:top w:val="single" w:color="A0A0A0" w:sz="4"/>
+              <w:left w:val="single" w:color="A0A0A0" w:sz="4"/>
+              <w:bottom w:val="single" w:color="A0A0A0" w:sz="4"/>
+              <w:right w:val="single" w:color="A0A0A0" w:sz="4"/>
+            </w:tcBorders>
+            <w:tcMar>
+              <w:top w:type="dxa" w:w="60"/>
+              <w:left w:type="dxa" w:w="100"/>
+              <w:bottom w:type="dxa" w:w="60"/>
+              <w:right w:type="dxa" w:w="100"/>
+            </w:tcMar>
+          </w:tcPr>
+          <w:p>
+            <w:r>
+              <w:rPr>
+                <w:rFonts w:ascii="Calibri" w:cs="Calibri" w:eastAsia="Calibri" w:hAnsi="Calibri"/>
+                <w:b w:val="false"/>
+                <w:bCs w:val="false"/>
+                <w:sz w:val="18"/>
+                <w:szCs w:val="18"/>
+              </w:rPr>
+              <w:t xml:space="preserve">Active VW gross / net α</w:t>
+            </w:r>
+          </w:p>
+        </w:tc>
+        <w:tc>
+          <w:tcPr>
+            <w:tcW w:type="dxa" w:w="3013"/>
+            <w:tcBorders>
+              <w:top w:val="single" w:color="A0A0A0" w:sz="4"/>
+              <w:left w:val="single" w:color="A0A0A0" w:sz="4"/>
+              <w:bottom w:val="single" w:color="A0A0A0" w:sz="4"/>
+              <w:right w:val="single" w:color="A0A0A0" w:sz="4"/>
+            </w:tcBorders>
+            <w:tcMar>
+              <w:top w:type="dxa" w:w="60"/>
+              <w:left w:type="dxa" w:w="100"/>
+              <w:bottom w:type="dxa" w:w="60"/>
+              <w:right w:type="dxa" w:w="100"/>
+            </w:tcMar>
+          </w:tcPr>
+          <w:p>
+            <w:r>
+              <w:rPr>
+                <w:rFonts w:ascii="Calibri" w:cs="Calibri" w:eastAsia="Calibri" w:hAnsi="Calibri"/>
+                <w:b w:val="false"/>
+                <w:bCs w:val="false"/>
+                <w:sz w:val="18"/>
+                <w:szCs w:val="18"/>
+              </w:rPr>
+              <w:t xml:space="preserve">+0.03 / −0.66</w:t>
+            </w:r>
+          </w:p>
+        </w:tc>
+        <w:tc>
+          <w:tcPr>
+            <w:tcW w:type="dxa" w:w="3013"/>
+            <w:tcBorders>
+              <w:top w:val="single" w:color="A0A0A0" w:sz="4"/>
+              <w:left w:val="single" w:color="A0A0A0" w:sz="4"/>
+              <w:bottom w:val="single" w:color="A0A0A0" w:sz="4"/>
+              <w:right w:val="single" w:color="A0A0A0" w:sz="4"/>
+            </w:tcBorders>
+            <w:tcMar>
+              <w:top w:type="dxa" w:w="60"/>
+              <w:left w:type="dxa" w:w="100"/>
+              <w:bottom w:type="dxa" w:w="60"/>
+              <w:right w:type="dxa" w:w="100"/>
+            </w:tcMar>
+          </w:tcPr>
+          <w:p>
+            <w:r>
+              <w:rPr>
+                <w:rFonts w:ascii="Calibri" w:cs="Calibri" w:eastAsia="Calibri" w:hAnsi="Calibri"/>
+                <w:b w:val="false"/>
+                <w:bCs w:val="false"/>
+                <w:sz w:val="18"/>
+                <w:szCs w:val="18"/>
+              </w:rPr>
+              <w:t xml:space="preserve">+0.02 / −0.67* (t −1.66)</w:t>
+            </w:r>
+          </w:p>
+        </w:tc>
+      </w:tr>
+      <w:tr>
+        <w:trPr>
+          <w:tblHeader w:val="false"/>
+        </w:trPr>
+        <w:tc>
+          <w:tcPr>
+            <w:tcW w:type="dxa" w:w="3000"/>
+            <w:tcBorders>
+              <w:top w:val="single" w:color="A0A0A0" w:sz="4"/>
+              <w:left w:val="single" w:color="A0A0A0" w:sz="4"/>
+              <w:bottom w:val="single" w:color="A0A0A0" w:sz="4"/>
+              <w:right w:val="single" w:color="A0A0A0" w:sz="4"/>
+            </w:tcBorders>
+            <w:tcMar>
+              <w:top w:type="dxa" w:w="60"/>
+              <w:left w:type="dxa" w:w="100"/>
+              <w:bottom w:type="dxa" w:w="60"/>
+              <w:right w:type="dxa" w:w="100"/>
+            </w:tcMar>
+          </w:tcPr>
+          <w:p>
+            <w:r>
+              <w:rPr>
+                <w:rFonts w:ascii="Calibri" w:cs="Calibri" w:eastAsia="Calibri" w:hAnsi="Calibri"/>
+                <w:b w:val="false"/>
+                <w:bCs w:val="false"/>
+                <w:sz w:val="18"/>
+                <w:szCs w:val="18"/>
+              </w:rPr>
+              <w:t xml:space="preserve">π̂0 / π−A / π+A (γ* 0.45)</w:t>
+            </w:r>
+          </w:p>
+        </w:tc>
+        <w:tc>
+          <w:tcPr>
+            <w:tcW w:type="dxa" w:w="3013"/>
+            <w:tcBorders>
+              <w:top w:val="single" w:color="A0A0A0" w:sz="4"/>
+              <w:left w:val="single" w:color="A0A0A0" w:sz="4"/>
+              <w:bottom w:val="single" w:color="A0A0A0" w:sz="4"/>
+              <w:right w:val="single" w:color="A0A0A0" w:sz="4"/>
+            </w:tcBorders>
+            <w:tcMar>
+              <w:top w:type="dxa" w:w="60"/>
+              <w:left w:type="dxa" w:w="100"/>
+              <w:bottom w:type="dxa" w:w="60"/>
+              <w:right w:type="dxa" w:w="100"/>
+            </w:tcMar>
+          </w:tcPr>
+          <w:p>
+            <w:r>
+              <w:rPr>
+                <w:rFonts w:ascii="Calibri" w:cs="Calibri" w:eastAsia="Calibri" w:hAnsi="Calibri"/>
+                <w:b w:val="false"/>
+                <w:bCs w:val="false"/>
+                <w:sz w:val="18"/>
+                <w:szCs w:val="18"/>
+              </w:rPr>
+              <w:t xml:space="preserve">86.0 / 11.4 / 1.7</w:t>
+            </w:r>
+          </w:p>
+        </w:tc>
+        <w:tc>
+          <w:tcPr>
+            <w:tcW w:type="dxa" w:w="3013"/>
+            <w:tcBorders>
+              <w:top w:val="single" w:color="A0A0A0" w:sz="4"/>
+              <w:left w:val="single" w:color="A0A0A0" w:sz="4"/>
+              <w:bottom w:val="single" w:color="A0A0A0" w:sz="4"/>
+              <w:right w:val="single" w:color="A0A0A0" w:sz="4"/>
+            </w:tcBorders>
+            <w:tcMar>
+              <w:top w:type="dxa" w:w="60"/>
+              <w:left w:type="dxa" w:w="100"/>
+              <w:bottom w:type="dxa" w:w="60"/>
+              <w:right w:type="dxa" w:w="100"/>
+            </w:tcMar>
+          </w:tcPr>
+          <w:p>
+            <w:r>
+              <w:rPr>
+                <w:rFonts w:ascii="Calibri" w:cs="Calibri" w:eastAsia="Calibri" w:hAnsi="Calibri"/>
+                <w:b w:val="false"/>
+                <w:bCs w:val="false"/>
+                <w:sz w:val="18"/>
+                <w:szCs w:val="18"/>
+              </w:rPr>
+              <w:t xml:space="preserve">83.4 / 15.2 / 0.8 (N 2,255)</w:t>
+            </w:r>
+          </w:p>
+        </w:tc>
+      </w:tr>
+      <w:tr>
+        <w:trPr>
+          <w:tblHeader w:val="false"/>
+        </w:trPr>
+        <w:tc>
+          <w:tcPr>
+            <w:tcW w:type="dxa" w:w="3000"/>
+            <w:tcBorders>
+              <w:top w:val="single" w:color="A0A0A0" w:sz="4"/>
+              <w:left w:val="single" w:color="A0A0A0" w:sz="4"/>
+              <w:bottom w:val="single" w:color="A0A0A0" w:sz="4"/>
+              <w:right w:val="single" w:color="A0A0A0" w:sz="4"/>
+            </w:tcBorders>
+            <w:tcMar>
+              <w:top w:type="dxa" w:w="60"/>
+              <w:left w:type="dxa" w:w="100"/>
+              <w:bottom w:type="dxa" w:w="60"/>
+              <w:right w:type="dxa" w:w="100"/>
+            </w:tcMar>
+          </w:tcPr>
+          <w:p>
+            <w:r>
+              <w:rPr>
+                <w:rFonts w:ascii="Calibri" w:cs="Calibri" w:eastAsia="Calibri" w:hAnsi="Calibri"/>
+                <w:b w:val="false"/>
+                <w:bCs w:val="false"/>
+                <w:sz w:val="18"/>
+                <w:szCs w:val="18"/>
+              </w:rPr>
+              <w:t xml:space="preserve">Sub-period EW net α P1 / P2 / P3</w:t>
+            </w:r>
+          </w:p>
+        </w:tc>
+        <w:tc>
+          <w:tcPr>
+            <w:tcW w:type="dxa" w:w="3013"/>
+            <w:tcBorders>
+              <w:top w:val="single" w:color="A0A0A0" w:sz="4"/>
+              <w:left w:val="single" w:color="A0A0A0" w:sz="4"/>
+              <w:bottom w:val="single" w:color="A0A0A0" w:sz="4"/>
+              <w:right w:val="single" w:color="A0A0A0" w:sz="4"/>
+            </w:tcBorders>
+            <w:tcMar>
+              <w:top w:type="dxa" w:w="60"/>
+              <w:left w:type="dxa" w:w="100"/>
+              <w:bottom w:type="dxa" w:w="60"/>
+              <w:right w:type="dxa" w:w="100"/>
+            </w:tcMar>
+          </w:tcPr>
+          <w:p>
+            <w:r>
+              <w:rPr>
+                <w:rFonts w:ascii="Calibri" w:cs="Calibri" w:eastAsia="Calibri" w:hAnsi="Calibri"/>
+                <w:b w:val="false"/>
+                <w:bCs w:val="false"/>
+                <w:sz w:val="18"/>
+                <w:szCs w:val="18"/>
+              </w:rPr>
+              <w:t xml:space="preserve">−0.72 / −0.17 / −1.75***</w:t>
+            </w:r>
+          </w:p>
+        </w:tc>
+        <w:tc>
+          <w:tcPr>
+            <w:tcW w:type="dxa" w:w="3013"/>
+            <w:tcBorders>
+              <w:top w:val="single" w:color="A0A0A0" w:sz="4"/>
+              <w:left w:val="single" w:color="A0A0A0" w:sz="4"/>
+              <w:bottom w:val="single" w:color="A0A0A0" w:sz="4"/>
+              <w:right w:val="single" w:color="A0A0A0" w:sz="4"/>
+            </w:tcBorders>
+            <w:tcMar>
+              <w:top w:type="dxa" w:w="60"/>
+              <w:left w:type="dxa" w:w="100"/>
+              <w:bottom w:type="dxa" w:w="60"/>
+              <w:right w:type="dxa" w:w="100"/>
+            </w:tcMar>
+          </w:tcPr>
+          <w:p>
+            <w:r>
+              <w:rPr>
+                <w:rFonts w:ascii="Calibri" w:cs="Calibri" w:eastAsia="Calibri" w:hAnsi="Calibri"/>
+                <w:b w:val="false"/>
+                <w:bCs w:val="false"/>
+                <w:sz w:val="18"/>
+                <w:szCs w:val="18"/>
+              </w:rPr>
+              <w:t xml:space="preserve">−1.23 / −0.65 / −1.81***</w:t>
+            </w:r>
+          </w:p>
+        </w:tc>
+      </w:tr>
+      <w:tr>
+        <w:trPr>
+          <w:tblHeader w:val="false"/>
+        </w:trPr>
+        <w:tc>
+          <w:tcPr>
+            <w:tcW w:type="dxa" w:w="3000"/>
+            <w:tcBorders>
+              <w:top w:val="single" w:color="A0A0A0" w:sz="4"/>
+              <w:left w:val="single" w:color="A0A0A0" w:sz="4"/>
+              <w:bottom w:val="single" w:color="A0A0A0" w:sz="4"/>
+              <w:right w:val="single" w:color="A0A0A0" w:sz="4"/>
+            </w:tcBorders>
+            <w:tcMar>
+              <w:top w:type="dxa" w:w="60"/>
+              <w:left w:type="dxa" w:w="100"/>
+              <w:bottom w:type="dxa" w:w="60"/>
+              <w:right w:type="dxa" w:w="100"/>
+            </w:tcMar>
+          </w:tcPr>
+          <w:p>
+            <w:r>
+              <w:rPr>
+                <w:rFonts w:ascii="Calibri" w:cs="Calibri" w:eastAsia="Calibri" w:hAnsi="Calibri"/>
+                <w:b w:val="false"/>
+                <w:bCs w:val="false"/>
+                <w:sz w:val="18"/>
+                <w:szCs w:val="18"/>
+              </w:rPr>
+              <w:t xml:space="preserve">Sub-period BSW unskilled / skilled</w:t>
+            </w:r>
+          </w:p>
+        </w:tc>
+        <w:tc>
+          <w:tcPr>
+            <w:tcW w:type="dxa" w:w="3013"/>
+            <w:tcBorders>
+              <w:top w:val="single" w:color="A0A0A0" w:sz="4"/>
+              <w:left w:val="single" w:color="A0A0A0" w:sz="4"/>
+              <w:bottom w:val="single" w:color="A0A0A0" w:sz="4"/>
+              <w:right w:val="single" w:color="A0A0A0" w:sz="4"/>
+            </w:tcBorders>
+            <w:tcMar>
+              <w:top w:type="dxa" w:w="60"/>
+              <w:left w:type="dxa" w:w="100"/>
+              <w:bottom w:type="dxa" w:w="60"/>
+              <w:right w:type="dxa" w:w="100"/>
+            </w:tcMar>
+          </w:tcPr>
+          <w:p>
+            <w:r>
+              <w:rPr>
+                <w:rFonts w:ascii="Calibri" w:cs="Calibri" w:eastAsia="Calibri" w:hAnsi="Calibri"/>
+                <w:b w:val="false"/>
+                <w:bCs w:val="false"/>
+                <w:sz w:val="18"/>
+                <w:szCs w:val="18"/>
+              </w:rPr>
+              <w:t xml:space="preserve">P1 0.4/11.7; P2 −0.2/19.2; P3 23.9/−5.6</w:t>
+            </w:r>
+          </w:p>
+        </w:tc>
+        <w:tc>
+          <w:tcPr>
+            <w:tcW w:type="dxa" w:w="3013"/>
+            <w:tcBorders>
+              <w:top w:val="single" w:color="A0A0A0" w:sz="4"/>
+              <w:left w:val="single" w:color="A0A0A0" w:sz="4"/>
+              <w:bottom w:val="single" w:color="A0A0A0" w:sz="4"/>
+              <w:right w:val="single" w:color="A0A0A0" w:sz="4"/>
+            </w:tcBorders>
+            <w:tcMar>
+              <w:top w:type="dxa" w:w="60"/>
+              <w:left w:type="dxa" w:w="100"/>
+              <w:bottom w:type="dxa" w:w="60"/>
+              <w:right w:type="dxa" w:w="100"/>
+            </w:tcMar>
+          </w:tcPr>
+          <w:p>
+            <w:r>
+              <w:rPr>
+                <w:rFonts w:ascii="Calibri" w:cs="Calibri" w:eastAsia="Calibri" w:hAnsi="Calibri"/>
+                <w:b w:val="false"/>
+                <w:bCs w:val="false"/>
+                <w:sz w:val="18"/>
+                <w:szCs w:val="18"/>
+              </w:rPr>
+              <w:t xml:space="preserve">P1 8.1/8.1; P2 4.3/15.6; P3 24.8/−5.4</w:t>
+            </w:r>
+          </w:p>
+        </w:tc>
+      </w:tr>
+      <w:tr>
+        <w:trPr>
+          <w:tblHeader w:val="false"/>
+        </w:trPr>
+        <w:tc>
+          <w:tcPr>
+            <w:tcW w:type="dxa" w:w="3000"/>
+            <w:tcBorders>
+              <w:top w:val="single" w:color="A0A0A0" w:sz="4"/>
+              <w:left w:val="single" w:color="A0A0A0" w:sz="4"/>
+              <w:bottom w:val="single" w:color="A0A0A0" w:sz="4"/>
+              <w:right w:val="single" w:color="A0A0A0" w:sz="4"/>
+            </w:tcBorders>
+            <w:tcMar>
+              <w:top w:type="dxa" w:w="60"/>
+              <w:left w:type="dxa" w:w="100"/>
+              <w:bottom w:type="dxa" w:w="60"/>
+              <w:right w:type="dxa" w:w="100"/>
+            </w:tcMar>
+          </w:tcPr>
+          <w:p>
+            <w:r>
+              <w:rPr>
+                <w:rFonts w:ascii="Calibri" w:cs="Calibri" w:eastAsia="Calibri" w:hAnsi="Calibri"/>
+                <w:b w:val="false"/>
+                <w:bCs w:val="false"/>
+                <w:sz w:val="18"/>
+                <w:szCs w:val="18"/>
+              </w:rPr>
+              <w:t xml:space="preserve">P3 − P2 EW net (stacked)</w:t>
+            </w:r>
+          </w:p>
+        </w:tc>
+        <w:tc>
+          <w:tcPr>
+            <w:tcW w:type="dxa" w:w="3013"/>
+            <w:tcBorders>
+              <w:top w:val="single" w:color="A0A0A0" w:sz="4"/>
+              <w:left w:val="single" w:color="A0A0A0" w:sz="4"/>
+              <w:bottom w:val="single" w:color="A0A0A0" w:sz="4"/>
+              <w:right w:val="single" w:color="A0A0A0" w:sz="4"/>
+            </w:tcBorders>
+            <w:tcMar>
+              <w:top w:type="dxa" w:w="60"/>
+              <w:left w:type="dxa" w:w="100"/>
+              <w:bottom w:type="dxa" w:w="60"/>
+              <w:right w:type="dxa" w:w="100"/>
+            </w:tcMar>
+          </w:tcPr>
+          <w:p>
+            <w:r>
+              <w:rPr>
+                <w:rFonts w:ascii="Calibri" w:cs="Calibri" w:eastAsia="Calibri" w:hAnsi="Calibri"/>
+                <w:b w:val="false"/>
+                <w:bCs w:val="false"/>
+                <w:sz w:val="18"/>
+                <w:szCs w:val="18"/>
+              </w:rPr>
+              <w:t xml:space="preserve">−1.59* (p .051)</w:t>
+            </w:r>
+          </w:p>
+        </w:tc>
+        <w:tc>
+          <w:tcPr>
+            <w:tcW w:type="dxa" w:w="3013"/>
+            <w:tcBorders>
+              <w:top w:val="single" w:color="A0A0A0" w:sz="4"/>
+              <w:left w:val="single" w:color="A0A0A0" w:sz="4"/>
+              <w:bottom w:val="single" w:color="A0A0A0" w:sz="4"/>
+              <w:right w:val="single" w:color="A0A0A0" w:sz="4"/>
+            </w:tcBorders>
+            <w:tcMar>
+              <w:top w:type="dxa" w:w="60"/>
+              <w:left w:type="dxa" w:w="100"/>
+              <w:bottom w:type="dxa" w:w="60"/>
+              <w:right w:type="dxa" w:w="100"/>
+            </w:tcMar>
+          </w:tcPr>
+          <w:p>
+            <w:r>
+              <w:rPr>
+                <w:rFonts w:ascii="Calibri" w:cs="Calibri" w:eastAsia="Calibri" w:hAnsi="Calibri"/>
+                <w:b w:val="false"/>
+                <w:bCs w:val="false"/>
+                <w:sz w:val="18"/>
+                <w:szCs w:val="18"/>
+              </w:rPr>
+              <w:t xml:space="preserve">−1.16 (p .14)</w:t>
+            </w:r>
+          </w:p>
+        </w:tc>
+      </w:tr>
+      <w:tr>
+        <w:trPr>
+          <w:tblHeader w:val="false"/>
+        </w:trPr>
+        <w:tc>
+          <w:tcPr>
+            <w:tcW w:type="dxa" w:w="3000"/>
+            <w:tcBorders>
+              <w:top w:val="single" w:color="A0A0A0" w:sz="4"/>
+              <w:left w:val="single" w:color="A0A0A0" w:sz="4"/>
+              <w:bottom w:val="single" w:color="A0A0A0" w:sz="4"/>
+              <w:right w:val="single" w:color="A0A0A0" w:sz="4"/>
+            </w:tcBorders>
+            <w:tcMar>
+              <w:top w:type="dxa" w:w="60"/>
+              <w:left w:type="dxa" w:w="100"/>
+              <w:bottom w:type="dxa" w:w="60"/>
+              <w:right w:type="dxa" w:w="100"/>
+            </w:tcMar>
+          </w:tcPr>
+          <w:p>
+            <w:r>
+              <w:rPr>
+                <w:rFonts w:ascii="Calibri" w:cs="Calibri" w:eastAsia="Calibri" w:hAnsi="Calibri"/>
+                <w:b w:val="false"/>
+                <w:bCs w:val="false"/>
+                <w:sz w:val="18"/>
+                <w:szCs w:val="18"/>
+              </w:rPr>
+              <w:t xml:space="preserve">Bai–Perron breaks</w:t>
+            </w:r>
+          </w:p>
+        </w:tc>
+        <w:tc>
+          <w:tcPr>
+            <w:tcW w:type="dxa" w:w="3013"/>
+            <w:tcBorders>
+              <w:top w:val="single" w:color="A0A0A0" w:sz="4"/>
+              <w:left w:val="single" w:color="A0A0A0" w:sz="4"/>
+              <w:bottom w:val="single" w:color="A0A0A0" w:sz="4"/>
+              <w:right w:val="single" w:color="A0A0A0" w:sz="4"/>
+            </w:tcBorders>
+            <w:tcMar>
+              <w:top w:type="dxa" w:w="60"/>
+              <w:left w:type="dxa" w:w="100"/>
+              <w:bottom w:type="dxa" w:w="60"/>
+              <w:right w:type="dxa" w:w="100"/>
+            </w:tcMar>
+          </w:tcPr>
+          <w:p>
+            <w:r>
+              <w:rPr>
+                <w:rFonts w:ascii="Calibri" w:cs="Calibri" w:eastAsia="Calibri" w:hAnsi="Calibri"/>
+                <w:b w:val="false"/>
+                <w:bCs w:val="false"/>
+                <w:sz w:val="18"/>
+                <w:szCs w:val="18"/>
+              </w:rPr>
+              <w:t xml:space="preserve">7 BIC, unchanged</w:t>
+            </w:r>
+          </w:p>
+        </w:tc>
+        <w:tc>
+          <w:tcPr>
+            <w:tcW w:type="dxa" w:w="3013"/>
+            <w:tcBorders>
+              <w:top w:val="single" w:color="A0A0A0" w:sz="4"/>
+              <w:left w:val="single" w:color="A0A0A0" w:sz="4"/>
+              <w:bottom w:val="single" w:color="A0A0A0" w:sz="4"/>
+              <w:right w:val="single" w:color="A0A0A0" w:sz="4"/>
+            </w:tcBorders>
+            <w:tcMar>
+              <w:top w:type="dxa" w:w="60"/>
+              <w:left w:type="dxa" w:w="100"/>
+              <w:bottom w:type="dxa" w:w="60"/>
+              <w:right w:type="dxa" w:w="100"/>
+            </w:tcMar>
+          </w:tcPr>
+          <w:p>
+            <w:r>
+              <w:rPr>
+                <w:rFonts w:ascii="Calibri" w:cs="Calibri" w:eastAsia="Calibri" w:hAnsi="Calibri"/>
+                <w:b w:val="false"/>
+                <w:bCs w:val="false"/>
+                <w:sz w:val="18"/>
+                <w:szCs w:val="18"/>
+              </w:rPr>
+              <w:t xml:space="preserve">7 BIC, unchanged; BIC 603.5 vs 608.6 (5) / 613.3 (6); supF 13.81 (p .004), argmax Aug 2021</w:t>
+            </w:r>
+          </w:p>
+        </w:tc>
+      </w:tr>
+      <w:tr>
+        <w:trPr>
+          <w:tblHeader w:val="false"/>
+        </w:trPr>
+        <w:tc>
+          <w:tcPr>
+            <w:tcW w:type="dxa" w:w="3000"/>
+            <w:tcBorders>
+              <w:top w:val="single" w:color="A0A0A0" w:sz="4"/>
+              <w:left w:val="single" w:color="A0A0A0" w:sz="4"/>
+              <w:bottom w:val="single" w:color="A0A0A0" w:sz="4"/>
+              <w:right w:val="single" w:color="A0A0A0" w:sz="4"/>
+            </w:tcBorders>
+            <w:tcMar>
+              <w:top w:type="dxa" w:w="60"/>
+              <w:left w:type="dxa" w:w="100"/>
+              <w:bottom w:type="dxa" w:w="60"/>
+              <w:right w:type="dxa" w:w="100"/>
+            </w:tcMar>
+          </w:tcPr>
+          <w:p>
+            <w:r>
+              <w:rPr>
+                <w:rFonts w:ascii="Calibri" w:cs="Calibri" w:eastAsia="Calibri" w:hAnsi="Calibri"/>
+                <w:b w:val="false"/>
+                <w:bCs w:val="false"/>
+                <w:sz w:val="18"/>
+                <w:szCs w:val="18"/>
+              </w:rPr>
+              <w:t xml:space="preserve">Non-overlapping break test</w:t>
+            </w:r>
+          </w:p>
+        </w:tc>
+        <w:tc>
+          <w:tcPr>
+            <w:tcW w:type="dxa" w:w="3013"/>
+            <w:tcBorders>
+              <w:top w:val="single" w:color="A0A0A0" w:sz="4"/>
+              <w:left w:val="single" w:color="A0A0A0" w:sz="4"/>
+              <w:bottom w:val="single" w:color="A0A0A0" w:sz="4"/>
+              <w:right w:val="single" w:color="A0A0A0" w:sz="4"/>
+            </w:tcBorders>
+            <w:tcMar>
+              <w:top w:type="dxa" w:w="60"/>
+              <w:left w:type="dxa" w:w="100"/>
+              <w:bottom w:type="dxa" w:w="60"/>
+              <w:right w:type="dxa" w:w="100"/>
+            </w:tcMar>
+          </w:tcPr>
+          <w:p>
+            <w:r>
+              <w:rPr>
+                <w:rFonts w:ascii="Calibri" w:cs="Calibri" w:eastAsia="Calibri" w:hAnsi="Calibri"/>
+                <w:b w:val="false"/>
+                <w:bCs w:val="false"/>
+                <w:sz w:val="18"/>
+                <w:szCs w:val="18"/>
+              </w:rPr>
+              <w:t xml:space="preserve">BIC 0; supF 10.67 (p .019)</w:t>
+            </w:r>
+          </w:p>
+        </w:tc>
+        <w:tc>
+          <w:tcPr>
+            <w:tcW w:type="dxa" w:w="3013"/>
+            <w:tcBorders>
+              <w:top w:val="single" w:color="A0A0A0" w:sz="4"/>
+              <w:left w:val="single" w:color="A0A0A0" w:sz="4"/>
+              <w:bottom w:val="single" w:color="A0A0A0" w:sz="4"/>
+              <w:right w:val="single" w:color="A0A0A0" w:sz="4"/>
+            </w:tcBorders>
+            <w:tcMar>
+              <w:top w:type="dxa" w:w="60"/>
+              <w:left w:type="dxa" w:w="100"/>
+              <w:bottom w:type="dxa" w:w="60"/>
+              <w:right w:type="dxa" w:w="100"/>
+            </w:tcMar>
+          </w:tcPr>
+          <w:p>
+            <w:r>
+              <w:rPr>
+                <w:rFonts w:ascii="Calibri" w:cs="Calibri" w:eastAsia="Calibri" w:hAnsi="Calibri"/>
+                <w:b w:val="false"/>
+                <w:bCs w:val="false"/>
+                <w:sz w:val="18"/>
+                <w:szCs w:val="18"/>
+              </w:rPr>
+              <w:t xml:space="preserve">BIC 0; supF 7.77 (p .074), Aug 2019</w:t>
+            </w:r>
+          </w:p>
+        </w:tc>
+      </w:tr>
+      <w:tr>
+        <w:trPr>
+          <w:tblHeader w:val="false"/>
+        </w:trPr>
+        <w:tc>
+          <w:tcPr>
+            <w:tcW w:type="dxa" w:w="3000"/>
+            <w:tcBorders>
+              <w:top w:val="single" w:color="A0A0A0" w:sz="4"/>
+              <w:left w:val="single" w:color="A0A0A0" w:sz="4"/>
+              <w:bottom w:val="single" w:color="A0A0A0" w:sz="4"/>
+              <w:right w:val="single" w:color="A0A0A0" w:sz="4"/>
+            </w:tcBorders>
+            <w:tcMar>
+              <w:top w:type="dxa" w:w="60"/>
+              <w:left w:type="dxa" w:w="100"/>
+              <w:bottom w:type="dxa" w:w="60"/>
+              <w:right w:type="dxa" w:w="100"/>
+            </w:tcMar>
+          </w:tcPr>
+          <w:p>
+            <w:r>
+              <w:rPr>
+                <w:rFonts w:ascii="Calibri" w:cs="Calibri" w:eastAsia="Calibri" w:hAnsi="Calibri"/>
+                <w:b w:val="false"/>
+                <w:bCs w:val="false"/>
+                <w:sz w:val="18"/>
+                <w:szCs w:val="18"/>
+              </w:rPr>
+              <w:t xml:space="preserve">H1 joint p D_SENT / SENT⊥ / AAII</w:t>
+            </w:r>
+          </w:p>
+        </w:tc>
+        <w:tc>
+          <w:tcPr>
+            <w:tcW w:type="dxa" w:w="3013"/>
+            <w:tcBorders>
+              <w:top w:val="single" w:color="A0A0A0" w:sz="4"/>
+              <w:left w:val="single" w:color="A0A0A0" w:sz="4"/>
+              <w:bottom w:val="single" w:color="A0A0A0" w:sz="4"/>
+              <w:right w:val="single" w:color="A0A0A0" w:sz="4"/>
+            </w:tcBorders>
+            <w:tcMar>
+              <w:top w:type="dxa" w:w="60"/>
+              <w:left w:type="dxa" w:w="100"/>
+              <w:bottom w:type="dxa" w:w="60"/>
+              <w:right w:type="dxa" w:w="100"/>
+            </w:tcMar>
+          </w:tcPr>
+          <w:p>
+            <w:r>
+              <w:rPr>
+                <w:rFonts w:ascii="Calibri" w:cs="Calibri" w:eastAsia="Calibri" w:hAnsi="Calibri"/>
+                <w:b w:val="false"/>
+                <w:bCs w:val="false"/>
+                <w:sz w:val="18"/>
+                <w:szCs w:val="18"/>
+              </w:rPr>
+              <w:t xml:space="preserve">.055 / .009 / .005</w:t>
+            </w:r>
+          </w:p>
+        </w:tc>
+        <w:tc>
+          <w:tcPr>
+            <w:tcW w:type="dxa" w:w="3013"/>
+            <w:tcBorders>
+              <w:top w:val="single" w:color="A0A0A0" w:sz="4"/>
+              <w:left w:val="single" w:color="A0A0A0" w:sz="4"/>
+              <w:bottom w:val="single" w:color="A0A0A0" w:sz="4"/>
+              <w:right w:val="single" w:color="A0A0A0" w:sz="4"/>
+            </w:tcBorders>
+            <w:tcMar>
+              <w:top w:type="dxa" w:w="60"/>
+              <w:left w:type="dxa" w:w="100"/>
+              <w:bottom w:type="dxa" w:w="60"/>
+              <w:right w:type="dxa" w:w="100"/>
+            </w:tcMar>
+          </w:tcPr>
+          <w:p>
+            <w:r>
+              <w:rPr>
+                <w:rFonts w:ascii="Calibri" w:cs="Calibri" w:eastAsia="Calibri" w:hAnsi="Calibri"/>
+                <w:b w:val="false"/>
+                <w:bCs w:val="false"/>
+                <w:sz w:val="18"/>
+                <w:szCs w:val="18"/>
+              </w:rPr>
+              <w:t xml:space="preserve">.105 / .053 / .003</w:t>
+            </w:r>
+          </w:p>
+        </w:tc>
+      </w:tr>
+      <w:tr>
+        <w:trPr>
+          <w:tblHeader w:val="false"/>
+        </w:trPr>
+        <w:tc>
+          <w:tcPr>
+            <w:tcW w:type="dxa" w:w="3000"/>
+            <w:tcBorders>
+              <w:top w:val="single" w:color="A0A0A0" w:sz="4"/>
+              <w:left w:val="single" w:color="A0A0A0" w:sz="4"/>
+              <w:bottom w:val="single" w:color="A0A0A0" w:sz="4"/>
+              <w:right w:val="single" w:color="A0A0A0" w:sz="4"/>
+            </w:tcBorders>
+            <w:tcMar>
+              <w:top w:type="dxa" w:w="60"/>
+              <w:left w:type="dxa" w:w="100"/>
+              <w:bottom w:type="dxa" w:w="60"/>
+              <w:right w:type="dxa" w:w="100"/>
+            </w:tcMar>
+          </w:tcPr>
+          <w:p>
+            <w:r>
+              <w:rPr>
+                <w:rFonts w:ascii="Calibri" w:cs="Calibri" w:eastAsia="Calibri" w:hAnsi="Calibri"/>
+                <w:b w:val="false"/>
+                <w:bCs w:val="false"/>
+                <w:sz w:val="18"/>
+                <w:szCs w:val="18"/>
+              </w:rPr>
+              <w:t xml:space="preserve">H2 MD; H3 MAX12; H4</w:t>
+            </w:r>
+          </w:p>
+        </w:tc>
+        <w:tc>
+          <w:tcPr>
+            <w:tcW w:type="dxa" w:w="3013"/>
+            <w:tcBorders>
+              <w:top w:val="single" w:color="A0A0A0" w:sz="4"/>
+              <w:left w:val="single" w:color="A0A0A0" w:sz="4"/>
+              <w:bottom w:val="single" w:color="A0A0A0" w:sz="4"/>
+              <w:right w:val="single" w:color="A0A0A0" w:sz="4"/>
+            </w:tcBorders>
+            <w:tcMar>
+              <w:top w:type="dxa" w:w="60"/>
+              <w:left w:type="dxa" w:w="100"/>
+              <w:bottom w:type="dxa" w:w="60"/>
+              <w:right w:type="dxa" w:w="100"/>
+            </w:tcMar>
+          </w:tcPr>
+          <w:p>
+            <w:r>
+              <w:rPr>
+                <w:rFonts w:ascii="Calibri" w:cs="Calibri" w:eastAsia="Calibri" w:hAnsi="Calibri"/>
+                <w:b w:val="false"/>
+                <w:bCs w:val="false"/>
+                <w:sz w:val="18"/>
+                <w:szCs w:val="18"/>
+              </w:rPr>
+              <w:t xml:space="preserve">&lt;.001; .032; n.s.</w:t>
+            </w:r>
+          </w:p>
+        </w:tc>
+        <w:tc>
+          <w:tcPr>
+            <w:tcW w:type="dxa" w:w="3013"/>
+            <w:tcBorders>
+              <w:top w:val="single" w:color="A0A0A0" w:sz="4"/>
+              <w:left w:val="single" w:color="A0A0A0" w:sz="4"/>
+              <w:bottom w:val="single" w:color="A0A0A0" w:sz="4"/>
+              <w:right w:val="single" w:color="A0A0A0" w:sz="4"/>
+            </w:tcBorders>
+            <w:tcMar>
+              <w:top w:type="dxa" w:w="60"/>
+              <w:left w:type="dxa" w:w="100"/>
+              <w:bottom w:type="dxa" w:w="60"/>
+              <w:right w:type="dxa" w:w="100"/>
+            </w:tcMar>
+          </w:tcPr>
+          <w:p>
+            <w:r>
+              <w:rPr>
+                <w:rFonts w:ascii="Calibri" w:cs="Calibri" w:eastAsia="Calibri" w:hAnsi="Calibri"/>
+                <w:b w:val="false"/>
+                <w:bCs w:val="false"/>
+                <w:sz w:val="18"/>
+                <w:szCs w:val="18"/>
+              </w:rPr>
+              <w:t xml:space="preserve">&lt;.001; .023; n.s. (.157–.555)</w:t>
+            </w:r>
+          </w:p>
+        </w:tc>
+      </w:tr>
+    </w:tbl>
+    <w:p>
+      <w:pPr>
+        <w:spacing w:after="60"/>
+      </w:pPr>
+    </w:p>
+    <w:p>
+      <w:pPr>
+        <w:pStyle w:val="ListParagraph"/>
+        <w:numPr>
+          <w:ilvl w:val="0"/>
+          <w:numId w:val="2"/>
+        </w:numPr>
+        <w:spacing w:after="60"/>
+      </w:pPr>
+      <w:r>
+        <w:rPr>
+          <w:rFonts w:ascii="Calibri" w:cs="Calibri" w:eastAsia="Calibri" w:hAnsi="Calibri"/>
+          <w:sz w:val="20"/>
+          <w:szCs w:val="20"/>
+        </w:rPr>
+        <w:t xml:space="preserve">Tercile break test (rule: “mixed”): Aug 2010 shift T1 −0.73 (t −1.75), T2 −1.30 (t −3.42), T3 −1.70 (t −3.04), all −1.24 (t −3.10); T1−T3 +0.97 (t 2.01); sup-F T1 p .37 (no break), T2/T3 p &lt; .001. Deterioration concentrated among past winners, not a deepening of the left tail.</w:t>
+      </w:r>
+    </w:p>
+    <w:p>
+      <w:pPr>
+        <w:pStyle w:val="ListParagraph"/>
+        <w:numPr>
+          <w:ilvl w:val="0"/>
+          <w:numId w:val="2"/>
+        </w:numPr>
+        <w:spacing w:after="60"/>
+      </w:pPr>
+      <w:r>
+        <w:rPr>
+          <w:rFonts w:ascii="Calibri" w:cs="Calibri" w:eastAsia="Calibri" w:hAnsi="Calibri"/>
+          <w:sz w:val="20"/>
+          <w:szCs w:val="20"/>
+        </w:rPr>
+        <w:t xml:space="preserve">Same funds: S23 (1,062 funds) EW net change −1.42 (t −1.78, p .075); S123 (792) −1.43; within share 1.22 (&gt; 2/3 → “predominantly regime change”; composition offsets). S23 BSW skilled 18.6% → nil, unskilled 0.2% → 20.8%.</w:t>
+      </w:r>
+    </w:p>
+    <w:p>
+      <w:pPr>
+        <w:pStyle w:val="ListParagraph"/>
+        <w:numPr>
+          <w:ilvl w:val="0"/>
+          <w:numId w:val="2"/>
+        </w:numPr>
+        <w:spacing w:after="60"/>
+      </w:pPr>
+      <w:r>
+        <w:rPr>
+          <w:rFonts w:ascii="Calibri" w:cs="Calibri" w:eastAsia="Calibri" w:hAnsi="Calibri"/>
+          <w:sz w:val="20"/>
+          <w:szCs w:val="20"/>
+        </w:rPr>
+        <w:t xml:space="preserve">Value added: aggregate gross USD 11.3 bn/yr (t 1.28, n.s.); per fund life-weighted 11.6 m (t 2.85); median −0.4 m; 32% of funds positive; net aggregate −3.4 bn (n.s.); P1 47 m, P2 7.8 m, P3 6.7 m per fund; P3 net per fund −6.4 m (t −2.69).</w:t>
+      </w:r>
+    </w:p>
+    <w:p>
+      <w:pPr>
+        <w:pStyle w:val="ListParagraph"/>
+        <w:numPr>
+          <w:ilvl w:val="0"/>
+          <w:numId w:val="2"/>
+        </w:numPr>
+        <w:spacing w:after="60"/>
+      </w:pPr>
+      <w:r>
+        <w:rPr>
+          <w:rFonts w:ascii="Calibri" w:cs="Calibri" w:eastAsia="Calibri" w:hAnsi="Calibri"/>
+          <w:sz w:val="20"/>
+          <w:szCs w:val="20"/>
+        </w:rPr>
+        <w:t xml:space="preserve">Regime panel tests: AAII stable (change p .73); BW interactions significant before (.013) and after (&lt;.001) and different between them (&lt;.001); margin debt only after 2010 (pre .60, post &lt;.001, change .028); MAX12 neither period (.82 / .18), no change (.98). Stepwise: MAX12 significant only with fund FE (.41 / .50 → .023). TNA floor: H4 D_SENT rejects at 10% (1M floor) and 5% (no floor).</w:t>
+      </w:r>
+    </w:p>
+    <w:p>
+      <w:pPr>
+        <w:pStyle w:val="ListParagraph"/>
+        <w:numPr>
+          <w:ilvl w:val="0"/>
+          <w:numId w:val="2"/>
+        </w:numPr>
+        <w:spacing w:after="60"/>
+      </w:pPr>
+      <w:r>
+        <w:rPr>
+          <w:rFonts w:ascii="Calibri" w:cs="Calibri" w:eastAsia="Calibri" w:hAnsi="Calibri"/>
+          <w:sz w:val="20"/>
+          <w:szCs w:val="20"/>
+        </w:rPr>
+        <w:t xml:space="preserve">PPF native calibration: Q5−Q1 2.214% (t 2.39) → 277 bp per rank point (momentum comparison 2.278%, t 1.36, 285 bp); MAX12 R_MID 3 / 37 bp; difference 34 bp (one-sided p .010).</w:t>
+      </w:r>
+    </w:p>
+    <w:p>
+      <w:pPr>
+        <w:pStyle w:val="ListParagraph"/>
+        <w:numPr>
+          <w:ilvl w:val="0"/>
+          <w:numId w:val="2"/>
+        </w:numPr>
+        <w:spacing w:after="60"/>
+      </w:pPr>
+      <w:r>
+        <w:rPr>
+          <w:rFonts w:ascii="Calibri" w:cs="Calibri" w:eastAsia="Calibri" w:hAnsi="Calibri"/>
+          <w:sz w:val="20"/>
+          <w:szCs w:val="20"/>
+        </w:rPr>
+        <w:t xml:space="preserve">Counts: H1 aligned sample 322,162 fund-months, 2,311 funds, 22 styles, 306 months (computed from PC panel_reg.rds); H3 273,497 / 1,997 funds; incubation active 2,811, excluded_h3 194 → 2,617, excluded_perf 188 → 2,623; TNA switches 621; flow validation corr. 0.92 over 173,724; pooled-winsorisation clipping 92.5% / 75.0% / 64.8%; TD test 231 passive funds, LAD −1.005 / −0.005; screen 37 rows, all active (36) or passive (1).</w:t>
+      </w:r>
+    </w:p>
+    <w:p>
+      <w:pPr>
+        <w:pStyle w:val="Heading2"/>
+      </w:pPr>
+      <w:r>
+        <w:rPr>
+          <w:rFonts w:ascii="Calibri" w:cs="Calibri" w:eastAsia="Calibri" w:hAnsi="Calibri"/>
+        </w:rPr>
+        <w:t xml:space="preserve">§4. dissertation_main.tex — combined text update (6,529 → 7,247 lines)</w:t>
+      </w:r>
+    </w:p>
+    <w:p>
+      <w:pPr>
+        <w:pStyle w:val="ListParagraph"/>
+        <w:numPr>
+          <w:ilvl w:val="0"/>
+          <w:numId w:val="2"/>
+        </w:numPr>
+        <w:spacing w:after="60"/>
+      </w:pPr>
+      <w:r>
+        <w:rPr>
+          <w:rFonts w:ascii="Calibri" w:cs="Calibri" w:eastAsia="Calibri" w:hAnsi="Calibri"/>
+          <w:sz w:val="20"/>
+          <w:szCs w:val="20"/>
+        </w:rPr>
+        <w:t xml:space="preserve">All numbers updated (≈360 edits by chapter, then the flagged passages rewritten by hand; 117 flags worked through).</w:t>
+      </w:r>
+    </w:p>
+    <w:p>
+      <w:pPr>
+        <w:pStyle w:val="ListParagraph"/>
+        <w:numPr>
+          <w:ilvl w:val="0"/>
+          <w:numId w:val="2"/>
+        </w:numPr>
+        <w:spacing w:after="60"/>
+      </w:pPr>
+      <w:r>
+        <w:rPr>
+          <w:rFonts w:ascii="Calibri" w:cs="Calibri" w:eastAsia="Calibri" w:hAnsi="Calibri"/>
+          <w:sz w:val="20"/>
+          <w:szCs w:val="20"/>
+        </w:rPr>
+        <w:t xml:space="preserve">Abstract / Özet: numbers, regime sentence (“the decline concentrates in previously better funds”), H2 as funding-constraint channel; 249 words each by script.</w:t>
+      </w:r>
+    </w:p>
+    <w:p>
+      <w:pPr>
+        <w:pStyle w:val="ListParagraph"/>
+        <w:numPr>
+          <w:ilvl w:val="0"/>
+          <w:numId w:val="2"/>
+        </w:numPr>
+        <w:spacing w:after="60"/>
+      </w:pPr>
+      <w:r>
+        <w:rPr>
+          <w:rFonts w:ascii="Calibri" w:cs="Calibri" w:eastAsia="Calibri" w:hAnsi="Calibri"/>
+          <w:sz w:val="20"/>
+          <w:szCs w:val="20"/>
+        </w:rPr>
+        <w:t xml:space="preserve">Ch. 1: two edges, objectives, contributions (unskilled 8.1/4.3 → 24.8; tercile and same-fund results; H1 AAII-first, BW marginal; H2 relabelled; native PPF calibration; new methodological point on the vendor flag and survivorship).</w:t>
+      </w:r>
+    </w:p>
+    <w:p>
+      <w:pPr>
+        <w:pStyle w:val="ListParagraph"/>
+        <w:numPr>
+          <w:ilvl w:val="0"/>
+          <w:numId w:val="2"/>
+        </w:numPr>
+        <w:spacing w:after="60"/>
+      </w:pPr>
+      <w:r>
+        <w:rPr>
+          <w:rFonts w:ascii="Calibri" w:cs="Calibri" w:eastAsia="Calibri" w:hAnsi="Calibri"/>
+          <w:sz w:val="20"/>
+          <w:szCs w:val="20"/>
+        </w:rPr>
+        <w:t xml:space="preserve">Ch. 2: FF (2010) EW–VW comparison — net pattern no longer replicated (50 bp gap). Ch. 3: classification paragraph rewritten (rule, validation, review); counts. Bib: BrownGoetzmannIbbotsonRoss1992, EltonGruberBlake1996, CarhartCarpenterLynchMusto2002, DelGuercioTkac2002.</w:t>
+      </w:r>
+    </w:p>
+    <w:p>
+      <w:pPr>
+        <w:pStyle w:val="ListParagraph"/>
+        <w:numPr>
+          <w:ilvl w:val="0"/>
+          <w:numId w:val="2"/>
+        </w:numPr>
+        <w:spacing w:after="60"/>
+      </w:pPr>
+      <w:r>
+        <w:rPr>
+          <w:rFonts w:ascii="Calibri" w:cs="Calibri" w:eastAsia="Calibri" w:hAnsi="Calibri"/>
+          <w:sz w:val="20"/>
+          <w:szCs w:val="20"/>
+        </w:rPr>
+        <w:t xml:space="preserve">Ch. 4: descriptives rewritten (fund-level mean gap = short-lived left tail; pooled fund-month means equal); Unknown paragraph replaced by survivorship paragraph; EW–VW gap discussed; size (no gradient), fee (significant negative EW gross gradient), activeness (net MR at 10%), persistence (D10 5%, Panel F 5%, T3 10%) corrected; bootstrap right tail; sub-period section rewritten; new subsections Tercile break test and Same funds across regimes; new section Dollar value added.</w:t>
+      </w:r>
+    </w:p>
+    <w:p>
+      <w:pPr>
+        <w:pStyle w:val="ListParagraph"/>
+        <w:numPr>
+          <w:ilvl w:val="0"/>
+          <w:numId w:val="2"/>
+        </w:numPr>
+        <w:spacing w:after="60"/>
+      </w:pPr>
+      <w:r>
+        <w:rPr>
+          <w:rFonts w:ascii="Calibri" w:cs="Calibri" w:eastAsia="Calibri" w:hAnsi="Calibri"/>
+          <w:sz w:val="20"/>
+          <w:szCs w:val="20"/>
+        </w:rPr>
+        <w:t xml:space="preserve">Ch. 5: H1 rewritten (AAII 1%, SENT⊥ 10%, D_SENT n.s.); H2 relabelled as a funding-constraint friction, post-2010 only (A2); H3 limits — MAX12 alone (B7), fund FE needed, regime; H4 rank-1.0 effect ≈ 0, η sign under D_SENT; PPF calibration rewritten (B6); uncertainty section softened; new Section “Behavioral effects before and after 2010” (table_regime_pooled); synthesis rewritten: two psychological channels (AAII, MAX12) + one friction (margin debt), H4 null.</w:t>
+      </w:r>
+    </w:p>
+    <w:p>
+      <w:pPr>
+        <w:pStyle w:val="ListParagraph"/>
+        <w:numPr>
+          <w:ilvl w:val="0"/>
+          <w:numId w:val="2"/>
+        </w:numPr>
+        <w:spacing w:after="60"/>
+      </w:pPr>
+      <w:r>
+        <w:rPr>
+          <w:rFonts w:ascii="Calibri" w:cs="Calibri" w:eastAsia="Calibri" w:hAnsi="Calibri"/>
+          <w:sz w:val="20"/>
+          <w:szCs w:val="20"/>
+        </w:rPr>
+        <w:t xml:space="preserve">Ch. 6–7: EW–VW (costs, not gross); value added now estimated; Reading 3 (composition) tested — little support; readings 1–2 not separable; A3 hedge (skilled share 8–16% pre-2010; aggregate change n.s.); limitations: precision (aggregate change n.s.), classification paragraph, new eighth limitation (primary share class only, no clientele split — B8b/C10); future research rewritten (entrant/exit characteristics; holdings for readings 1–2; clientele split); conclusion and summary of findings updated.</w:t>
+      </w:r>
+    </w:p>
+    <w:p>
+      <w:pPr>
+        <w:pStyle w:val="ListParagraph"/>
+        <w:numPr>
+          <w:ilvl w:val="0"/>
+          <w:numId w:val="2"/>
+        </w:numPr>
+        <w:spacing w:after="60"/>
+      </w:pPr>
+      <w:r>
+        <w:rPr>
+          <w:rFonts w:ascii="Calibri" w:cs="Calibri" w:eastAsia="Calibri" w:hAnsi="Calibri"/>
+          <w:sz w:val="20"/>
+          <w:szCs w:val="20"/>
+        </w:rPr>
+        <w:t xml:space="preserve">Appendices: A — new section “Classification of funds without a Bloomberg flag” (rule, validation table, review, exclusions, effect) + table_classification_robustness; Step 6 wording; clipping 92/75/65. B — 105 NA Lipper funds (17 reclassified active, no flow rank). C — counts 194/2,617, 188/2,623; unknown_classification exclusions. G — rewritten incl. G.1 (FF-window EW net −1.49 worse than full sample because the window holds most closed, mostly small, unflagged funds). H — BIC numbers, regime-3 wording, non-overlap supF 7.77, sub-period text, new sections with tercile dates table + figure and same_sample_skill. I — VW net significance, active–passive FF6 wording, unskilled ×1.5 (not doubled). J — horizon paragraph corrected; new section with regime_separate, regime_pooled_fe, stepwise, tna_floor (H4 floor sensitivity disclosed). K — clipping, screen description (15 / 10 / 12), change-log rows (unflagged funds, native PPF), reconciliation narrative (BW weaker than draft).</w:t>
+      </w:r>
+    </w:p>
+    <w:p>
+      <w:pPr>
+        <w:pStyle w:val="ListParagraph"/>
+        <w:numPr>
+          <w:ilvl w:val="0"/>
+          <w:numId w:val="2"/>
+        </w:numPr>
+        <w:spacing w:after="60"/>
+      </w:pPr>
+      <w:r>
+        <w:rPr>
+          <w:rFonts w:ascii="Calibri" w:cs="Calibri" w:eastAsia="Calibri" w:hAnsi="Calibri"/>
+          <w:sz w:val="20"/>
+          <w:szCs w:val="20"/>
+        </w:rPr>
+        <w:t xml:space="preserve">Compile (container, XeLaTeX + biber, TeX Gyre Termes / Latin Modern Math substitutes): 0 errors, 0 undefined references/citations, 270 pp; overfull boxes as before (61 vs 63). Written to D:\TEZ (md5 verified, LF). Not yet committed.</w:t>
+      </w:r>
+    </w:p>
+    <w:p>
+      <w:pPr>
+        <w:pStyle w:val="Heading2"/>
+      </w:pPr>
+      <w:r>
+        <w:rPr>
+          <w:rFonts w:ascii="Calibri" w:cs="Calibri" w:eastAsia="Calibri" w:hAnsi="Calibri"/>
+        </w:rPr>
+        <w:t xml:space="preserve">§5. Project docs written</w:t>
+      </w:r>
+    </w:p>
+    <w:p>
+      <w:pPr>
+        <w:pStyle w:val="ListParagraph"/>
+        <w:numPr>
+          <w:ilvl w:val="0"/>
+          <w:numId w:val="2"/>
+        </w:numPr>
+        <w:spacing w:after="60"/>
+      </w:pPr>
+      <w:r>
+        <w:rPr>
+          <w:rFonts w:ascii="Calibri" w:cs="Calibri" w:eastAsia="Calibri" w:hAnsi="Calibri"/>
+          <w:sz w:val="20"/>
+          <w:szCs w:val="20"/>
+        </w:rPr>
+        <w:t xml:space="preserve">claude/precommit_defense_extensions_2026-10-15.md; claude/defense_extensions_STATUS_2026-10-15.md; claude/precommit_unknown_reclassification_2026-10-16.md; claude/defense_extensions_STATUS_2026-10-16.md; claude/text_update_STATUS_2026-10-16.md.</w:t>
+      </w:r>
+    </w:p>
+    <w:p>
+      <w:pPr>
+        <w:pStyle w:val="Heading2"/>
+      </w:pPr>
+      <w:r>
+        <w:rPr>
+          <w:rFonts w:ascii="Calibri" w:cs="Calibri" w:eastAsia="Calibri" w:hAnsi="Calibri"/>
+        </w:rPr>
+        <w:t xml:space="preserve">§6. To do (future work list)</w:t>
+      </w:r>
+    </w:p>
+    <w:p>
+      <w:pPr>
+        <w:spacing w:after="100"/>
+      </w:pPr>
+      <w:r>
+        <w:rPr>
+          <w:rFonts w:ascii="Calibri" w:cs="Calibri" w:eastAsia="Calibri" w:hAnsi="Calibri"/>
+          <w:sz w:val="20"/>
+          <w:szCs w:val="20"/>
+        </w:rPr>
+        <w:t xml:space="preserve">A. Raised at the end of the text update (16 Oct):</w:t>
+      </w:r>
+    </w:p>
+    <w:p>
+      <w:pPr>
+        <w:pStyle w:val="ListParagraph"/>
+        <w:numPr>
+          <w:ilvl w:val="0"/>
+          <w:numId w:val="2"/>
+        </w:numPr>
+        <w:spacing w:after="60"/>
+      </w:pPr>
+      <w:r>
+        <w:rPr>
+          <w:rFonts w:ascii="Calibri" w:cs="Calibri" w:eastAsia="Calibri" w:hAnsi="Calibri"/>
+          <w:sz w:val="20"/>
+          <w:szCs w:val="20"/>
+        </w:rPr>
+        <w:t xml:space="preserve">Citation check — DelGuercioTkac2008 (“Star Power”, Morningstar ratings, JFQA 2008) is cited for retail vs institutional fee sensitivity (Ch. 2 ~line 1639; H4 intro ~4090). The clientele comparison is Del Guercio &amp; Tkac (2002, JFQA 37(4)), now in the bib and used in the new Limitations sentence. Decide whether to replace or add the 2002 citation in the two existing sentences.</w:t>
+      </w:r>
+    </w:p>
+    <w:p>
+      <w:pPr>
+        <w:pStyle w:val="ListParagraph"/>
+        <w:numPr>
+          <w:ilvl w:val="0"/>
+          <w:numId w:val="2"/>
+        </w:numPr>
+        <w:spacing w:after="60"/>
+      </w:pPr>
+      <w:r>
+        <w:rPr>
+          <w:rFonts w:ascii="Calibri" w:cs="Calibri" w:eastAsia="Calibri" w:hAnsi="Calibri"/>
+          <w:sz w:val="20"/>
+          <w:szCs w:val="20"/>
+        </w:rPr>
+        <w:t xml:space="preserve">H4 TNA-floor sensitivity — H4 D_SENT joint test rejects at 10% with a USD 1M floor and at 5% without a floor (n.s. at the USD 5M baseline). Disclosed in Appendix J; prepare a jury answer (sub-scale share classes; optionally inspect which funds drive it).</w:t>
+      </w:r>
+    </w:p>
+    <w:p>
+      <w:pPr>
+        <w:pStyle w:val="ListParagraph"/>
+        <w:numPr>
+          <w:ilvl w:val="0"/>
+          <w:numId w:val="2"/>
+        </w:numPr>
+        <w:spacing w:after="60"/>
+      </w:pPr>
+      <w:r>
+        <w:rPr>
+          <w:rFonts w:ascii="Calibri" w:cs="Calibri" w:eastAsia="Calibri" w:hAnsi="Calibri"/>
+          <w:sz w:val="20"/>
+          <w:szCs w:val="20"/>
+        </w:rPr>
+        <w:t xml:space="preserve">Ch. 3 ~line 1757: “Russell Midcap substitutes for the S&amp;P MidCap 400 for 31 funds (17 of which carry the H3 benchmark-required flag)” — verify the 31 / 17 counts after the reclassification (80 new H3 exclusions).</w:t>
+      </w:r>
+    </w:p>
+    <w:p>
+      <w:pPr>
+        <w:spacing w:after="100"/>
+      </w:pPr>
+      <w:r>
+        <w:rPr>
+          <w:rFonts w:ascii="Calibri" w:cs="Calibri" w:eastAsia="Calibri" w:hAnsi="Calibri"/>
+          <w:sz w:val="20"/>
+          <w:szCs w:val="20"/>
+        </w:rPr>
+        <w:t xml:space="preserve">B. Other items:</w:t>
+      </w:r>
+    </w:p>
+    <w:p>
+      <w:pPr>
+        <w:pStyle w:val="ListParagraph"/>
+        <w:numPr>
+          <w:ilvl w:val="0"/>
+          <w:numId w:val="2"/>
+        </w:numPr>
+        <w:spacing w:after="60"/>
+      </w:pPr>
+      <w:r>
+        <w:rPr>
+          <w:rFonts w:ascii="Calibri" w:cs="Calibri" w:eastAsia="Calibri" w:hAnsi="Calibri"/>
+          <w:sz w:val="20"/>
+          <w:szCs w:val="20"/>
+        </w:rPr>
+        <w:t xml:space="preserve">Commit dissertation_main.tex and dissertation.bib, pull into Overleaf, compile with the real fonts (Times New Roman, Libertinus Math) and check page breaks of the new tables/figure and the rendered abstract length (≤ 250 words).</w:t>
+      </w:r>
+    </w:p>
+    <w:p>
+      <w:pPr>
+        <w:pStyle w:val="ListParagraph"/>
+        <w:numPr>
+          <w:ilvl w:val="0"/>
+          <w:numId w:val="2"/>
+        </w:numPr>
+        <w:spacing w:after="60"/>
+      </w:pPr>
+      <w:r>
+        <w:rPr>
+          <w:rFonts w:ascii="Calibri" w:cs="Calibri" w:eastAsia="Calibri" w:hAnsi="Calibri"/>
+          <w:sz w:val="20"/>
+          <w:szCs w:val="20"/>
+        </w:rPr>
+        <w:t xml:space="preserve">Read the new and rewritten passages once on paper (sub-period section with the tercile and same-fund subsections, Dollar value added, H1–H3 sections, “Behavioral effects before and after 2010”, synthesis, Appendix A classification section, Discussion post-2010 readings, conclusion). They were written in one pass; tone and repetition need a human check.</w:t>
+      </w:r>
+    </w:p>
+    <w:p>
+      <w:pPr>
+        <w:pStyle w:val="ListParagraph"/>
+        <w:numPr>
+          <w:ilvl w:val="0"/>
+          <w:numId w:val="2"/>
+        </w:numPr>
+        <w:spacing w:after="60"/>
+      </w:pPr>
+      <w:r>
+        <w:rPr>
+          <w:rFonts w:ascii="Calibri" w:cs="Calibri" w:eastAsia="Calibri" w:hAnsi="Calibri"/>
+          <w:sz w:val="20"/>
+          <w:szCs w:val="20"/>
+        </w:rPr>
+        <w:t xml:space="preserve">Classification ledger: the manual review of the 99 boundary funds was delegated (Ömer accepted it without inspecting each decision). Skim the 12 changes in unknown_classification_ledger.xlsx so you can answer a jury question on them.</w:t>
+      </w:r>
+    </w:p>
+    <w:p>
+      <w:pPr>
+        <w:pStyle w:val="ListParagraph"/>
+        <w:numPr>
+          <w:ilvl w:val="0"/>
+          <w:numId w:val="2"/>
+        </w:numPr>
+        <w:spacing w:after="60"/>
+      </w:pPr>
+      <w:r>
+        <w:rPr>
+          <w:rFonts w:ascii="Calibri" w:cs="Calibri" w:eastAsia="Calibri" w:hAnsi="Calibri"/>
+          <w:sz w:val="20"/>
+          <w:szCs w:val="20"/>
+        </w:rPr>
+        <w:t xml:space="preserve">Optional robustness on the classification: a third column in table_classification_robustness with a looser passive rule (e.g. R² ≥ 0.95 or TE ≤ 2%) — would show how sensitive the EW results are to residual index funds among the reclassified actives. The text argues the bias goes against the findings; this would document it.</w:t>
+      </w:r>
+    </w:p>
+    <w:p>
+      <w:pPr>
+        <w:pStyle w:val="ListParagraph"/>
+        <w:numPr>
+          <w:ilvl w:val="0"/>
+          <w:numId w:val="2"/>
+        </w:numPr>
+        <w:spacing w:after="60"/>
+      </w:pPr>
+      <w:r>
+        <w:rPr>
+          <w:rFonts w:ascii="Calibri" w:cs="Calibri" w:eastAsia="Calibri" w:hAnsi="Calibri"/>
+          <w:sz w:val="20"/>
+          <w:szCs w:val="20"/>
+        </w:rPr>
+        <w:t xml:space="preserve">Optional (post hoc, disclose): a non-overlapping version of the tercile shift test (stacked regression of monthly tercile-portfolio returns, as for the same-fund test). The rolling-series t-statistics (HAC 35 on overlapping windows) likely overstate precision; the text says so, but a monthly test would close the gap between “significant in rolling series” and “n.s. in monthly returns”.</w:t>
+      </w:r>
+    </w:p>
+    <w:p>
+      <w:pPr>
+        <w:pStyle w:val="ListParagraph"/>
+        <w:numPr>
+          <w:ilvl w:val="0"/>
+          <w:numId w:val="2"/>
+        </w:numPr>
+        <w:spacing w:after="60"/>
+      </w:pPr>
+      <w:r>
+        <w:rPr>
+          <w:rFonts w:ascii="Calibri" w:cs="Calibri" w:eastAsia="Calibri" w:hAnsi="Calibri"/>
+          <w:sz w:val="20"/>
+          <w:szCs w:val="20"/>
+        </w:rPr>
+        <w:t xml:space="preserve">Future research item 1 can be done before submission with existing data: characteristics (age, size, ER, activeness) of entering, exiting and surviving funds at the 2010 boundary, and why post-2010 entrants did better than the funds they joined (composition component +0.26).</w:t>
+      </w:r>
+    </w:p>
+    <w:p>
+      <w:pPr>
+        <w:pStyle w:val="ListParagraph"/>
+        <w:numPr>
+          <w:ilvl w:val="0"/>
+          <w:numId w:val="2"/>
+        </w:numPr>
+        <w:spacing w:after="60"/>
+      </w:pPr>
+      <w:r>
+        <w:rPr>
+          <w:rFonts w:ascii="Calibri" w:cs="Calibri" w:eastAsia="Calibri" w:hAnsi="Calibri"/>
+          <w:sz w:val="20"/>
+          <w:szCs w:val="20"/>
+        </w:rPr>
+        <w:t xml:space="preserve">Jury preparation: the Baker–Wurgler H1 evidence weakened through the survivorship correction (SENT⊥ p .009 → .053; D_SENT .055 → .105) and is regime-unstable; be ready to explain why the behavioral case now rests on AAII (contemporaneous) and MAX12 (fund FE).</w:t>
+      </w:r>
+    </w:p>
+    <w:p>
+      <w:pPr>
+        <w:pStyle w:val="ListParagraph"/>
+        <w:numPr>
+          <w:ilvl w:val="0"/>
+          <w:numId w:val="2"/>
+        </w:numPr>
+        <w:spacing w:after="60"/>
+      </w:pPr>
+      <w:r>
+        <w:rPr>
+          <w:rFonts w:ascii="Calibri" w:cs="Calibri" w:eastAsia="Calibri" w:hAnsi="Calibri"/>
+          <w:sz w:val="20"/>
+          <w:szCs w:val="20"/>
+        </w:rPr>
+        <w:t xml:space="preserve">Value added uses in-sample Carhart loadings, not Vanguard index-fund benchmarks as in BvB (2015); stated in the table note. Expect the question; an out-of-sample-beta variant is possible with existing data.</w:t>
+      </w:r>
+    </w:p>
+    <w:p>
+      <w:pPr>
+        <w:pStyle w:val="ListParagraph"/>
+        <w:numPr>
+          <w:ilvl w:val="0"/>
+          <w:numId w:val="2"/>
+        </w:numPr>
+        <w:spacing w:after="60"/>
+      </w:pPr>
+      <w:r>
+        <w:rPr>
+          <w:rFonts w:ascii="Calibri" w:cs="Calibri" w:eastAsia="Calibri" w:hAnsi="Calibri"/>
+          <w:sz w:val="20"/>
+          <w:szCs w:val="20"/>
+        </w:rPr>
+        <w:t xml:space="preserve">Keep data/R import/results_bloomberg_only/ (classification_robustness.R reads it). Deletable: data/R import/_tex_audit/old_tables and bundle.tar; data/R import/JLN_uncertainty/fund_data_new.xlsx.</w:t>
+      </w:r>
+    </w:p>
+    <w:p>
+      <w:pPr>
+        <w:pStyle w:val="ListParagraph"/>
+        <w:numPr>
+          <w:ilvl w:val="0"/>
+          <w:numId w:val="2"/>
+        </w:numPr>
+        <w:spacing w:after="60"/>
+      </w:pPr>
+      <w:r>
+        <w:rPr>
+          <w:rFonts w:ascii="Calibri" w:cs="Calibri" w:eastAsia="Calibri" w:hAnsi="Calibri"/>
+          <w:sz w:val="20"/>
+          <w:szCs w:val="20"/>
+        </w:rPr>
+        <w:t xml:space="preserve">Still open from earlier sessions: proofread Özet; CV / Acknowledgments / Dedication placeholders (kept by Ömer); PLS_SENT row and D_PLS clean-up; “PRIMARY = lagged” comments in panel_regressions_setup.R, H1, H2; the R warnings of the 5 Oct rerun; unused UMCSENT/VIX variables; legacy master_output.tex; second panel_regressions_methodology.docx; Sibley et al. (2016) reference not verified; renv lock / R upgrade (libdeflate).</w:t>
+      </w:r>
+    </w:p>
+    <w:p>
+      <w:pPr>
+        <w:pStyle w:val="Heading1"/>
+      </w:pPr>
+      <w:r>
+        <w:rPr>
+          <w:rFonts w:ascii="Calibri" w:cs="Calibri" w:eastAsia="Calibri" w:hAnsi="Calibri"/>
+        </w:rPr>
         <w:t xml:space="preserve">Current Key Pipeline &amp; Dissertation Facts</w:t>
       </w:r>
     </w:p>
@@ -13009,7 +14975,7 @@
           <w:sz w:val="20"/>
           <w:szCs w:val="20"/>
         </w:rPr>
-        <w:t xml:space="preserve">Last updated: 15 October 2026 (evening) — AAII table, abstracts, defense-suggestion plan.</w:t>
+        <w:t xml:space="preserve">Last updated: 16 October 2026 (night) — unflagged funds reclassified, defense extensions, combined text update.</w:t>
       </w:r>
     </w:p>
     <w:tbl>
@@ -13248,7 +15214,7 @@
                 <w:sz w:val="18"/>
                 <w:szCs w:val="18"/>
               </w:rPr>
-              <w:t xml:space="preserve">Analytical active / passive / unknown (incubation)</w:t>
+              <w:t xml:space="preserve">Incubation panel active / passive / unknown</w:t>
             </w:r>
           </w:p>
         </w:tc>
@@ -13277,7 +15243,7 @@
                 <w:sz w:val="18"/>
                 <w:szCs w:val="18"/>
               </w:rPr>
-              <w:t xml:space="preserve">2,124 / 284 / 709</w:t>
+              <w:t xml:space="preserve">2,866 / 305 / 34 (before exclusions; Unknown = unflagged entire-analysis exclusions only); active after exclusions 2,811</w:t>
             </w:r>
           </w:p>
         </w:tc>
@@ -13340,7 +15306,7 @@
                 <w:sz w:val="18"/>
                 <w:szCs w:val="18"/>
               </w:rPr>
-              <w:t xml:space="preserve">1,962; 1,813</w:t>
+              <w:t xml:space="preserve">2,571; 2,255</w:t>
             </w:r>
           </w:p>
         </w:tc>
@@ -13403,7 +15369,7 @@
                 <w:sz w:val="18"/>
                 <w:szCs w:val="18"/>
               </w:rPr>
-              <w:t xml:space="preserve">P1 776 / P2 1,029 / P3 1,811</w:t>
+              <w:t xml:space="preserve">P1 1,094 / P2 1,231 / P3 1,878 (per-fund, ≥24 months)</w:t>
             </w:r>
           </w:p>
         </w:tc>
@@ -13466,7 +15432,7 @@
                 <w:sz w:val="18"/>
                 <w:szCs w:val="18"/>
               </w:rPr>
-              <w:t xml:space="preserve">Bloomberg: return index (net), TNA, flows, ER, turnover, AM flag; LSEG: benchmarks, Lipper codes, behavioral proxies; FRED: JLN uncertainty</w:t>
+              <w:t xml:space="preserve">Bloomberg: return index (net), TNA, flows, ER, turnover, AM flag; LSEG: benchmarks, Lipper codes, behavioral proxies; FRED: JLN uncertainty, CPI-U. Unflagged funds (969) classified by rule + review: 950 Active, 19 Passive</w:t>
             </w:r>
           </w:p>
         </w:tc>
@@ -13592,7 +15558,7 @@
                 <w:sz w:val="18"/>
                 <w:szCs w:val="18"/>
               </w:rPr>
-              <w:t xml:space="preserve">+0.237 / +0.030 (n.s.)</w:t>
+              <w:t xml:space="preserve">−0.086 / +0.020 (n.s.)</w:t>
             </w:r>
           </w:p>
         </w:tc>
@@ -13655,7 +15621,7 @@
                 <w:sz w:val="18"/>
                 <w:szCs w:val="18"/>
               </w:rPr>
-              <w:t xml:space="preserve">−0.809* (t −1.71) / −0.655 (t −1.62)</w:t>
+              <w:t xml:space="preserve">−1.168*** (t −2.62) / −0.668* (t −1.66); Bloomberg-flag-only: −0.809* / −0.655</w:t>
             </w:r>
           </w:p>
         </w:tc>
@@ -13718,7 +15684,7 @@
                 <w:sz w:val="18"/>
                 <w:szCs w:val="18"/>
               </w:rPr>
-              <w:t xml:space="preserve">−0.642** / −0.058</w:t>
+              <w:t xml:space="preserve">−0.642** / −0.059</w:t>
             </w:r>
           </w:p>
         </w:tc>
@@ -13781,7 +15747,7 @@
                 <w:sz w:val="18"/>
                 <w:szCs w:val="18"/>
               </w:rPr>
-              <w:t xml:space="preserve">Consistent with luck (1st pct Prob. Luck 9.9%)</w:t>
+              <w:t xml:space="preserve">Consistent with luck at 5% (1st / 5th / 10th pct Prob. Luck 5.8 / 9.2 / 6.3%)</w:t>
             </w:r>
           </w:p>
         </w:tc>
@@ -13844,7 +15810,7 @@
                 <w:sz w:val="18"/>
                 <w:szCs w:val="18"/>
               </w:rPr>
-              <w:t xml:space="preserve">86.0% / 11.4% / 1.7%</w:t>
+              <w:t xml:space="preserve">83.4% / 15.2% / 0.8%</w:t>
             </w:r>
           </w:p>
         </w:tc>
@@ -13907,7 +15873,7 @@
                 <w:sz w:val="18"/>
                 <w:szCs w:val="18"/>
               </w:rPr>
-              <w:t xml:space="preserve">BIC 7: Mar 2000 / Mar 2003 / Mar 2006 / Aug 2010 / Dec 2015 / Jan 2019 / Jan 2022; full-sample HAC CIs; supF 15.01 (p .002)</w:t>
+              <w:t xml:space="preserve">BIC 7: Mar 2000 / Mar 2003 / Mar 2006 / Aug 2010 / Dec 2015 / Jan 2019 / Jan 2022; full-sample HAC CIs; supF 13.81 (p .004); non-overlapping: BIC 0, supF 7.77 (p .074, Aug 2019)</w:t>
             </w:r>
           </w:p>
         </w:tc>
@@ -13970,7 +15936,7 @@
                 <w:sz w:val="18"/>
                 <w:szCs w:val="18"/>
               </w:rPr>
-              <w:t xml:space="preserve">P1 −0.715 / P2 −0.165 / P3 −1.752*** (VW P3 −0.992***)</w:t>
+              <w:t xml:space="preserve">P1 −1.229 / P2 −0.649 / P3 −1.805*** (VW P3 −0.994***); P3−P2 −1.16 (p .14); same funds −1.42 (p .075)</w:t>
             </w:r>
           </w:p>
         </w:tc>
@@ -14033,7 +15999,7 @@
                 <w:sz w:val="18"/>
                 <w:szCs w:val="18"/>
               </w:rPr>
-              <w:t xml:space="preserve">87.1 / 80.9 / 80.6</w:t>
+              <w:t xml:space="preserve">83.4 / 80.1 / 79.7; BSW unskilled/skilled P1 8.1/8.1, P2 4.3/15.6, P3 24.8/−5.4</w:t>
             </w:r>
           </w:p>
         </w:tc>
@@ -14096,7 +16062,7 @@
                 <w:sz w:val="18"/>
                 <w:szCs w:val="18"/>
               </w:rPr>
-              <w:t xml:space="preserve">N 805; π̂0 88.9%; π− 3.7% / π+ 6.3%</w:t>
+              <w:t xml:space="preserve">N 1,363 (BSW 1,138); EW net −1.49*; π̂0 84.9%; π− 11.4% / π+ 3.2%</w:t>
             </w:r>
           </w:p>
         </w:tc>
@@ -14159,7 +16125,7 @@
                 <w:sz w:val="18"/>
                 <w:szCs w:val="18"/>
               </w:rPr>
-              <w:t xml:space="preserve">FF6 π̂0 77.8%, π− 21.1%; C+PSL π̂0 86.9%, π− 9.0%</w:t>
+              <w:t xml:space="preserve">FF6 π̂0 76.0%, π− 23.0%; C+PSL π̂0 85.0%, π− 12.7%</w:t>
             </w:r>
           </w:p>
         </w:tc>
@@ -14222,7 +16188,7 @@
                 <w:sz w:val="18"/>
                 <w:szCs w:val="18"/>
               </w:rPr>
-              <w:t xml:space="preserve">D10 −0.113%/m (t −1.81, p_LB .056); P1 −0.285 (p .015); cross-regime −0.138 (p .022)</w:t>
+              <w:t xml:space="preserve">D10 −0.136%/m (t −2.09, p_LB .040); P1 −0.290 (p .002); cross-regime −0.201 (p .020), spread p .049</w:t>
             </w:r>
           </w:p>
         </w:tc>
@@ -14285,7 +16251,7 @@
                 <w:sz w:val="18"/>
                 <w:szCs w:val="18"/>
               </w:rPr>
-              <w:t xml:space="preserve">MR p_up 1−R² EW gross .017 / net .031; T1 D1 −0.190 (p_B .009)</w:t>
+              <w:t xml:space="preserve">MR p_up 1−R² EW gross .028 / net .061; T1 D1 −0.192 (p_B .016), T1 spread −0.079 (p_B .095)</w:t>
             </w:r>
           </w:p>
         </w:tc>
@@ -14348,7 +16314,7 @@
                 <w:sz w:val="18"/>
                 <w:szCs w:val="18"/>
               </w:rPr>
-              <w:t xml:space="preserve">Jan 1998 – Sep 2025; H1/H2 306,150; H3 261,329; H4 305,079</w:t>
+              <w:t xml:space="preserve">Jan 1998 – Sep 2025; H1/H2 322,150 (2,311 funds); H3 273,486 (1,997); H4 321,086</w:t>
             </w:r>
           </w:p>
         </w:tc>
@@ -14411,7 +16377,7 @@
                 <w:sz w:val="18"/>
                 <w:szCs w:val="18"/>
               </w:rPr>
-              <w:t xml:space="preserve">7.64 (.054) / 11.54 (.009) / 12.91 (.005); AAII asym z 1.91 (.028)</w:t>
+              <w:t xml:space="preserve">6.15 (.105) / 7.68 (.053) / 14.08 (.003); AAII asym z 2.69 (.004)</w:t>
             </w:r>
           </w:p>
         </w:tc>
@@ -14474,7 +16440,7 @@
                 <w:sz w:val="18"/>
                 <w:szCs w:val="18"/>
               </w:rPr>
-              <w:t xml:space="preserve">MD 17.34 (&lt;.001), loser z +2.09; MAX12 6.84 (.033), amp z 1.91; H4 n.s.</w:t>
+              <w:t xml:space="preserve">MD 19.15 (&lt;.001), loser z +2.43 (post-2010 only); MAX12 7.57 (.023), amp z 2.06 (fund FE only); H4 n.s. (.157–.555; D_SENT rejects without TNA floor)</w:t>
             </w:r>
           </w:p>
         </w:tc>
@@ -14537,7 +16503,7 @@
                 <w:sz w:val="18"/>
                 <w:szCs w:val="18"/>
               </w:rPr>
-              <w:t xml:space="preserve">D_SENT .056 → .178; SENT⊥ .009 → .057; AAII .005 → .005; MD &lt;.001 → .002; H3 MAX12 amp z 1.91 → 1.84; PPF Diff p .011 → .026</w:t>
+              <w:t xml:space="preserve">D_SENT .106 → .330; SENT⊥ .052 → .213; AAII .003 → .003; MD &lt;.001 → &lt;.001; H3 MAX12 amp z 2.06 → 1.95; PPF Diff p .010 → .023</w:t>
             </w:r>
           </w:p>
         </w:tc>
@@ -14600,7 +16566,7 @@
                 <w:sz w:val="18"/>
                 <w:szCs w:val="18"/>
               </w:rPr>
-              <w:t xml:space="preserve">Calibration 2.171% (t 1.28) → 271 bp/rank point; MAX12 R_MID 3 / 36 bp; Diff p .011</w:t>
+              <w:t xml:space="preserve">Native rank-space calibration 2.214% (t 2.39) → 277 bp/rank point; MAX12 R_MID 3 / 37 bp; Diff 34 bp, p .010</w:t>
             </w:r>
           </w:p>
         </w:tc>
@@ -14634,7 +16600,7 @@
                 <w:sz w:val="18"/>
                 <w:szCs w:val="18"/>
               </w:rPr>
-              <w:t xml:space="preserve">dissertation_main.tex</w:t>
+              <w:t xml:space="preserve">Value added (BvB 2015, 2025 USD)</w:t>
             </w:r>
           </w:p>
         </w:tc>
@@ -14663,7 +16629,7 @@
                 <w:sz w:val="18"/>
                 <w:szCs w:val="18"/>
               </w:rPr>
-              <w:t xml:space="preserve">6,444 lines; Appendices A–K (J.4 uncertainty); 0 undefined refs (container build)</w:t>
+              <w:t xml:space="preserve">Per fund 11.6 m/yr (t 2.85); aggregate 11.3 bn (n.s.); net aggregate −3.4 bn (n.s.); 32% of funds positive</w:t>
             </w:r>
           </w:p>
         </w:tc>
@@ -14697,6 +16663,195 @@
                 <w:sz w:val="18"/>
                 <w:szCs w:val="18"/>
               </w:rPr>
+              <w:t xml:space="preserve">Tercile break test / same funds</w:t>
+            </w:r>
+          </w:p>
+        </w:tc>
+        <w:tc>
+          <w:tcPr>
+            <w:tcW w:type="dxa" w:w="5826"/>
+            <w:tcBorders>
+              <w:top w:val="single" w:color="A0A0A0" w:sz="4"/>
+              <w:left w:val="single" w:color="A0A0A0" w:sz="4"/>
+              <w:bottom w:val="single" w:color="A0A0A0" w:sz="4"/>
+              <w:right w:val="single" w:color="A0A0A0" w:sz="4"/>
+            </w:tcBorders>
+            <w:tcMar>
+              <w:top w:type="dxa" w:w="60"/>
+              <w:left w:type="dxa" w:w="100"/>
+              <w:bottom w:type="dxa" w:w="60"/>
+              <w:right w:type="dxa" w:w="100"/>
+            </w:tcMar>
+          </w:tcPr>
+          <w:p>
+            <w:r>
+              <w:rPr>
+                <w:rFonts w:ascii="Calibri" w:cs="Calibri" w:eastAsia="Calibri" w:hAnsi="Calibri"/>
+                <w:b w:val="false"/>
+                <w:bCs w:val="false"/>
+                <w:sz w:val="18"/>
+                <w:szCs w:val="18"/>
+              </w:rPr>
+              <w:t xml:space="preserve">Mixed: Aug 2010 shift T1 −0.73 (10%), T2 −1.30***, T3 −1.70***; T1 no sup-F break; S23 (1,062 funds) −1.42 (p .075), within share 1.22</w:t>
+            </w:r>
+          </w:p>
+        </w:tc>
+      </w:tr>
+      <w:tr>
+        <w:trPr>
+          <w:tblHeader w:val="false"/>
+        </w:trPr>
+        <w:tc>
+          <w:tcPr>
+            <w:tcW w:type="dxa" w:w="3200"/>
+            <w:tcBorders>
+              <w:top w:val="single" w:color="A0A0A0" w:sz="4"/>
+              <w:left w:val="single" w:color="A0A0A0" w:sz="4"/>
+              <w:bottom w:val="single" w:color="A0A0A0" w:sz="4"/>
+              <w:right w:val="single" w:color="A0A0A0" w:sz="4"/>
+            </w:tcBorders>
+            <w:tcMar>
+              <w:top w:type="dxa" w:w="60"/>
+              <w:left w:type="dxa" w:w="100"/>
+              <w:bottom w:type="dxa" w:w="60"/>
+              <w:right w:type="dxa" w:w="100"/>
+            </w:tcMar>
+          </w:tcPr>
+          <w:p>
+            <w:r>
+              <w:rPr>
+                <w:rFonts w:ascii="Calibri" w:cs="Calibri" w:eastAsia="Calibri" w:hAnsi="Calibri"/>
+                <w:b w:val="false"/>
+                <w:bCs w:val="false"/>
+                <w:sz w:val="18"/>
+                <w:szCs w:val="18"/>
+              </w:rPr>
+              <w:t xml:space="preserve">Classification robustness</w:t>
+            </w:r>
+          </w:p>
+        </w:tc>
+        <w:tc>
+          <w:tcPr>
+            <w:tcW w:type="dxa" w:w="5826"/>
+            <w:tcBorders>
+              <w:top w:val="single" w:color="A0A0A0" w:sz="4"/>
+              <w:left w:val="single" w:color="A0A0A0" w:sz="4"/>
+              <w:bottom w:val="single" w:color="A0A0A0" w:sz="4"/>
+              <w:right w:val="single" w:color="A0A0A0" w:sz="4"/>
+            </w:tcBorders>
+            <w:tcMar>
+              <w:top w:type="dxa" w:w="60"/>
+              <w:left w:type="dxa" w:w="100"/>
+              <w:bottom w:type="dxa" w:w="60"/>
+              <w:right w:type="dxa" w:w="100"/>
+            </w:tcMar>
+          </w:tcPr>
+          <w:p>
+            <w:r>
+              <w:rPr>
+                <w:rFonts w:ascii="Calibri" w:cs="Calibri" w:eastAsia="Calibri" w:hAnsi="Calibri"/>
+                <w:b w:val="false"/>
+                <w:bCs w:val="false"/>
+                <w:sz w:val="18"/>
+                <w:szCs w:val="18"/>
+              </w:rPr>
+              <w:t xml:space="preserve">table_classification_robustness (App. A); baseline outputs in data/R import/results_bloomberg_only/</w:t>
+            </w:r>
+          </w:p>
+        </w:tc>
+      </w:tr>
+      <w:tr>
+        <w:trPr>
+          <w:tblHeader w:val="false"/>
+        </w:trPr>
+        <w:tc>
+          <w:tcPr>
+            <w:tcW w:type="dxa" w:w="3200"/>
+            <w:tcBorders>
+              <w:top w:val="single" w:color="A0A0A0" w:sz="4"/>
+              <w:left w:val="single" w:color="A0A0A0" w:sz="4"/>
+              <w:bottom w:val="single" w:color="A0A0A0" w:sz="4"/>
+              <w:right w:val="single" w:color="A0A0A0" w:sz="4"/>
+            </w:tcBorders>
+            <w:tcMar>
+              <w:top w:type="dxa" w:w="60"/>
+              <w:left w:type="dxa" w:w="100"/>
+              <w:bottom w:type="dxa" w:w="60"/>
+              <w:right w:type="dxa" w:w="100"/>
+            </w:tcMar>
+          </w:tcPr>
+          <w:p>
+            <w:r>
+              <w:rPr>
+                <w:rFonts w:ascii="Calibri" w:cs="Calibri" w:eastAsia="Calibri" w:hAnsi="Calibri"/>
+                <w:b w:val="false"/>
+                <w:bCs w:val="false"/>
+                <w:sz w:val="18"/>
+                <w:szCs w:val="18"/>
+              </w:rPr>
+              <w:t xml:space="preserve">dissertation_main.tex</w:t>
+            </w:r>
+          </w:p>
+        </w:tc>
+        <w:tc>
+          <w:tcPr>
+            <w:tcW w:type="dxa" w:w="5826"/>
+            <w:tcBorders>
+              <w:top w:val="single" w:color="A0A0A0" w:sz="4"/>
+              <w:left w:val="single" w:color="A0A0A0" w:sz="4"/>
+              <w:bottom w:val="single" w:color="A0A0A0" w:sz="4"/>
+              <w:right w:val="single" w:color="A0A0A0" w:sz="4"/>
+            </w:tcBorders>
+            <w:tcMar>
+              <w:top w:type="dxa" w:w="60"/>
+              <w:left w:type="dxa" w:w="100"/>
+              <w:bottom w:type="dxa" w:w="60"/>
+              <w:right w:type="dxa" w:w="100"/>
+            </w:tcMar>
+          </w:tcPr>
+          <w:p>
+            <w:r>
+              <w:rPr>
+                <w:rFonts w:ascii="Calibri" w:cs="Calibri" w:eastAsia="Calibri" w:hAnsi="Calibri"/>
+                <w:b w:val="false"/>
+                <w:bCs w:val="false"/>
+                <w:sz w:val="18"/>
+                <w:szCs w:val="18"/>
+              </w:rPr>
+              <w:t xml:space="preserve">7,247 lines (16 Oct, not yet committed); Appendices A–K; new A section on unflagged funds; 0 undefined refs (container build, 270 pp)</w:t>
+            </w:r>
+          </w:p>
+        </w:tc>
+      </w:tr>
+      <w:tr>
+        <w:trPr>
+          <w:tblHeader w:val="false"/>
+        </w:trPr>
+        <w:tc>
+          <w:tcPr>
+            <w:tcW w:type="dxa" w:w="3200"/>
+            <w:tcBorders>
+              <w:top w:val="single" w:color="A0A0A0" w:sz="4"/>
+              <w:left w:val="single" w:color="A0A0A0" w:sz="4"/>
+              <w:bottom w:val="single" w:color="A0A0A0" w:sz="4"/>
+              <w:right w:val="single" w:color="A0A0A0" w:sz="4"/>
+            </w:tcBorders>
+            <w:tcMar>
+              <w:top w:type="dxa" w:w="60"/>
+              <w:left w:type="dxa" w:w="100"/>
+              <w:bottom w:type="dxa" w:w="60"/>
+              <w:right w:type="dxa" w:w="100"/>
+            </w:tcMar>
+          </w:tcPr>
+          <w:p>
+            <w:r>
+              <w:rPr>
+                <w:rFonts w:ascii="Calibri" w:cs="Calibri" w:eastAsia="Calibri" w:hAnsi="Calibri"/>
+                <w:b w:val="false"/>
+                <w:bCs w:val="false"/>
+                <w:sz w:val="18"/>
+                <w:szCs w:val="18"/>
+              </w:rPr>
               <w:t xml:space="preserve">Key script versions</w:t>
             </w:r>
           </w:p>
@@ -14726,7 +16881,7 @@
                 <w:sz w:val="18"/>
                 <w:szCs w:val="18"/>
               </w:rPr>
-              <w:t xml:space="preserve">data_import v1.7; flow v1.3; panel_regressions_setup v1.6; behavioral_state_variables v1.3; persistence v1.4; activeness_persistence v1.3; psychological_premium v1.4; structural_break v1.4; panel_regressions_reporting v1.2; uncertainty_robustness v1.2; master_pipeline v1.7</w:t>
+              <w:t xml:space="preserve">data_import v1.8; flow v1.3; panel_regressions_setup v1.7; behavioral_state_variables v1.3; persistence v1.4; activeness_persistence v1.3; psychological_premium v1.5; structural_break v1.4; panel_regressions_reporting v1.2; uncertainty_robustness v1.3; master_pipeline v1.9; new: breaktest_terciles, same_sample_subperiods, value_added, panel_regime_stepwise, classify_unknown_funds, classification_robustness</w:t>
             </w:r>
           </w:p>
         </w:tc>

</xml_diff>

<commit_message>
Master log: 17-18 Oct session; remove AD 470 HW5 images
</commit_message>
<xml_diff>
--- a/dissertation_master_log.docx
+++ b/dissertation_master_log.docx
@@ -14959,6 +14959,533 @@
         <w:rPr>
           <w:rFonts w:ascii="Calibri" w:cs="Calibri" w:eastAsia="Calibri" w:hAnsi="Calibri"/>
         </w:rPr>
+        <w:t xml:space="preserve">Session: 17–18 October 2026 — Math fonts, final audit, audit items 1–6, full rerun, text update</w:t>
+      </w:r>
+    </w:p>
+    <w:p>
+      <w:pPr>
+        <w:pStyle w:val="Heading2"/>
+      </w:pPr>
+      <w:r>
+        <w:rPr>
+          <w:rFonts w:ascii="Calibri" w:cs="Calibri" w:eastAsia="Calibri" w:hAnsi="Calibri"/>
+        </w:rPr>
+        <w:t xml:space="preserve">§1. Typesetting and citation (17 Oct)</w:t>
+      </w:r>
+    </w:p>
+    <w:p>
+      <w:pPr>
+        <w:pStyle w:val="ListParagraph"/>
+        <w:numPr>
+          <w:ilvl w:val="0"/>
+          <w:numId w:val="2"/>
+        </w:numPr>
+        <w:spacing w:after="60"/>
+      </w:pPr>
+      <w:r>
+        <w:rPr>
+          <w:rFonts w:ascii="Calibri" w:cs="Calibri" w:eastAsia="Calibri" w:hAnsi="Calibri"/>
+          <w:sz w:val="20"/>
+          <w:szCs w:val="20"/>
+        </w:rPr>
+        <w:t xml:space="preserve">Math fonts: all math letters, digits and operators set in Times New Roman (unicode-math range overrides; minus via \DeclareSymbolFont{tnrtext} + \Umathcode in \AtBeginDocument; math-active asterisk; \let\phi\varphi because Times New Roman lacks U+03D5).</w:t>
+      </w:r>
+    </w:p>
+    <w:p>
+      <w:pPr>
+        <w:pStyle w:val="ListParagraph"/>
+        <w:numPr>
+          <w:ilvl w:val="0"/>
+          <w:numId w:val="2"/>
+        </w:numPr>
+        <w:spacing w:after="60"/>
+      </w:pPr>
+      <w:r>
+        <w:rPr>
+          <w:rFonts w:ascii="Calibri" w:cs="Calibri" w:eastAsia="Calibri" w:hAnsi="Calibri"/>
+          <w:sz w:val="20"/>
+          <w:szCs w:val="20"/>
+        </w:rPr>
+        <w:t xml:space="preserve">Citation: DelGuercioTkac2008 replaced where the clientele comparison is meant (Del Guercio and Tkac 2002).</w:t>
+      </w:r>
+    </w:p>
+    <w:p>
+      <w:pPr>
+        <w:pStyle w:val="Heading2"/>
+      </w:pPr>
+      <w:r>
+        <w:rPr>
+          <w:rFonts w:ascii="Calibri" w:cs="Calibri" w:eastAsia="Calibri" w:hAnsi="Calibri"/>
+        </w:rPr>
+        <w:t xml:space="preserve">§2. Final audit of Dissertation 9.0 and all scripts (17 Oct)</w:t>
+      </w:r>
+    </w:p>
+    <w:p>
+      <w:pPr>
+        <w:pStyle w:val="ListParagraph"/>
+        <w:numPr>
+          <w:ilvl w:val="0"/>
+          <w:numId w:val="2"/>
+        </w:numPr>
+        <w:spacing w:after="60"/>
+      </w:pPr>
+      <w:r>
+        <w:rPr>
+          <w:rFonts w:ascii="Calibri" w:cs="Calibri" w:eastAsia="Calibri" w:hAnsi="Calibri"/>
+          <w:sz w:val="20"/>
+          <w:szCs w:val="20"/>
+        </w:rPr>
+        <w:t xml:space="preserve">Text: Fama–French (2010) four-factor net alphas corrected to −0.92 (EW) / −1.00 (VW) in 3 places; Ch. 1–2 literature corrections (Cheng et al. 2025, Odean 1998 instead of Grinblatt–Keloharju 2009, Kosowski et al., Wermers 2000, Kacperczyk–Sialm–Zheng 2008, Pástor–Stambaugh–Taylor 2015, Ben-Rephael et al. / Indro, Chevalier–Ellison, Goldstein et al., Berk–Green mechanics); abstract 3,542 funds; Özet grammar; Ch. 3 lottery proxies on net returns, bootstrap minimum 8 observations, 1,028 unflagged funds (969 classified, 59 not); MAX12 regime caveat; Appendix J section on regime, stepwise and TNA-floor tables; overflowing tables H.7, K.4 and H2 longtable fixed; List of Figures restored.</w:t>
+      </w:r>
+    </w:p>
+    <w:p>
+      <w:pPr>
+        <w:pStyle w:val="ListParagraph"/>
+        <w:numPr>
+          <w:ilvl w:val="0"/>
+          <w:numId w:val="2"/>
+        </w:numPr>
+        <w:spacing w:after="60"/>
+      </w:pPr>
+      <w:r>
+        <w:rPr>
+          <w:rFonts w:ascii="Calibri" w:cs="Calibri" w:eastAsia="Calibri" w:hAnsi="Calibri"/>
+          <w:sz w:val="20"/>
+          <w:szCs w:val="20"/>
+        </w:rPr>
+        <w:t xml:space="preserve">Scripts: stale 'Unknown' table notes removed; N formatted with {,}; H2 footer rows kept on one page and test labels made explicit; factor-NA filters in aggregate_alphas.R; classify_unknown_funds.R selects unflagged funds by the Bloomberg flag (latent bug); master_pipeline.R sets AP_CLASSIFICATION explicitly and clears test-mode leftovers and old H1–H4 model objects; note fixes in several table builders; new diagnostics/gap_and_er_check.R.</w:t>
+      </w:r>
+    </w:p>
+    <w:p>
+      <w:pPr>
+        <w:pStyle w:val="ListParagraph"/>
+        <w:numPr>
+          <w:ilvl w:val="0"/>
+          <w:numId w:val="2"/>
+        </w:numPr>
+        <w:spacing w:after="60"/>
+      </w:pPr>
+      <w:r>
+        <w:rPr>
+          <w:rFonts w:ascii="Calibri" w:cs="Calibri" w:eastAsia="Calibri" w:hAnsi="Calibri"/>
+          <w:sz w:val="20"/>
+          <w:szCs w:val="20"/>
+        </w:rPr>
+        <w:t xml:space="preserve">Diagnostic: no internal gaps in fund histories (620,682 master fund-months); 48 active funds (2,395 fund-months, 0.56%) and 2 passive funds lack an expense ratio.</w:t>
+      </w:r>
+    </w:p>
+    <w:p>
+      <w:pPr>
+        <w:pStyle w:val="Heading2"/>
+      </w:pPr>
+      <w:r>
+        <w:rPr>
+          <w:rFonts w:ascii="Calibri" w:cs="Calibri" w:eastAsia="Calibri" w:hAnsi="Calibri"/>
+        </w:rPr>
+        <w:t xml:space="preserve">§3. Audit items 1–6 (Ömer: fix all, full rerun)</w:t>
+      </w:r>
+    </w:p>
+    <w:p>
+      <w:pPr>
+        <w:pStyle w:val="ListParagraph"/>
+        <w:numPr>
+          <w:ilvl w:val="0"/>
+          <w:numId w:val="2"/>
+        </w:numPr>
+        <w:spacing w:after="60"/>
+      </w:pPr>
+      <w:r>
+        <w:rPr>
+          <w:rFonts w:ascii="Calibri" w:cs="Calibri" w:eastAsia="Calibri" w:hAnsi="Calibri"/>
+          <w:sz w:val="20"/>
+          <w:szCs w:val="20"/>
+        </w:rPr>
+        <w:t xml:space="preserve">1. Funds without an expense ratio have no gross return and had dropped out of the net series too. Portfolios, N and factor series now built on net-return rows (aggregate_alphas, portfolio_sorts, activeness_analysis incl. TE input, FF_comparison, subperiod_analysis, same_sample_subperiods, alpha_estimation_robust, diagnostics/return_treatment_robustness). Gross series cover funds with an ER; table notes say so. Lipper table (gross only) counts gross funds. Fund-level alphas, bootstrap, BSW and value added stay gross by design.</w:t>
+      </w:r>
+    </w:p>
+    <w:p>
+      <w:pPr>
+        <w:pStyle w:val="ListParagraph"/>
+        <w:numPr>
+          <w:ilvl w:val="0"/>
+          <w:numId w:val="2"/>
+        </w:numPr>
+        <w:spacing w:after="60"/>
+      </w:pPr>
+      <w:r>
+        <w:rPr>
+          <w:rFonts w:ascii="Calibri" w:cs="Calibri" w:eastAsia="Calibri" w:hAnsi="Calibri"/>
+          <w:sz w:val="20"/>
+          <w:szCs w:val="20"/>
+        </w:rPr>
+        <w:t xml:space="preserve">2. Psychological-premium rank calibration restricted to the H3 sample (!excluded_h3).</w:t>
+      </w:r>
+    </w:p>
+    <w:p>
+      <w:pPr>
+        <w:pStyle w:val="ListParagraph"/>
+        <w:numPr>
+          <w:ilvl w:val="0"/>
+          <w:numId w:val="2"/>
+        </w:numPr>
+        <w:spacing w:after="60"/>
+      </w:pPr>
+      <w:r>
+        <w:rPr>
+          <w:rFonts w:ascii="Calibri" w:cs="Calibri" w:eastAsia="Calibri" w:hAnsi="Calibri"/>
+          <w:sz w:val="20"/>
+          <w:szCs w:val="20"/>
+        </w:rPr>
+        <w:t xml:space="preserve">3. Calendar-step guard: return, tna_lag and flow set to NA after a gap of more than one month (no effect on current data).</w:t>
+      </w:r>
+    </w:p>
+    <w:p>
+      <w:pPr>
+        <w:pStyle w:val="ListParagraph"/>
+        <w:numPr>
+          <w:ilvl w:val="0"/>
+          <w:numId w:val="2"/>
+        </w:numPr>
+        <w:spacing w:after="60"/>
+      </w:pPr>
+      <w:r>
+        <w:rPr>
+          <w:rFonts w:ascii="Calibri" w:cs="Calibri" w:eastAsia="Calibri" w:hAnsi="Calibri"/>
+          <w:sz w:val="20"/>
+          <w:szCs w:val="20"/>
+        </w:rPr>
+        <w:t xml:space="preserve">4. Classification R²/TE test on net returns (identical to gross; ER static). Second bug found in the rerun: the script read the post-Step-8c panel, which had already lost the unflagged funds this file excludes (959 instead of 969, entire 0). Fixed: base = panel_master_pre8c minus the flagged_funds entire-analysis list.</w:t>
+      </w:r>
+    </w:p>
+    <w:p>
+      <w:pPr>
+        <w:pStyle w:val="ListParagraph"/>
+        <w:numPr>
+          <w:ilvl w:val="0"/>
+          <w:numId w:val="2"/>
+        </w:numPr>
+        <w:spacing w:after="60"/>
+      </w:pPr>
+      <w:r>
+        <w:rPr>
+          <w:rFonts w:ascii="Calibri" w:cs="Calibri" w:eastAsia="Calibri" w:hAnsi="Calibri"/>
+          <w:sz w:val="20"/>
+          <w:szCs w:val="20"/>
+        </w:rPr>
+        <w:t xml:space="preserve">5. parse_inception_date reads ISO strings and Excel serials element-wise.</w:t>
+      </w:r>
+    </w:p>
+    <w:p>
+      <w:pPr>
+        <w:pStyle w:val="ListParagraph"/>
+        <w:numPr>
+          <w:ilvl w:val="0"/>
+          <w:numId w:val="2"/>
+        </w:numPr>
+        <w:spacing w:after="60"/>
+      </w:pPr>
+      <w:r>
+        <w:rPr>
+          <w:rFonts w:ascii="Calibri" w:cs="Calibri" w:eastAsia="Calibri" w:hAnsi="Calibri"/>
+          <w:sz w:val="20"/>
+          <w:szCs w:val="20"/>
+        </w:rPr>
+        <w:t xml:space="preserve">6. Patton–Timmermann test: observed alphas on the months common to all quintiles (the bootstrap sample); table note updated.</w:t>
+      </w:r>
+    </w:p>
+    <w:p>
+      <w:pPr>
+        <w:pStyle w:val="ListParagraph"/>
+        <w:numPr>
+          <w:ilvl w:val="0"/>
+          <w:numId w:val="2"/>
+        </w:numPr>
+        <w:spacing w:after="60"/>
+      </w:pPr>
+      <w:r>
+        <w:rPr>
+          <w:rFonts w:ascii="Calibri" w:cs="Calibri" w:eastAsia="Calibri" w:hAnsi="Calibri"/>
+          <w:sz w:val="20"/>
+          <w:szCs w:val="20"/>
+        </w:rPr>
+        <w:t xml:space="preserve">Rerun issues fixed on the way: same_sample_subperiods ew_gross mean without na.rm (singular regression); FF_comparison and subperiod_analysis had pre-filtered on gross returns, so item 1 had no effect there until separate net-return frames were added.</w:t>
+      </w:r>
+    </w:p>
+    <w:p>
+      <w:pPr>
+        <w:pStyle w:val="Heading2"/>
+      </w:pPr>
+      <w:r>
+        <w:rPr>
+          <w:rFonts w:ascii="Calibri" w:cs="Calibri" w:eastAsia="Calibri" w:hAnsi="Calibri"/>
+        </w:rPr>
+        <w:t xml:space="preserve">§4. Result changes (full rerun 17 Oct, all 31 scripts OK)</w:t>
+      </w:r>
+    </w:p>
+    <w:p>
+      <w:pPr>
+        <w:pStyle w:val="ListParagraph"/>
+        <w:numPr>
+          <w:ilvl w:val="0"/>
+          <w:numId w:val="2"/>
+        </w:numPr>
+        <w:spacing w:after="60"/>
+      </w:pPr>
+      <w:r>
+        <w:rPr>
+          <w:rFonts w:ascii="Calibri" w:cs="Calibri" w:eastAsia="Calibri" w:hAnsi="Calibri"/>
+          <w:sz w:val="20"/>
+          <w:szCs w:val="20"/>
+        </w:rPr>
+        <w:t xml:space="preserve">Active N 2,571 → 2,619; EW net −1.168 (t −2.62) → −1.230 (t −2.79); passive EW net −0.642 → −0.647; A+P −1.116 → −1.174.</w:t>
+      </w:r>
+    </w:p>
+    <w:p>
+      <w:pPr>
+        <w:pStyle w:val="ListParagraph"/>
+        <w:numPr>
+          <w:ilvl w:val="0"/>
+          <w:numId w:val="2"/>
+        </w:numPr>
+        <w:spacing w:after="60"/>
+      </w:pPr>
+      <w:r>
+        <w:rPr>
+          <w:rFonts w:ascii="Calibri" w:cs="Calibri" w:eastAsia="Calibri" w:hAnsi="Calibri"/>
+          <w:sz w:val="20"/>
+          <w:szCs w:val="20"/>
+        </w:rPr>
+        <w:t xml:space="preserve">FF subperiod EW net −1.49 (t −1.88, 10%) → −1.62 (t −2.07, 5%). FF6 −1.37 → −1.42 (t −3.33); Carhart+PSL −1.19 → −1.25.</w:t>
+      </w:r>
+    </w:p>
+    <w:p>
+      <w:pPr>
+        <w:pStyle w:val="ListParagraph"/>
+        <w:numPr>
+          <w:ilvl w:val="0"/>
+          <w:numId w:val="2"/>
+        </w:numPr>
+        <w:spacing w:after="60"/>
+      </w:pPr>
+      <w:r>
+        <w:rPr>
+          <w:rFonts w:ascii="Calibri" w:cs="Calibri" w:eastAsia="Calibri" w:hAnsi="Calibri"/>
+          <w:sz w:val="20"/>
+          <w:szCs w:val="20"/>
+        </w:rPr>
+        <w:t xml:space="preserve">Sub-periods: P1 EW net −1.23 → −1.36 (now 10%); P2 −0.65 → −0.70; P3 unchanged (−1.81***). P2→P3 fall 1.16 → 1.10 (p .15); same funds S23 1,066 (alphas on 1,062) −1.42 (p .072), S123 794 (792) −1.44; within share 1.29.</w:t>
+      </w:r>
+    </w:p>
+    <w:p>
+      <w:pPr>
+        <w:pStyle w:val="ListParagraph"/>
+        <w:numPr>
+          <w:ilvl w:val="0"/>
+          <w:numId w:val="2"/>
+        </w:numPr>
+        <w:spacing w:after="60"/>
+      </w:pPr>
+      <w:r>
+        <w:rPr>
+          <w:rFonts w:ascii="Calibri" w:cs="Calibri" w:eastAsia="Calibri" w:hAnsi="Calibri"/>
+          <w:sz w:val="20"/>
+          <w:szCs w:val="20"/>
+        </w:rPr>
+        <w:t xml:space="preserve">PPF 277 → 295 bp per rank-point (spread 2.363%, t 2.40); MAX12 middle segment 3 / 39 bp, difference 36 bp (p .010); with uncertainty control 7 / 47 bp.</w:t>
+      </w:r>
+    </w:p>
+    <w:p>
+      <w:pPr>
+        <w:pStyle w:val="ListParagraph"/>
+        <w:numPr>
+          <w:ilvl w:val="0"/>
+          <w:numId w:val="2"/>
+        </w:numPr>
+        <w:spacing w:after="60"/>
+      </w:pPr>
+      <w:r>
+        <w:rPr>
+          <w:rFonts w:ascii="Calibri" w:cs="Calibri" w:eastAsia="Calibri" w:hAnsi="Calibri"/>
+          <w:sz w:val="20"/>
+          <w:szCs w:val="20"/>
+        </w:rPr>
+        <w:t xml:space="preserve">Classification validation 7 → 8 of 2,263 flagged actives classified passive; agreement 96.5% → 96.4%; 236/320 passives unchanged. Tracking-error MR test: decreasing EW net pattern p .062 → .046.</w:t>
+      </w:r>
+    </w:p>
+    <w:p>
+      <w:pPr>
+        <w:pStyle w:val="ListParagraph"/>
+        <w:numPr>
+          <w:ilvl w:val="0"/>
+          <w:numId w:val="2"/>
+        </w:numPr>
+        <w:spacing w:after="60"/>
+      </w:pPr>
+      <w:r>
+        <w:rPr>
+          <w:rFonts w:ascii="Calibri" w:cs="Calibri" w:eastAsia="Calibri" w:hAnsi="Calibri"/>
+          <w:sz w:val="20"/>
+          <w:szCs w:val="20"/>
+        </w:rPr>
+        <w:t xml:space="preserve">Unchanged: gross alphas, bootstrap, π̂0 / BSW, breaks, persistence, H1–H4, value added.</w:t>
+      </w:r>
+    </w:p>
+    <w:p>
+      <w:pPr>
+        <w:pStyle w:val="Heading2"/>
+      </w:pPr>
+      <w:r>
+        <w:rPr>
+          <w:rFonts w:ascii="Calibri" w:cs="Calibri" w:eastAsia="Calibri" w:hAnsi="Calibri"/>
+        </w:rPr>
+        <w:t xml:space="preserve">§5. Text and deliverables</w:t>
+      </w:r>
+    </w:p>
+    <w:p>
+      <w:pPr>
+        <w:pStyle w:val="ListParagraph"/>
+        <w:numPr>
+          <w:ilvl w:val="0"/>
+          <w:numId w:val="2"/>
+        </w:numPr>
+        <w:spacing w:after="60"/>
+      </w:pPr>
+      <w:r>
+        <w:rPr>
+          <w:rFonts w:ascii="Calibri" w:cs="Calibri" w:eastAsia="Calibri" w:hAnsi="Calibri"/>
+          <w:sz w:val="20"/>
+          <w:szCs w:val="20"/>
+        </w:rPr>
+        <w:t xml:space="preserve">dissertation_main.tex updated in ~55 places (abstract, Özet, Ch. 1–7, Appendices A, E, G, H, K): numbers above, new Ch. 3 sentence on funds without an ER, TE defined on net returns, Appendix K change-log rows and reconciliation (−0.06 pp from no-ER funds), Table K.3 from the rerun diagnostic, Appendix H.4 note on fund-level alpha samples. Overleaf build Dissertation 9.0 checked: 274 pp, layout of new notes fine.</w:t>
+      </w:r>
+    </w:p>
+    <w:p>
+      <w:pPr>
+        <w:pStyle w:val="ListParagraph"/>
+        <w:numPr>
+          <w:ilvl w:val="0"/>
+          <w:numId w:val="2"/>
+        </w:numPr>
+        <w:spacing w:after="60"/>
+      </w:pPr>
+      <w:r>
+        <w:rPr>
+          <w:rFonts w:ascii="Calibri" w:cs="Calibri" w:eastAsia="Calibri" w:hAnsi="Calibri"/>
+          <w:sz w:val="20"/>
+          <w:szCs w:val="20"/>
+        </w:rPr>
+        <w:t xml:space="preserve">Defense note for the jury on why results changed after the defense (English and Turkish, PDF + .tex): defense_note_result_changes.</w:t>
+      </w:r>
+    </w:p>
+    <w:p>
+      <w:pPr>
+        <w:pStyle w:val="ListParagraph"/>
+        <w:numPr>
+          <w:ilvl w:val="0"/>
+          <w:numId w:val="2"/>
+        </w:numPr>
+        <w:spacing w:after="60"/>
+      </w:pPr>
+      <w:r>
+        <w:rPr>
+          <w:rFonts w:ascii="Calibri" w:cs="Calibri" w:eastAsia="Calibri" w:hAnsi="Calibri"/>
+          <w:sz w:val="20"/>
+          <w:szCs w:val="20"/>
+        </w:rPr>
+        <w:t xml:space="preserve">Project docs: claude/final_audit_2026-10-17.md; claude/fix6_STATUS_2026-10-17.md.</w:t>
+      </w:r>
+    </w:p>
+    <w:p>
+      <w:pPr>
+        <w:pStyle w:val="Heading2"/>
+      </w:pPr>
+      <w:r>
+        <w:rPr>
+          <w:rFonts w:ascii="Calibri" w:cs="Calibri" w:eastAsia="Calibri" w:hAnsi="Calibri"/>
+        </w:rPr>
+        <w:t xml:space="preserve">§6. To do</w:t>
+      </w:r>
+    </w:p>
+    <w:p>
+      <w:pPr>
+        <w:pStyle w:val="ListParagraph"/>
+        <w:numPr>
+          <w:ilvl w:val="0"/>
+          <w:numId w:val="2"/>
+        </w:numPr>
+        <w:spacing w:after="60"/>
+      </w:pPr>
+      <w:r>
+        <w:rPr>
+          <w:rFonts w:ascii="Calibri" w:cs="Calibri" w:eastAsia="Calibri" w:hAnsi="Calibri"/>
+          <w:sz w:val="20"/>
+          <w:szCs w:val="20"/>
+        </w:rPr>
+        <w:t xml:space="preserve">Commit and push all changes (scripts, data/R import, tables, dissertation_main.tex).</w:t>
+      </w:r>
+    </w:p>
+    <w:p>
+      <w:pPr>
+        <w:pStyle w:val="ListParagraph"/>
+        <w:numPr>
+          <w:ilvl w:val="0"/>
+          <w:numId w:val="2"/>
+        </w:numPr>
+        <w:spacing w:after="60"/>
+      </w:pPr>
+      <w:r>
+        <w:rPr>
+          <w:rFonts w:ascii="Calibri" w:cs="Calibri" w:eastAsia="Calibri" w:hAnsi="Calibri"/>
+          <w:sz w:val="20"/>
+          <w:szCs w:val="20"/>
+        </w:rPr>
+        <w:t xml:space="preserve">Delete D:\TEZ\_claude_tmp if still present.</w:t>
+      </w:r>
+    </w:p>
+    <w:p>
+      <w:pPr>
+        <w:pStyle w:val="ListParagraph"/>
+        <w:numPr>
+          <w:ilvl w:val="0"/>
+          <w:numId w:val="2"/>
+        </w:numPr>
+        <w:spacing w:after="60"/>
+      </w:pPr>
+      <w:r>
+        <w:rPr>
+          <w:rFonts w:ascii="Calibri" w:cs="Calibri" w:eastAsia="Calibri" w:hAnsi="Calibri"/>
+          <w:sz w:val="20"/>
+          <w:szCs w:val="20"/>
+        </w:rPr>
+        <w:t xml:space="preserve">Still open from 16 Oct: verify the Russell Midcap 31 / 17 counts (Ch. 3); H4 TNA-floor jury answer; read new passages on paper; skim the 12 ledger changes; optional looser-rule classification column; optional non-overlapping tercile test; entrant/exit characteristics; Baker–Wurgler and value-added jury answers; CV / Acknowledgments / Dedication placeholders; Özet proofread; renv snapshot (fixest) and other clean-up items.</w:t>
+      </w:r>
+    </w:p>
+    <w:p>
+      <w:pPr>
+        <w:pStyle w:val="ListParagraph"/>
+        <w:numPr>
+          <w:ilvl w:val="0"/>
+          <w:numId w:val="2"/>
+        </w:numPr>
+        <w:spacing w:after="60"/>
+      </w:pPr>
+      <w:r>
+        <w:rPr>
+          <w:rFonts w:ascii="Calibri" w:cs="Calibri" w:eastAsia="Calibri" w:hAnsi="Calibri"/>
+          <w:sz w:val="20"/>
+          <w:szCs w:val="20"/>
+        </w:rPr>
+        <w:t xml:space="preserve">Jury preparation: P1 EW net is now significant at 10% and the FF-window EW net at 5%; the tracking-error sort now rejects a decreasing net pattern at 5% (opposite to the 1−R² result). Be ready to explain the 2,619 vs 2,571 N (net vs gross series).</w:t>
+      </w:r>
+    </w:p>
+    <w:p>
+      <w:pPr>
+        <w:pStyle w:val="Heading1"/>
+      </w:pPr>
+      <w:r>
+        <w:rPr>
+          <w:rFonts w:ascii="Calibri" w:cs="Calibri" w:eastAsia="Calibri" w:hAnsi="Calibri"/>
+        </w:rPr>
         <w:t xml:space="preserve">Current Key Pipeline &amp; Dissertation Facts</w:t>
       </w:r>
     </w:p>
@@ -14975,7 +15502,7 @@
           <w:sz w:val="20"/>
           <w:szCs w:val="20"/>
         </w:rPr>
-        <w:t xml:space="preserve">Last updated: 16 October 2026 (night) — unflagged funds reclassified, defense extensions, combined text update.</w:t>
+        <w:t xml:space="preserve">Last updated: 18 October 2026 — audit items 1–6, full rerun, text update.</w:t>
       </w:r>
     </w:p>
     <w:tbl>
@@ -15180,7 +15707,7 @@
                 <w:sz w:val="18"/>
                 <w:szCs w:val="18"/>
               </w:rPr>
-              <w:t xml:space="preserve">3,552 / 3,117 / 3,025 (drops 115 / 88 / 85)</w:t>
+              <w:t xml:space="preserve">3,542 / 3,111 / 3,019 (drops 125 / 94 / 91)</w:t>
             </w:r>
           </w:p>
         </w:tc>
@@ -15306,7 +15833,7 @@
                 <w:sz w:val="18"/>
                 <w:szCs w:val="18"/>
               </w:rPr>
-              <w:t xml:space="preserve">2,571; 2,255</w:t>
+              <w:t xml:space="preserve">2,619 net series (2,571 gross); 2,255</w:t>
             </w:r>
           </w:p>
         </w:tc>
@@ -15495,7 +16022,7 @@
                 <w:sz w:val="18"/>
                 <w:szCs w:val="18"/>
               </w:rPr>
-              <w:t xml:space="preserve">ret_net = index return (screened); ret_gross = net + ER/1200; per-month winsorised ret_*_cs for robustness; 37 fund-months screened</w:t>
+              <w:t xml:space="preserve">ret_net = index return (screened); ret_gross = net + ER/1200 (NA without ER: 48 active, 2 passive funds, net series only); per-month winsorised ret_*_cs for robustness; 37 fund-months screened; returns and flows NA after calendar gaps</w:t>
             </w:r>
           </w:p>
         </w:tc>
@@ -15621,7 +16148,7 @@
                 <w:sz w:val="18"/>
                 <w:szCs w:val="18"/>
               </w:rPr>
-              <w:t xml:space="preserve">−1.168*** (t −2.62) / −0.668* (t −1.66); Bloomberg-flag-only: −0.809* / −0.655</w:t>
+              <w:t xml:space="preserve">−1.230*** (t −2.79) / −0.668* (t −1.66); Bloomberg-flag-only: −0.809* / −0.655</w:t>
             </w:r>
           </w:p>
         </w:tc>
@@ -15684,7 +16211,7 @@
                 <w:sz w:val="18"/>
                 <w:szCs w:val="18"/>
               </w:rPr>
-              <w:t xml:space="preserve">−0.642** / −0.059</w:t>
+              <w:t xml:space="preserve">−0.647** / −0.059</w:t>
             </w:r>
           </w:p>
         </w:tc>
@@ -15936,7 +16463,7 @@
                 <w:sz w:val="18"/>
                 <w:szCs w:val="18"/>
               </w:rPr>
-              <w:t xml:space="preserve">P1 −1.229 / P2 −0.649 / P3 −1.805*** (VW P3 −0.994***); P3−P2 −1.16 (p .14); same funds −1.42 (p .075)</w:t>
+              <w:t xml:space="preserve">P1 −1.356* / P2 −0.703 / P3 −1.808*** (VW P3 −0.995***); P3−P2 −1.10 (p .15); same funds −1.42 (p .072)</w:t>
             </w:r>
           </w:p>
         </w:tc>
@@ -16062,7 +16589,7 @@
                 <w:sz w:val="18"/>
                 <w:szCs w:val="18"/>
               </w:rPr>
-              <w:t xml:space="preserve">N 1,363 (BSW 1,138); EW net −1.49*; π̂0 84.9%; π− 11.4% / π+ 3.2%</w:t>
+              <w:t xml:space="preserve">N 1,385 (BSW 1,138); EW net −1.615** (t −2.07); π̂0 84.9%; π− 11.4% / π+ 3.2%</w:t>
             </w:r>
           </w:p>
         </w:tc>
@@ -16125,7 +16652,7 @@
                 <w:sz w:val="18"/>
                 <w:szCs w:val="18"/>
               </w:rPr>
-              <w:t xml:space="preserve">FF6 π̂0 76.0%, π− 23.0%; C+PSL π̂0 85.0%, π− 12.7%</w:t>
+              <w:t xml:space="preserve">FF6 π̂0 76.0%, π− 23.0%, EW net −1.42***; C+PSL π̂0 85.0%, π− 12.7%, EW net −1.25***</w:t>
             </w:r>
           </w:p>
         </w:tc>
@@ -16251,7 +16778,7 @@
                 <w:sz w:val="18"/>
                 <w:szCs w:val="18"/>
               </w:rPr>
-              <w:t xml:space="preserve">MR p_up 1−R² EW gross .028 / net .061; T1 D1 −0.192 (p_B .016), T1 spread −0.079 (p_B .095)</w:t>
+              <w:t xml:space="preserve">MR p_up 1−R² EW gross .028 / net .061; TE: p_down EW net .046; T1 D1 −0.192 (p_B .016), T1 spread −0.079 (p_B .095)</w:t>
             </w:r>
           </w:p>
         </w:tc>
@@ -16566,7 +17093,7 @@
                 <w:sz w:val="18"/>
                 <w:szCs w:val="18"/>
               </w:rPr>
-              <w:t xml:space="preserve">Native rank-space calibration 2.214% (t 2.39) → 277 bp/rank point; MAX12 R_MID 3 / 37 bp; Diff 34 bp, p .010</w:t>
+              <w:t xml:space="preserve">Native rank-space calibration on the H3 sample 2.363% (t 2.40) → 295 bp/rank point; MAX12 R_MID 3 / 39 bp; Diff 36 bp, p .010</w:t>
             </w:r>
           </w:p>
         </w:tc>
@@ -16692,7 +17219,7 @@
                 <w:sz w:val="18"/>
                 <w:szCs w:val="18"/>
               </w:rPr>
-              <w:t xml:space="preserve">Mixed: Aug 2010 shift T1 −0.73 (10%), T2 −1.30***, T3 −1.70***; T1 no sup-F break; S23 (1,062 funds) −1.42 (p .075), within share 1.22</w:t>
+              <w:t xml:space="preserve">Mixed: Aug 2010 shift T1 −0.73 (10%), T2 −1.30***, T3 −1.70***; T1 no sup-F break; S23 (1,066 funds) −1.42 (p .072), within share 1.29</w:t>
             </w:r>
           </w:p>
         </w:tc>
@@ -16818,7 +17345,7 @@
                 <w:sz w:val="18"/>
                 <w:szCs w:val="18"/>
               </w:rPr>
-              <w:t xml:space="preserve">7,247 lines (16 Oct, not yet committed); Appendices A–K; new A section on unflagged funds; 0 undefined refs (container build, 270 pp)</w:t>
+              <w:t xml:space="preserve">7,335 lines (18 Oct, not yet committed); Appendices A–K; Overleaf build Dissertation 9.0, 274 pp; 0 undefined refs</w:t>
             </w:r>
           </w:p>
         </w:tc>

</xml_diff>